<commit_message>
Atualização de scripts e testes novos
</commit_message>
<xml_diff>
--- a/output/relatorio.docx
+++ b/output/relatorio.docx
@@ -2599,15 +2599,13 @@
         <w:jc w:val="both"/>
         <w:rPr>
           <w:rFonts w:ascii="Times New Roman" w:hAnsi="Times New Roman" w:cs="Times New Roman"/>
-          <w:color w:val="FF0000"/>
-          <w:sz w:val="24"/>
-          <w:szCs w:val="24"/>
-        </w:rPr>
-      </w:pPr>
-      <w:r>
-        <w:rPr>
-          <w:rFonts w:ascii="Times New Roman" w:hAnsi="Times New Roman" w:cs="Times New Roman"/>
-          <w:color w:val="FF0000"/>
+          <w:sz w:val="24"/>
+          <w:szCs w:val="24"/>
+        </w:rPr>
+      </w:pPr>
+      <w:r>
+        <w:rPr>
+          <w:rFonts w:ascii="Times New Roman" w:hAnsi="Times New Roman" w:cs="Times New Roman"/>
           <w:sz w:val="24"/>
           <w:szCs w:val="24"/>
         </w:rPr>
@@ -2617,7 +2615,6 @@
       <w:r>
         <w:rPr>
           <w:rFonts w:ascii="Times New Roman" w:hAnsi="Times New Roman" w:cs="Times New Roman"/>
-          <w:color w:val="FF0000"/>
           <w:sz w:val="24"/>
           <w:szCs w:val="24"/>
         </w:rPr>
@@ -2626,45 +2623,41 @@
       <w:r>
         <w:rPr>
           <w:rFonts w:ascii="Times New Roman" w:hAnsi="Times New Roman" w:cs="Times New Roman"/>
-          <w:color w:val="FF0000"/>
-          <w:sz w:val="24"/>
-          <w:szCs w:val="24"/>
-        </w:rPr>
-        <w:t>de chefes de família (percentual de chefes de família entre os desempregados)</w:t>
-      </w:r>
-      <w:r>
-        <w:rPr>
-          <w:rFonts w:ascii="Times New Roman" w:hAnsi="Times New Roman" w:cs="Times New Roman"/>
-          <w:color w:val="FF0000"/>
+          <w:sz w:val="24"/>
+          <w:szCs w:val="24"/>
+        </w:rPr>
+        <w:t>d</w:t>
+      </w:r>
+      <w:r>
+        <w:rPr>
+          <w:rFonts w:ascii="Times New Roman" w:hAnsi="Times New Roman" w:cs="Times New Roman"/>
+          <w:sz w:val="24"/>
+          <w:szCs w:val="24"/>
+        </w:rPr>
+        <w:t xml:space="preserve">o responsável familiar </w:t>
+      </w:r>
+      <w:r>
+        <w:rPr>
+          <w:rFonts w:ascii="Times New Roman" w:hAnsi="Times New Roman" w:cs="Times New Roman"/>
+          <w:sz w:val="24"/>
+          <w:szCs w:val="24"/>
+        </w:rPr>
+        <w:t>(percentual de chefes de família entre os desempregados)</w:t>
+      </w:r>
+      <w:r>
+        <w:rPr>
+          <w:rFonts w:ascii="Times New Roman" w:hAnsi="Times New Roman" w:cs="Times New Roman"/>
           <w:sz w:val="24"/>
           <w:szCs w:val="24"/>
         </w:rPr>
         <w:t xml:space="preserve"> </w:t>
-      </w:r>
-      <w:r>
-        <w:rPr>
-          <w:rFonts w:ascii="Times New Roman" w:hAnsi="Times New Roman" w:cs="Times New Roman"/>
-          <w:color w:val="FF0000"/>
-          <w:sz w:val="24"/>
-          <w:szCs w:val="24"/>
-        </w:rPr>
-        <w:t>(ESTOU VENDO O NEGOCIO DO CASAL)</w:t>
-      </w:r>
-      <w:r>
-        <w:rPr>
-          <w:rFonts w:ascii="Times New Roman" w:hAnsi="Times New Roman" w:cs="Times New Roman"/>
-          <w:color w:val="FF0000"/>
-          <w:sz w:val="24"/>
-          <w:szCs w:val="24"/>
-        </w:rPr>
-        <w:t>;</w:t>
       </w:r>
     </w:p>
     <w:p>
       <w:pPr>
         <w:pStyle w:val="PargrafodaLista"/>
         <w:numPr>
-          <w:ilvl w:val="0"/>
+          <w:ilvl w:val="1"/>
           <w:numId w:val="1"/>
         </w:numPr>
         <w:jc w:val="both"/>
@@ -2680,15 +2673,25 @@
           <w:sz w:val="24"/>
           <w:szCs w:val="24"/>
         </w:rPr>
-        <w:t>Rendimento</w:t>
-      </w:r>
-      <w:r>
-        <w:rPr>
-          <w:rFonts w:ascii="Times New Roman" w:hAnsi="Times New Roman" w:cs="Times New Roman"/>
-          <w:sz w:val="24"/>
-          <w:szCs w:val="24"/>
-        </w:rPr>
-        <w:t>:</w:t>
+        <w:t xml:space="preserve">Desocupação do responsável </w:t>
+      </w:r>
+      <w:proofErr w:type="gramStart"/>
+      <w:r>
+        <w:rPr>
+          <w:rFonts w:ascii="Times New Roman" w:hAnsi="Times New Roman" w:cs="Times New Roman"/>
+          <w:sz w:val="24"/>
+          <w:szCs w:val="24"/>
+        </w:rPr>
+        <w:t>familiar  do</w:t>
+      </w:r>
+      <w:proofErr w:type="gramEnd"/>
+      <w:r>
+        <w:rPr>
+          <w:rFonts w:ascii="Times New Roman" w:hAnsi="Times New Roman" w:cs="Times New Roman"/>
+          <w:sz w:val="24"/>
+          <w:szCs w:val="24"/>
+        </w:rPr>
+        <w:t xml:space="preserve"> conjugue;</w:t>
       </w:r>
     </w:p>
     <w:p>

</xml_diff>

<commit_message>
Adicionado custom-reference e ajustes no relatorio principal
</commit_message>
<xml_diff>
--- a/output/relatorio.docx
+++ b/output/relatorio.docx
@@ -21,6 +21,7 @@
           <w:szCs w:val="24"/>
         </w:rPr>
       </w:pPr>
+      <w:proofErr w:type="spellStart"/>
       <w:r>
         <w:rPr>
           <w:rFonts w:ascii="Times New Roman" w:hAnsi="Times New Roman" w:cs="Times New Roman"/>
@@ -29,6 +30,7 @@
         </w:rPr>
         <w:t>Relatorio</w:t>
       </w:r>
+      <w:proofErr w:type="spellEnd"/>
     </w:p>
     <w:p>
       <w:pPr>
@@ -71,6 +73,22 @@
           <w:szCs w:val="24"/>
         </w:rPr>
       </w:pPr>
+      <w:r>
+        <w:rPr>
+          <w:rFonts w:ascii="Times New Roman" w:hAnsi="Times New Roman" w:cs="Times New Roman"/>
+          <w:sz w:val="24"/>
+          <w:szCs w:val="24"/>
+        </w:rPr>
+        <w:t>A Pesquisa Nacional por Amostra de Domicílios Contínua - PNAD Contínua (PNADC) é de valiosa importância para o monitoramento de indicadores socioeconômicos e demográficos do Piauí. Mercado de trabalho, rendimentos e educação estão entre as temáticas os indicadores mais importantes que são acompanhados de maneira trimestral pelo CIET/SEPLAN, incluindo para eles os recortes demográficos de sexo, raça, grau de instrução e faixa etária</w:t>
+      </w:r>
+      <w:r>
+        <w:rPr>
+          <w:rFonts w:ascii="Times New Roman" w:hAnsi="Times New Roman" w:cs="Times New Roman"/>
+          <w:sz w:val="24"/>
+          <w:szCs w:val="24"/>
+        </w:rPr>
+        <w:t>. Os estudos são feitos para acompanhar a evolução do estado em comparação com o Brasil, o Nordeste e também outros estados do país.</w:t>
+      </w:r>
     </w:p>
     <w:p>
       <w:pPr>
@@ -87,15 +105,87 @@
           <w:sz w:val="24"/>
           <w:szCs w:val="24"/>
         </w:rPr>
-        <w:t>A Pesquisa Nacional por Amostra de Domicílios Contínua - PNAD Contínua (PNADC) é de valiosa importância para o monitoramento de indicadores socioeconômicos e demográficos do Piauí. Mercado de trabalho, rendimentos e educação estão entre as temáticas os indicadores mais importantes que são acompanhados de maneira trimestral pelo CIET/SEPLAN, incluindo para eles os recortes demográficos de sexo, raça, grau de instrução e faixa etária</w:t>
-      </w:r>
-      <w:r>
-        <w:rPr>
-          <w:rFonts w:ascii="Times New Roman" w:hAnsi="Times New Roman" w:cs="Times New Roman"/>
-          <w:sz w:val="24"/>
-          <w:szCs w:val="24"/>
-        </w:rPr>
-        <w:t>. Os estudos são feitos para acompanhar a evolução do estado em comparação com o Brasil, o Nordeste e também outros estados do país.</w:t>
+        <w:t xml:space="preserve">Entretanto, existe uma lacuna pertinente nos indicadores avaliados. Como o monitoramento é feito comparando Brasil, Regiões e Estados– não só por parte do CIET/SEPLAN, mas </w:t>
+      </w:r>
+      <w:r>
+        <w:rPr>
+          <w:rFonts w:ascii="Times New Roman" w:hAnsi="Times New Roman" w:cs="Times New Roman"/>
+          <w:sz w:val="24"/>
+          <w:szCs w:val="24"/>
+        </w:rPr>
+        <w:t>das próprias</w:t>
+      </w:r>
+      <w:r>
+        <w:rPr>
+          <w:rFonts w:ascii="Times New Roman" w:hAnsi="Times New Roman" w:cs="Times New Roman"/>
+          <w:sz w:val="24"/>
+          <w:szCs w:val="24"/>
+        </w:rPr>
+        <w:t xml:space="preserve"> publicações do </w:t>
+      </w:r>
+      <w:r>
+        <w:rPr>
+          <w:rFonts w:ascii="Times New Roman" w:hAnsi="Times New Roman" w:cs="Times New Roman"/>
+          <w:sz w:val="24"/>
+          <w:szCs w:val="24"/>
+        </w:rPr>
+        <w:t>IBGE e</w:t>
+      </w:r>
+      <w:r>
+        <w:rPr>
+          <w:rFonts w:ascii="Times New Roman" w:hAnsi="Times New Roman" w:cs="Times New Roman"/>
+          <w:sz w:val="24"/>
+          <w:szCs w:val="24"/>
+        </w:rPr>
+        <w:t xml:space="preserve"> de outros institutos de pesquisa – as diferenças regionais dentro do próprio estado do Piauí ficam de fora dessa</w:t>
+      </w:r>
+      <w:r>
+        <w:rPr>
+          <w:rFonts w:ascii="Times New Roman" w:hAnsi="Times New Roman" w:cs="Times New Roman"/>
+          <w:sz w:val="24"/>
+          <w:szCs w:val="24"/>
+        </w:rPr>
+        <w:t>s análises</w:t>
+      </w:r>
+      <w:r>
+        <w:rPr>
+          <w:rFonts w:ascii="Times New Roman" w:hAnsi="Times New Roman" w:cs="Times New Roman"/>
+          <w:sz w:val="24"/>
+          <w:szCs w:val="24"/>
+        </w:rPr>
+        <w:t xml:space="preserve">. </w:t>
+      </w:r>
+      <w:r>
+        <w:rPr>
+          <w:rFonts w:ascii="Times New Roman" w:hAnsi="Times New Roman" w:cs="Times New Roman"/>
+          <w:sz w:val="24"/>
+          <w:szCs w:val="24"/>
+        </w:rPr>
+        <w:t xml:space="preserve">Essa </w:t>
+      </w:r>
+      <w:r>
+        <w:rPr>
+          <w:rFonts w:ascii="Times New Roman" w:hAnsi="Times New Roman" w:cs="Times New Roman"/>
+          <w:sz w:val="24"/>
+          <w:szCs w:val="24"/>
+        </w:rPr>
+        <w:t xml:space="preserve">é uma carência gigantesca para o monitoramento do estado – o Piauí é marcado por diversas diferenças regionais, em especial em relação </w:t>
+      </w:r>
+      <w:r>
+        <w:rPr>
+          <w:rFonts w:ascii="Times New Roman" w:hAnsi="Times New Roman" w:cs="Times New Roman"/>
+          <w:sz w:val="24"/>
+          <w:szCs w:val="24"/>
+        </w:rPr>
+        <w:t>à</w:t>
+      </w:r>
+      <w:r>
+        <w:rPr>
+          <w:rFonts w:ascii="Times New Roman" w:hAnsi="Times New Roman" w:cs="Times New Roman"/>
+          <w:sz w:val="24"/>
+          <w:szCs w:val="24"/>
+        </w:rPr>
+        <w:t xml:space="preserve"> capital e ao resto do estado. </w:t>
       </w:r>
     </w:p>
     <w:p>
@@ -113,71 +203,79 @@
           <w:sz w:val="24"/>
           <w:szCs w:val="24"/>
         </w:rPr>
-        <w:t xml:space="preserve">Entretanto, existe uma lacuna pertinente nos indicadores avaliados. Como o monitoramento é feito comparando Brasil, Regiões e Estados– não só por parte do CIET/SEPLAN, mas </w:t>
-      </w:r>
-      <w:r>
-        <w:rPr>
-          <w:rFonts w:ascii="Times New Roman" w:hAnsi="Times New Roman" w:cs="Times New Roman"/>
-          <w:sz w:val="24"/>
-          <w:szCs w:val="24"/>
-        </w:rPr>
-        <w:t>das próprias</w:t>
-      </w:r>
-      <w:r>
-        <w:rPr>
-          <w:rFonts w:ascii="Times New Roman" w:hAnsi="Times New Roman" w:cs="Times New Roman"/>
-          <w:sz w:val="24"/>
-          <w:szCs w:val="24"/>
-        </w:rPr>
-        <w:t xml:space="preserve"> publicações do </w:t>
-      </w:r>
-      <w:r>
-        <w:rPr>
-          <w:rFonts w:ascii="Times New Roman" w:hAnsi="Times New Roman" w:cs="Times New Roman"/>
-          <w:sz w:val="24"/>
-          <w:szCs w:val="24"/>
-        </w:rPr>
-        <w:t>IBGE e</w:t>
-      </w:r>
-      <w:r>
-        <w:rPr>
-          <w:rFonts w:ascii="Times New Roman" w:hAnsi="Times New Roman" w:cs="Times New Roman"/>
-          <w:sz w:val="24"/>
-          <w:szCs w:val="24"/>
-        </w:rPr>
-        <w:t xml:space="preserve"> de outros institutos de pesquisa – as diferenças regionais dentro do próprio estado do Piauí ficam de fora dessa</w:t>
-      </w:r>
-      <w:r>
-        <w:rPr>
-          <w:rFonts w:ascii="Times New Roman" w:hAnsi="Times New Roman" w:cs="Times New Roman"/>
-          <w:sz w:val="24"/>
-          <w:szCs w:val="24"/>
-        </w:rPr>
-        <w:t>s análises</w:t>
-      </w:r>
-      <w:r>
-        <w:rPr>
-          <w:rFonts w:ascii="Times New Roman" w:hAnsi="Times New Roman" w:cs="Times New Roman"/>
-          <w:sz w:val="24"/>
-          <w:szCs w:val="24"/>
-        </w:rPr>
-        <w:t xml:space="preserve">. </w:t>
-      </w:r>
-      <w:r>
-        <w:rPr>
-          <w:rFonts w:ascii="Times New Roman" w:hAnsi="Times New Roman" w:cs="Times New Roman"/>
-          <w:sz w:val="24"/>
-          <w:szCs w:val="24"/>
-        </w:rPr>
-        <w:t xml:space="preserve">Essa </w:t>
-      </w:r>
-      <w:r>
-        <w:rPr>
-          <w:rFonts w:ascii="Times New Roman" w:hAnsi="Times New Roman" w:cs="Times New Roman"/>
-          <w:sz w:val="24"/>
-          <w:szCs w:val="24"/>
-        </w:rPr>
-        <w:t xml:space="preserve">é uma carência gigantesca para o monitoramento do estado – o Piauí é marcado por diversas diferenças regionais, em especial em relação a capital e ao resto do estado. </w:t>
+        <w:t xml:space="preserve">Não precisamos </w:t>
+      </w:r>
+      <w:r>
+        <w:rPr>
+          <w:rFonts w:ascii="Times New Roman" w:hAnsi="Times New Roman" w:cs="Times New Roman"/>
+          <w:sz w:val="24"/>
+          <w:szCs w:val="24"/>
+        </w:rPr>
+        <w:t xml:space="preserve">ir </w:t>
+      </w:r>
+      <w:r>
+        <w:rPr>
+          <w:rFonts w:ascii="Times New Roman" w:hAnsi="Times New Roman" w:cs="Times New Roman"/>
+          <w:sz w:val="24"/>
+          <w:szCs w:val="24"/>
+        </w:rPr>
+        <w:t>a fundo na literatura para justificar tal assertiva: basta olharmos os resultados de alguns indicadores da própria PNADC</w:t>
+      </w:r>
+      <w:r>
+        <w:rPr>
+          <w:rFonts w:ascii="Times New Roman" w:hAnsi="Times New Roman" w:cs="Times New Roman"/>
+          <w:sz w:val="24"/>
+          <w:szCs w:val="24"/>
+        </w:rPr>
+        <w:t xml:space="preserve"> (Tabela </w:t>
+      </w:r>
+      <w:r>
+        <w:rPr>
+          <w:rFonts w:ascii="Times New Roman" w:hAnsi="Times New Roman" w:cs="Times New Roman"/>
+          <w:sz w:val="24"/>
+          <w:szCs w:val="24"/>
+        </w:rPr>
+        <w:t>1</w:t>
+      </w:r>
+      <w:r>
+        <w:rPr>
+          <w:rFonts w:ascii="Times New Roman" w:hAnsi="Times New Roman" w:cs="Times New Roman"/>
+          <w:sz w:val="24"/>
+          <w:szCs w:val="24"/>
+        </w:rPr>
+        <w:t>)</w:t>
+      </w:r>
+      <w:r>
+        <w:rPr>
+          <w:rFonts w:ascii="Times New Roman" w:hAnsi="Times New Roman" w:cs="Times New Roman"/>
+          <w:sz w:val="24"/>
+          <w:szCs w:val="24"/>
+        </w:rPr>
+        <w:t xml:space="preserve">. Comparando o desempenho do Brasil, Nordeste, Piauí e Teresina no segundo trimestre dos últimos quatros anos (2026 a 2023), observa-se que a capital não só supera o estado nos três indicadores, mas tem um desempenho muito próximo em relação </w:t>
+      </w:r>
+      <w:r>
+        <w:rPr>
+          <w:rFonts w:ascii="Times New Roman" w:hAnsi="Times New Roman" w:cs="Times New Roman"/>
+          <w:sz w:val="24"/>
+          <w:szCs w:val="24"/>
+        </w:rPr>
+        <w:t>à</w:t>
+      </w:r>
+      <w:r>
+        <w:rPr>
+          <w:rFonts w:ascii="Times New Roman" w:hAnsi="Times New Roman" w:cs="Times New Roman"/>
+          <w:sz w:val="24"/>
+          <w:szCs w:val="24"/>
+        </w:rPr>
+        <w:t xml:space="preserve"> média nacional – até superando-a em alguns momentos. Ao passo que o Piauí como todo, ainda acompanha a tendência do nordeste.</w:t>
+      </w:r>
+      <w:r>
+        <w:rPr>
+          <w:rFonts w:ascii="Times New Roman" w:hAnsi="Times New Roman" w:cs="Times New Roman"/>
+          <w:sz w:val="24"/>
+          <w:szCs w:val="24"/>
+        </w:rPr>
+        <w:t xml:space="preserve"> Devido a essa alta discrepância, a capital puxa a média do estado nesses indicadores pra cima, o que implica que a situação no restante do estado está mais abaixo da tendência regional.</w:t>
       </w:r>
     </w:p>
     <w:p>
@@ -189,62 +287,6 @@
           <w:szCs w:val="24"/>
         </w:rPr>
       </w:pPr>
-      <w:r>
-        <w:rPr>
-          <w:rFonts w:ascii="Times New Roman" w:hAnsi="Times New Roman" w:cs="Times New Roman"/>
-          <w:sz w:val="24"/>
-          <w:szCs w:val="24"/>
-        </w:rPr>
-        <w:t>Não precisamos a fundo na literatura para justificar tal assertiva: basta olharmos os resultados de alguns indicadores da própria PNADC</w:t>
-      </w:r>
-      <w:r>
-        <w:rPr>
-          <w:rFonts w:ascii="Times New Roman" w:hAnsi="Times New Roman" w:cs="Times New Roman"/>
-          <w:sz w:val="24"/>
-          <w:szCs w:val="24"/>
-        </w:rPr>
-        <w:t xml:space="preserve"> (Tabela </w:t>
-      </w:r>
-      <w:r>
-        <w:rPr>
-          <w:rFonts w:ascii="Times New Roman" w:hAnsi="Times New Roman" w:cs="Times New Roman"/>
-          <w:sz w:val="24"/>
-          <w:szCs w:val="24"/>
-        </w:rPr>
-        <w:t>1</w:t>
-      </w:r>
-      <w:r>
-        <w:rPr>
-          <w:rFonts w:ascii="Times New Roman" w:hAnsi="Times New Roman" w:cs="Times New Roman"/>
-          <w:sz w:val="24"/>
-          <w:szCs w:val="24"/>
-        </w:rPr>
-        <w:t>)</w:t>
-      </w:r>
-      <w:r>
-        <w:rPr>
-          <w:rFonts w:ascii="Times New Roman" w:hAnsi="Times New Roman" w:cs="Times New Roman"/>
-          <w:sz w:val="24"/>
-          <w:szCs w:val="24"/>
-        </w:rPr>
-        <w:t xml:space="preserve">. Comparando o desempenho do Brasil, Nordeste, Piauí e Teresina no segundo trimestre dos últimos quatros anos (2026 a 2023), observa-se que a capital não só supera o estado nos três indicadores, mas tem um desempenho muito próximo em relação </w:t>
-      </w:r>
-      <w:r>
-        <w:rPr>
-          <w:rFonts w:ascii="Times New Roman" w:hAnsi="Times New Roman" w:cs="Times New Roman"/>
-          <w:sz w:val="24"/>
-          <w:szCs w:val="24"/>
-        </w:rPr>
-        <w:t>à</w:t>
-      </w:r>
-      <w:r>
-        <w:rPr>
-          <w:rFonts w:ascii="Times New Roman" w:hAnsi="Times New Roman" w:cs="Times New Roman"/>
-          <w:sz w:val="24"/>
-          <w:szCs w:val="24"/>
-        </w:rPr>
-        <w:t xml:space="preserve"> média nacional – até superando-a em alguns momentos. Ao passo que o Piauí como todo, ainda acompanha a tendência do nordeste.</w:t>
-      </w:r>
     </w:p>
     <w:p>
       <w:pPr>
@@ -255,23 +297,33 @@
           <w:szCs w:val="24"/>
         </w:rPr>
       </w:pPr>
-    </w:p>
-    <w:p>
-      <w:pPr>
-        <w:jc w:val="both"/>
-        <w:rPr>
-          <w:rFonts w:ascii="Times New Roman" w:hAnsi="Times New Roman" w:cs="Times New Roman"/>
-          <w:sz w:val="24"/>
-          <w:szCs w:val="24"/>
-        </w:rPr>
-      </w:pPr>
-      <w:r>
-        <w:rPr>
-          <w:rFonts w:ascii="Times New Roman" w:hAnsi="Times New Roman" w:cs="Times New Roman"/>
-          <w:sz w:val="24"/>
-          <w:szCs w:val="24"/>
-        </w:rPr>
-        <w:t>Tabela 1 – Indicadores de trabalho e rendimento – Brasil, Nordeste,Piauí e Teresina– 2º trimestre de 2023 a 2º trimestre de 2026</w:t>
+      <w:r>
+        <w:rPr>
+          <w:rFonts w:ascii="Times New Roman" w:hAnsi="Times New Roman" w:cs="Times New Roman"/>
+          <w:sz w:val="24"/>
+          <w:szCs w:val="24"/>
+        </w:rPr>
+        <w:t xml:space="preserve">Tabela 1 – Indicadores de trabalho e rendimento – Brasil, </w:t>
+      </w:r>
+      <w:proofErr w:type="spellStart"/>
+      <w:proofErr w:type="gramStart"/>
+      <w:r>
+        <w:rPr>
+          <w:rFonts w:ascii="Times New Roman" w:hAnsi="Times New Roman" w:cs="Times New Roman"/>
+          <w:sz w:val="24"/>
+          <w:szCs w:val="24"/>
+        </w:rPr>
+        <w:t>Nordeste,Piauí</w:t>
+      </w:r>
+      <w:proofErr w:type="spellEnd"/>
+      <w:proofErr w:type="gramEnd"/>
+      <w:r>
+        <w:rPr>
+          <w:rFonts w:ascii="Times New Roman" w:hAnsi="Times New Roman" w:cs="Times New Roman"/>
+          <w:sz w:val="24"/>
+          <w:szCs w:val="24"/>
+        </w:rPr>
+        <w:t xml:space="preserve"> e Teresina– 2º trimestre de 2023 a 2º trimestre de 2026</w:t>
       </w:r>
     </w:p>
     <w:tbl>
@@ -1648,6 +1700,7 @@
                 <w:sz w:val="24"/>
                 <w:szCs w:val="24"/>
               </w:rPr>
+              <w:lastRenderedPageBreak/>
               <w:t>Nordeste</w:t>
             </w:r>
           </w:p>
@@ -1769,7 +1822,6 @@
                 <w:sz w:val="24"/>
                 <w:szCs w:val="24"/>
               </w:rPr>
-              <w:lastRenderedPageBreak/>
               <w:t>Piauí</w:t>
             </w:r>
           </w:p>
@@ -2026,15 +2078,15 @@
           <w:sz w:val="24"/>
           <w:szCs w:val="24"/>
         </w:rPr>
-        <w:t>Essa</w:t>
-      </w:r>
-      <w:r>
-        <w:rPr>
-          <w:rFonts w:ascii="Times New Roman" w:hAnsi="Times New Roman" w:cs="Times New Roman"/>
-          <w:sz w:val="24"/>
-          <w:szCs w:val="24"/>
-        </w:rPr>
-        <w:t xml:space="preserve"> ausência de uma analisada desagregada do Piauí</w:t>
+        <w:t>A</w:t>
+      </w:r>
+      <w:r>
+        <w:rPr>
+          <w:rFonts w:ascii="Times New Roman" w:hAnsi="Times New Roman" w:cs="Times New Roman"/>
+          <w:sz w:val="24"/>
+          <w:szCs w:val="24"/>
+        </w:rPr>
+        <w:t xml:space="preserve"> ausência de uma analisa desagregada do Piauí</w:t>
       </w:r>
       <w:r>
         <w:rPr>
@@ -2082,7 +2134,25 @@
           <w:sz w:val="24"/>
           <w:szCs w:val="24"/>
         </w:rPr>
-        <w:t>disponibilizada nos seus microdados resultados</w:t>
+        <w:t xml:space="preserve">disponibilizada nos seus </w:t>
+      </w:r>
+      <w:proofErr w:type="spellStart"/>
+      <w:r>
+        <w:rPr>
+          <w:rFonts w:ascii="Times New Roman" w:hAnsi="Times New Roman" w:cs="Times New Roman"/>
+          <w:sz w:val="24"/>
+          <w:szCs w:val="24"/>
+        </w:rPr>
+        <w:t>microdados</w:t>
+      </w:r>
+      <w:proofErr w:type="spellEnd"/>
+      <w:r>
+        <w:rPr>
+          <w:rFonts w:ascii="Times New Roman" w:hAnsi="Times New Roman" w:cs="Times New Roman"/>
+          <w:sz w:val="24"/>
+          <w:szCs w:val="24"/>
+        </w:rPr>
+        <w:t xml:space="preserve"> resultados</w:t>
       </w:r>
       <w:r>
         <w:rPr>
@@ -2106,7 +2176,23 @@
           <w:sz w:val="24"/>
           <w:szCs w:val="24"/>
         </w:rPr>
-        <w:t>de 2022, o IBGE começou a divulgar seus resultados estratificados para cada UF (Nota técnica 01/2022) incluindo estratos administrativos e geográficos (vamos explica-los mais a frente). Isso permite a estimação de indicadores para sub-regiões dentro de cada estado. Essas estatísticas ainda são experimentais, todavia elas são de extrema importância, em especial para o Piauí, um estado que apresenta dentro de si fortes desigualdades regionais.</w:t>
+        <w:t xml:space="preserve">de 2022, o IBGE começou a divulgar seus resultados estratificados para cada UF (Nota técnica 01/2022) incluindo estratos administrativos e geográficos (vamos explica-los mais a frente). Isso permite a estimação de indicadores para sub-regiões dentro de cada estado. Essas estatísticas ainda são experimentais, </w:t>
+      </w:r>
+      <w:r>
+        <w:rPr>
+          <w:rFonts w:ascii="Times New Roman" w:hAnsi="Times New Roman" w:cs="Times New Roman"/>
+          <w:sz w:val="24"/>
+          <w:szCs w:val="24"/>
+        </w:rPr>
+        <w:t>mas</w:t>
+      </w:r>
+      <w:r>
+        <w:rPr>
+          <w:rFonts w:ascii="Times New Roman" w:hAnsi="Times New Roman" w:cs="Times New Roman"/>
+          <w:sz w:val="24"/>
+          <w:szCs w:val="24"/>
+        </w:rPr>
+        <w:t xml:space="preserve"> elas são de extrema importância, em especial para o Piauí, um estado que apresenta dentro de si fortes desigualdades regionais.</w:t>
       </w:r>
     </w:p>
     <w:p>
@@ -2124,7 +2210,39 @@
           <w:sz w:val="24"/>
           <w:szCs w:val="24"/>
         </w:rPr>
-        <w:t xml:space="preserve">Nesse contexto, o objetivo deste relatório é explorar as diferenças regionais no mercado de trabalho e nos rendimentos da população dentro do Piauí. Além dessa introdução, o relatório contém </w:t>
+        <w:t xml:space="preserve">Nesse contexto, o objetivo deste relatório é explorar </w:t>
+      </w:r>
+      <w:r>
+        <w:rPr>
+          <w:rFonts w:ascii="Times New Roman" w:hAnsi="Times New Roman" w:cs="Times New Roman"/>
+          <w:sz w:val="24"/>
+          <w:szCs w:val="24"/>
+        </w:rPr>
+        <w:t>ess</w:t>
+      </w:r>
+      <w:r>
+        <w:rPr>
+          <w:rFonts w:ascii="Times New Roman" w:hAnsi="Times New Roman" w:cs="Times New Roman"/>
+          <w:sz w:val="24"/>
+          <w:szCs w:val="24"/>
+        </w:rPr>
+        <w:t>as diferenças regionais no mercado de trabalho e nos rendimentos da população dentro do Piauí</w:t>
+      </w:r>
+      <w:r>
+        <w:rPr>
+          <w:rFonts w:ascii="Times New Roman" w:hAnsi="Times New Roman" w:cs="Times New Roman"/>
+          <w:sz w:val="24"/>
+          <w:szCs w:val="24"/>
+        </w:rPr>
+        <w:t xml:space="preserve"> utilizando esses novos recortes</w:t>
+      </w:r>
+      <w:r>
+        <w:rPr>
+          <w:rFonts w:ascii="Times New Roman" w:hAnsi="Times New Roman" w:cs="Times New Roman"/>
+          <w:sz w:val="24"/>
+          <w:szCs w:val="24"/>
+        </w:rPr>
+        <w:t xml:space="preserve">. Além dessa introdução, o relatório contém </w:t>
       </w:r>
       <w:r>
         <w:rPr>
@@ -2174,10 +2292,19 @@
       <w:r>
         <w:rPr>
           <w:rFonts w:ascii="Times New Roman" w:hAnsi="Times New Roman" w:cs="Times New Roman"/>
-          <w:sz w:val="24"/>
-          <w:szCs w:val="24"/>
-        </w:rPr>
-        <w:t xml:space="preserve">Como essas estatísticas são experimentais, é necessário um cuidado </w:t>
+          <w:color w:val="FF0000"/>
+          <w:sz w:val="24"/>
+          <w:szCs w:val="24"/>
+        </w:rPr>
+        <w:t>C</w:t>
+      </w:r>
+      <w:r>
+        <w:rPr>
+          <w:rFonts w:ascii="Times New Roman" w:hAnsi="Times New Roman" w:cs="Times New Roman"/>
+          <w:sz w:val="24"/>
+          <w:szCs w:val="24"/>
+        </w:rPr>
+        <w:t xml:space="preserve">omo essas estatísticas são experimentais, é necessário um cuidado </w:t>
       </w:r>
       <w:r>
         <w:rPr>
@@ -2209,15 +2336,31 @@
           <w:sz w:val="24"/>
           <w:szCs w:val="24"/>
         </w:rPr>
-        <w:t>Embora importante</w:t>
-      </w:r>
-      <w:r>
-        <w:rPr>
-          <w:rFonts w:ascii="Times New Roman" w:hAnsi="Times New Roman" w:cs="Times New Roman"/>
-          <w:sz w:val="24"/>
-          <w:szCs w:val="24"/>
-        </w:rPr>
-        <w:t>, muitos consideram apenas detalhes, e por isso serão relegados ao um anexo metodológico – direcionados aos puros de coração.</w:t>
+        <w:t xml:space="preserve">Embora </w:t>
+      </w:r>
+      <w:r>
+        <w:rPr>
+          <w:rFonts w:ascii="Times New Roman" w:hAnsi="Times New Roman" w:cs="Times New Roman"/>
+          <w:sz w:val="24"/>
+          <w:szCs w:val="24"/>
+        </w:rPr>
+        <w:t xml:space="preserve">o detalhe dos procedimentos metodológicos seja </w:t>
+      </w:r>
+      <w:r>
+        <w:rPr>
+          <w:rFonts w:ascii="Times New Roman" w:hAnsi="Times New Roman" w:cs="Times New Roman"/>
+          <w:sz w:val="24"/>
+          <w:szCs w:val="24"/>
+        </w:rPr>
+        <w:t>importante</w:t>
+      </w:r>
+      <w:r>
+        <w:rPr>
+          <w:rFonts w:ascii="Times New Roman" w:hAnsi="Times New Roman" w:cs="Times New Roman"/>
+          <w:sz w:val="24"/>
+          <w:szCs w:val="24"/>
+        </w:rPr>
+        <w:t>, muitos consideram apenas detalhes, e por isso serão relegados ao anexo metodológico – direcionados aos puros de coração.</w:t>
       </w:r>
     </w:p>
     <w:p>
@@ -2291,7 +2434,39 @@
           <w:sz w:val="24"/>
           <w:szCs w:val="24"/>
         </w:rPr>
-        <w:t xml:space="preserve">Neste relatório dividiremos nossa análise conforme diferentes temáticas. Para cada uma delas, teremos um indicador chave e indicadores secundários. Tomou-se como base </w:t>
+        <w:t xml:space="preserve">Neste relatório dividiremos nossa análise </w:t>
+      </w:r>
+      <w:r>
+        <w:rPr>
+          <w:rFonts w:ascii="Times New Roman" w:hAnsi="Times New Roman" w:cs="Times New Roman"/>
+          <w:sz w:val="24"/>
+          <w:szCs w:val="24"/>
+        </w:rPr>
+        <w:t>seguindo</w:t>
+      </w:r>
+      <w:r>
+        <w:rPr>
+          <w:rFonts w:ascii="Times New Roman" w:hAnsi="Times New Roman" w:cs="Times New Roman"/>
+          <w:sz w:val="24"/>
+          <w:szCs w:val="24"/>
+        </w:rPr>
+        <w:t xml:space="preserve"> diferentes temáticas. Para cada uma delas, teremos um indicador chave e </w:t>
+      </w:r>
+      <w:r>
+        <w:rPr>
+          <w:rFonts w:ascii="Times New Roman" w:hAnsi="Times New Roman" w:cs="Times New Roman"/>
+          <w:sz w:val="24"/>
+          <w:szCs w:val="24"/>
+        </w:rPr>
+        <w:t xml:space="preserve">alguns </w:t>
+      </w:r>
+      <w:r>
+        <w:rPr>
+          <w:rFonts w:ascii="Times New Roman" w:hAnsi="Times New Roman" w:cs="Times New Roman"/>
+          <w:sz w:val="24"/>
+          <w:szCs w:val="24"/>
+        </w:rPr>
+        <w:t xml:space="preserve">indicadores secundários. Tomou-se como base </w:t>
       </w:r>
       <w:r>
         <w:rPr>
@@ -2364,7 +2539,39 @@
           <w:sz w:val="24"/>
           <w:szCs w:val="24"/>
         </w:rPr>
-        <w:t xml:space="preserve"> que são interesse para fins de </w:t>
+        <w:t xml:space="preserve"> que são </w:t>
+      </w:r>
+      <w:r>
+        <w:rPr>
+          <w:rFonts w:ascii="Times New Roman" w:hAnsi="Times New Roman" w:cs="Times New Roman"/>
+          <w:sz w:val="24"/>
+          <w:szCs w:val="24"/>
+        </w:rPr>
+        <w:t xml:space="preserve">de </w:t>
+      </w:r>
+      <w:r>
+        <w:rPr>
+          <w:rFonts w:ascii="Times New Roman" w:hAnsi="Times New Roman" w:cs="Times New Roman"/>
+          <w:sz w:val="24"/>
+          <w:szCs w:val="24"/>
+        </w:rPr>
+        <w:t xml:space="preserve">interesse para </w:t>
+      </w:r>
+      <w:r>
+        <w:rPr>
+          <w:rFonts w:ascii="Times New Roman" w:hAnsi="Times New Roman" w:cs="Times New Roman"/>
+          <w:sz w:val="24"/>
+          <w:szCs w:val="24"/>
+        </w:rPr>
+        <w:t>o direcionamento de</w:t>
+      </w:r>
+      <w:r>
+        <w:rPr>
+          <w:rFonts w:ascii="Times New Roman" w:hAnsi="Times New Roman" w:cs="Times New Roman"/>
+          <w:sz w:val="24"/>
+          <w:szCs w:val="24"/>
+        </w:rPr>
+        <w:t xml:space="preserve"> </w:t>
       </w:r>
       <w:r>
         <w:rPr>
@@ -2530,6 +2737,7 @@
           <w:sz w:val="24"/>
           <w:szCs w:val="24"/>
         </w:rPr>
+        <w:lastRenderedPageBreak/>
         <w:t>Taxa de des</w:t>
       </w:r>
       <w:r>
@@ -2569,7 +2777,6 @@
           <w:sz w:val="24"/>
           <w:szCs w:val="24"/>
         </w:rPr>
-        <w:lastRenderedPageBreak/>
         <w:t>Des</w:t>
       </w:r>
       <w:r>
@@ -2633,7 +2840,93 @@
           <w:sz w:val="24"/>
           <w:szCs w:val="24"/>
         </w:rPr>
-        <w:t>Desocupação do responsável familiar  do conjugue;</w:t>
+        <w:t xml:space="preserve">Desocupação do responsável </w:t>
+      </w:r>
+      <w:r>
+        <w:rPr>
+          <w:rFonts w:ascii="Times New Roman" w:hAnsi="Times New Roman" w:cs="Times New Roman"/>
+          <w:sz w:val="24"/>
+          <w:szCs w:val="24"/>
+        </w:rPr>
+        <w:t>familiar do</w:t>
+      </w:r>
+      <w:r>
+        <w:rPr>
+          <w:rFonts w:ascii="Times New Roman" w:hAnsi="Times New Roman" w:cs="Times New Roman"/>
+          <w:sz w:val="24"/>
+          <w:szCs w:val="24"/>
+        </w:rPr>
+        <w:t xml:space="preserve"> conjugue;</w:t>
+      </w:r>
+    </w:p>
+    <w:p>
+      <w:pPr>
+        <w:pStyle w:val="PargrafodaLista"/>
+        <w:numPr>
+          <w:ilvl w:val="0"/>
+          <w:numId w:val="1"/>
+        </w:numPr>
+        <w:jc w:val="both"/>
+        <w:rPr>
+          <w:rFonts w:ascii="Times New Roman" w:hAnsi="Times New Roman" w:cs="Times New Roman"/>
+          <w:sz w:val="24"/>
+          <w:szCs w:val="24"/>
+        </w:rPr>
+      </w:pPr>
+      <w:r>
+        <w:rPr>
+          <w:rFonts w:ascii="Times New Roman" w:hAnsi="Times New Roman" w:cs="Times New Roman"/>
+          <w:sz w:val="24"/>
+          <w:szCs w:val="24"/>
+        </w:rPr>
+        <w:t>Rendimento</w:t>
+      </w:r>
+      <w:r>
+        <w:rPr>
+          <w:rFonts w:ascii="Times New Roman" w:hAnsi="Times New Roman" w:cs="Times New Roman"/>
+          <w:sz w:val="24"/>
+          <w:szCs w:val="24"/>
+        </w:rPr>
+        <w:t>:</w:t>
+      </w:r>
+    </w:p>
+    <w:p>
+      <w:pPr>
+        <w:pStyle w:val="PargrafodaLista"/>
+        <w:numPr>
+          <w:ilvl w:val="0"/>
+          <w:numId w:val="5"/>
+        </w:numPr>
+        <w:jc w:val="both"/>
+        <w:rPr>
+          <w:rFonts w:ascii="Times New Roman" w:hAnsi="Times New Roman" w:cs="Times New Roman"/>
+          <w:sz w:val="24"/>
+          <w:szCs w:val="24"/>
+        </w:rPr>
+      </w:pPr>
+      <w:r>
+        <w:rPr>
+          <w:rFonts w:ascii="Times New Roman" w:hAnsi="Times New Roman" w:cs="Times New Roman"/>
+          <w:sz w:val="24"/>
+          <w:szCs w:val="24"/>
+        </w:rPr>
+        <w:t>Rendimento</w:t>
+      </w:r>
+      <w:r>
+        <w:rPr>
+          <w:rFonts w:ascii="Times New Roman" w:hAnsi="Times New Roman" w:cs="Times New Roman"/>
+          <w:sz w:val="24"/>
+          <w:szCs w:val="24"/>
+        </w:rPr>
+        <w:t xml:space="preserve"> </w:t>
+      </w:r>
+      <w:r>
+        <w:rPr>
+          <w:rFonts w:ascii="Times New Roman" w:hAnsi="Times New Roman" w:cs="Times New Roman"/>
+          <w:sz w:val="24"/>
+          <w:szCs w:val="24"/>
+        </w:rPr>
+        <w:t>médio real (rendimento médio real habitualmente recebido em todos os trabalhos);</w:t>
       </w:r>
     </w:p>
     <w:p>
@@ -2650,13 +2943,39 @@
           <w:szCs w:val="24"/>
         </w:rPr>
       </w:pPr>
-      <w:r>
-        <w:rPr>
-          <w:rFonts w:ascii="Times New Roman" w:hAnsi="Times New Roman" w:cs="Times New Roman"/>
-          <w:sz w:val="24"/>
-          <w:szCs w:val="24"/>
-        </w:rPr>
-        <w:t>Rendimento médio real (rendimento médio real habitualmente recebido em todos os trabalhos);</w:t>
+      <w:proofErr w:type="spellStart"/>
+      <w:r>
+        <w:rPr>
+          <w:rFonts w:ascii="Times New Roman" w:hAnsi="Times New Roman" w:cs="Times New Roman"/>
+          <w:sz w:val="24"/>
+          <w:szCs w:val="24"/>
+        </w:rPr>
+        <w:t>Sub-remuneração</w:t>
+      </w:r>
+      <w:proofErr w:type="spellEnd"/>
+      <w:r>
+        <w:rPr>
+          <w:rFonts w:ascii="Times New Roman" w:hAnsi="Times New Roman" w:cs="Times New Roman"/>
+          <w:sz w:val="24"/>
+          <w:szCs w:val="24"/>
+        </w:rPr>
+        <w:t xml:space="preserve"> (percentual de </w:t>
+      </w:r>
+      <w:r>
+        <w:rPr>
+          <w:rFonts w:ascii="Times New Roman" w:hAnsi="Times New Roman" w:cs="Times New Roman"/>
+          <w:sz w:val="24"/>
+          <w:szCs w:val="24"/>
+        </w:rPr>
+        <w:t>ocupados</w:t>
+      </w:r>
+      <w:r>
+        <w:rPr>
+          <w:rFonts w:ascii="Times New Roman" w:hAnsi="Times New Roman" w:cs="Times New Roman"/>
+          <w:sz w:val="24"/>
+          <w:szCs w:val="24"/>
+        </w:rPr>
+        <w:t xml:space="preserve"> que recebem por hora trabalhada menos do que o salário mínimo horário);</w:t>
       </w:r>
     </w:p>
     <w:p>
@@ -2679,23 +2998,54 @@
           <w:sz w:val="24"/>
           <w:szCs w:val="24"/>
         </w:rPr>
-        <w:t xml:space="preserve">Sub-remuneração (percentual de </w:t>
-      </w:r>
-      <w:r>
-        <w:rPr>
-          <w:rFonts w:ascii="Times New Roman" w:hAnsi="Times New Roman" w:cs="Times New Roman"/>
-          <w:sz w:val="24"/>
-          <w:szCs w:val="24"/>
-        </w:rPr>
-        <w:t>ocupados</w:t>
-      </w:r>
-      <w:r>
-        <w:rPr>
-          <w:rFonts w:ascii="Times New Roman" w:hAnsi="Times New Roman" w:cs="Times New Roman"/>
-          <w:sz w:val="24"/>
-          <w:szCs w:val="24"/>
-        </w:rPr>
-        <w:t xml:space="preserve"> que recebem por hora trabalhada menos do que o salário mínimo horário);</w:t>
+        <w:t xml:space="preserve">Desigualdade (relação entre a remuneração dos </w:t>
+      </w:r>
+      <w:r>
+        <w:rPr>
+          <w:rFonts w:ascii="Times New Roman" w:hAnsi="Times New Roman" w:cs="Times New Roman"/>
+          <w:sz w:val="24"/>
+          <w:szCs w:val="24"/>
+        </w:rPr>
+        <w:t>ocupados formais e informais</w:t>
+      </w:r>
+      <w:r>
+        <w:rPr>
+          <w:rFonts w:ascii="Times New Roman" w:hAnsi="Times New Roman" w:cs="Times New Roman"/>
+          <w:sz w:val="24"/>
+          <w:szCs w:val="24"/>
+        </w:rPr>
+        <w:t>);</w:t>
+      </w:r>
+    </w:p>
+    <w:p>
+      <w:pPr>
+        <w:pStyle w:val="PargrafodaLista"/>
+        <w:numPr>
+          <w:ilvl w:val="0"/>
+          <w:numId w:val="1"/>
+        </w:numPr>
+        <w:jc w:val="both"/>
+        <w:rPr>
+          <w:rFonts w:ascii="Times New Roman" w:hAnsi="Times New Roman" w:cs="Times New Roman"/>
+          <w:sz w:val="24"/>
+          <w:szCs w:val="24"/>
+        </w:rPr>
+      </w:pPr>
+      <w:r>
+        <w:rPr>
+          <w:rFonts w:ascii="Times New Roman" w:hAnsi="Times New Roman" w:cs="Times New Roman"/>
+          <w:sz w:val="24"/>
+          <w:szCs w:val="24"/>
+        </w:rPr>
+        <w:t>Inserção no mercado de trabalho</w:t>
+      </w:r>
+      <w:r>
+        <w:rPr>
+          <w:rFonts w:ascii="Times New Roman" w:hAnsi="Times New Roman" w:cs="Times New Roman"/>
+          <w:sz w:val="24"/>
+          <w:szCs w:val="24"/>
+        </w:rPr>
+        <w:t>:</w:t>
       </w:r>
     </w:p>
     <w:p>
@@ -2718,15 +3068,7 @@
           <w:sz w:val="24"/>
           <w:szCs w:val="24"/>
         </w:rPr>
-        <w:t xml:space="preserve">Desigualdade (relação entre a remuneração dos </w:t>
-      </w:r>
-      <w:r>
-        <w:rPr>
-          <w:rFonts w:ascii="Times New Roman" w:hAnsi="Times New Roman" w:cs="Times New Roman"/>
-          <w:sz w:val="24"/>
-          <w:szCs w:val="24"/>
-        </w:rPr>
-        <w:t>ocupados formais e informais</w:t>
+        <w:t>Informalidade (percentual de ocupados sem carteira assinada</w:t>
       </w:r>
       <w:r>
         <w:rPr>
@@ -2735,6 +3077,62 @@
           <w:szCs w:val="24"/>
         </w:rPr>
         <w:t>);</w:t>
+      </w:r>
+    </w:p>
+    <w:p>
+      <w:pPr>
+        <w:pStyle w:val="PargrafodaLista"/>
+        <w:numPr>
+          <w:ilvl w:val="1"/>
+          <w:numId w:val="1"/>
+        </w:numPr>
+        <w:jc w:val="both"/>
+        <w:rPr>
+          <w:rFonts w:ascii="Times New Roman" w:hAnsi="Times New Roman" w:cs="Times New Roman"/>
+          <w:sz w:val="24"/>
+          <w:szCs w:val="24"/>
+        </w:rPr>
+      </w:pPr>
+      <w:proofErr w:type="spellStart"/>
+      <w:r>
+        <w:rPr>
+          <w:rFonts w:ascii="Times New Roman" w:hAnsi="Times New Roman" w:cs="Times New Roman"/>
+          <w:sz w:val="24"/>
+          <w:szCs w:val="24"/>
+        </w:rPr>
+        <w:t>Sub-ocupação</w:t>
+      </w:r>
+      <w:proofErr w:type="spellEnd"/>
+      <w:r>
+        <w:rPr>
+          <w:rFonts w:ascii="Times New Roman" w:hAnsi="Times New Roman" w:cs="Times New Roman"/>
+          <w:sz w:val="24"/>
+          <w:szCs w:val="24"/>
+        </w:rPr>
+        <w:t xml:space="preserve"> (percentual de pessoas subocupadas por insuficiência de horas trabalhadas);</w:t>
+      </w:r>
+    </w:p>
+    <w:p>
+      <w:pPr>
+        <w:pStyle w:val="PargrafodaLista"/>
+        <w:numPr>
+          <w:ilvl w:val="1"/>
+          <w:numId w:val="1"/>
+        </w:numPr>
+        <w:jc w:val="both"/>
+        <w:rPr>
+          <w:rFonts w:ascii="Times New Roman" w:hAnsi="Times New Roman" w:cs="Times New Roman"/>
+          <w:sz w:val="24"/>
+          <w:szCs w:val="24"/>
+        </w:rPr>
+      </w:pPr>
+      <w:r>
+        <w:rPr>
+          <w:rFonts w:ascii="Times New Roman" w:hAnsi="Times New Roman" w:cs="Times New Roman"/>
+          <w:sz w:val="24"/>
+          <w:szCs w:val="24"/>
+        </w:rPr>
+        <w:t>Escolaridade (percentual de ocupados com ensino médio completo);</w:t>
       </w:r>
     </w:p>
     <w:p>
@@ -2757,7 +3155,7 @@
           <w:sz w:val="24"/>
           <w:szCs w:val="24"/>
         </w:rPr>
-        <w:t>Inserção no mercado de trabalho</w:t>
+        <w:t>Desalentados</w:t>
       </w:r>
       <w:r>
         <w:rPr>
@@ -2788,15 +3186,15 @@
           <w:sz w:val="24"/>
           <w:szCs w:val="24"/>
         </w:rPr>
-        <w:t>Informalidade (percentual de ocupados sem carteira assinada</w:t>
-      </w:r>
-      <w:r>
-        <w:rPr>
-          <w:rFonts w:ascii="Times New Roman" w:hAnsi="Times New Roman" w:cs="Times New Roman"/>
-          <w:sz w:val="24"/>
-          <w:szCs w:val="24"/>
-        </w:rPr>
-        <w:t>);</w:t>
+        <w:t>Percentual de desalentados</w:t>
+      </w:r>
+      <w:r>
+        <w:rPr>
+          <w:rFonts w:ascii="Times New Roman" w:hAnsi="Times New Roman" w:cs="Times New Roman"/>
+          <w:sz w:val="24"/>
+          <w:szCs w:val="24"/>
+        </w:rPr>
+        <w:t>;</w:t>
       </w:r>
     </w:p>
     <w:p>
@@ -2819,7 +3217,7 @@
           <w:sz w:val="24"/>
           <w:szCs w:val="24"/>
         </w:rPr>
-        <w:t>Sub-ocupação (percentual de pessoas subocupadas por insuficiência de horas trabalhadas);</w:t>
+        <w:t>Percentual de jovens nem-e-nem;</w:t>
       </w:r>
     </w:p>
     <w:p>
@@ -2842,47 +3240,169 @@
           <w:sz w:val="24"/>
           <w:szCs w:val="24"/>
         </w:rPr>
-        <w:t>Escolaridade (percentual de ocupados com ensino médio completo);</w:t>
+        <w:t>Motivos de não ter procurado emprego;</w:t>
       </w:r>
     </w:p>
     <w:p>
       <w:pPr>
-        <w:pStyle w:val="PargrafodaLista"/>
-        <w:numPr>
-          <w:ilvl w:val="0"/>
-          <w:numId w:val="1"/>
-        </w:numPr>
         <w:jc w:val="both"/>
         <w:rPr>
           <w:rFonts w:ascii="Times New Roman" w:hAnsi="Times New Roman" w:cs="Times New Roman"/>
           <w:sz w:val="24"/>
           <w:szCs w:val="24"/>
-        </w:rPr>
-      </w:pPr>
-      <w:r>
-        <w:rPr>
-          <w:rFonts w:ascii="Times New Roman" w:hAnsi="Times New Roman" w:cs="Times New Roman"/>
-          <w:sz w:val="24"/>
-          <w:szCs w:val="24"/>
-        </w:rPr>
-        <w:t>Desalentados</w:t>
-      </w:r>
-      <w:r>
-        <w:rPr>
-          <w:rFonts w:ascii="Times New Roman" w:hAnsi="Times New Roman" w:cs="Times New Roman"/>
-          <w:sz w:val="24"/>
-          <w:szCs w:val="24"/>
-        </w:rPr>
-        <w:t>:</w:t>
+          <w:u w:val="single"/>
+        </w:rPr>
+      </w:pPr>
+      <w:r>
+        <w:rPr>
+          <w:rFonts w:ascii="Times New Roman" w:hAnsi="Times New Roman" w:cs="Times New Roman"/>
+          <w:sz w:val="24"/>
+          <w:szCs w:val="24"/>
+        </w:rPr>
+        <w:t xml:space="preserve">Para </w:t>
+      </w:r>
+      <w:r>
+        <w:rPr>
+          <w:rFonts w:ascii="Times New Roman" w:hAnsi="Times New Roman" w:cs="Times New Roman"/>
+          <w:sz w:val="24"/>
+          <w:szCs w:val="24"/>
+        </w:rPr>
+        <w:t>a dimensão d</w:t>
+      </w:r>
+      <w:r>
+        <w:rPr>
+          <w:rFonts w:ascii="Times New Roman" w:hAnsi="Times New Roman" w:cs="Times New Roman"/>
+          <w:sz w:val="24"/>
+          <w:szCs w:val="24"/>
+        </w:rPr>
+        <w:t>a desocupação</w:t>
+      </w:r>
+      <w:r>
+        <w:rPr>
+          <w:rFonts w:ascii="Times New Roman" w:hAnsi="Times New Roman" w:cs="Times New Roman"/>
+          <w:sz w:val="24"/>
+          <w:szCs w:val="24"/>
+        </w:rPr>
+        <w:t>, o indicador chave é, evidentemente, a taxa de de</w:t>
+      </w:r>
+      <w:r>
+        <w:rPr>
+          <w:rFonts w:ascii="Times New Roman" w:hAnsi="Times New Roman" w:cs="Times New Roman"/>
+          <w:sz w:val="24"/>
+          <w:szCs w:val="24"/>
+        </w:rPr>
+        <w:t>socupação</w:t>
+      </w:r>
+      <w:r>
+        <w:rPr>
+          <w:rFonts w:ascii="Times New Roman" w:hAnsi="Times New Roman" w:cs="Times New Roman"/>
+          <w:sz w:val="24"/>
+          <w:szCs w:val="24"/>
+        </w:rPr>
+        <w:t>, um dos principais indicadores do mercado de trabalho</w:t>
+      </w:r>
+      <w:r>
+        <w:rPr>
+          <w:rFonts w:ascii="Times New Roman" w:hAnsi="Times New Roman" w:cs="Times New Roman"/>
+          <w:sz w:val="24"/>
+          <w:szCs w:val="24"/>
+        </w:rPr>
+        <w:t xml:space="preserve">, que mostra quantas pessoas estavam procurando emprego e não conseguiram </w:t>
+      </w:r>
+      <w:r>
+        <w:rPr>
+          <w:rFonts w:ascii="Times New Roman" w:hAnsi="Times New Roman" w:cs="Times New Roman"/>
+          <w:sz w:val="24"/>
+          <w:szCs w:val="24"/>
+        </w:rPr>
+        <w:t>encontrar</w:t>
+      </w:r>
+      <w:r>
+        <w:rPr>
+          <w:rFonts w:ascii="Times New Roman" w:hAnsi="Times New Roman" w:cs="Times New Roman"/>
+          <w:sz w:val="24"/>
+          <w:szCs w:val="24"/>
+        </w:rPr>
+        <w:t>.</w:t>
+      </w:r>
+      <w:r>
+        <w:rPr>
+          <w:rFonts w:ascii="Times New Roman" w:hAnsi="Times New Roman" w:cs="Times New Roman"/>
+          <w:sz w:val="24"/>
+          <w:szCs w:val="24"/>
+        </w:rPr>
+        <w:t xml:space="preserve"> </w:t>
+      </w:r>
+      <w:r>
+        <w:rPr>
+          <w:rFonts w:ascii="Times New Roman" w:hAnsi="Times New Roman" w:cs="Times New Roman"/>
+          <w:sz w:val="24"/>
+          <w:szCs w:val="24"/>
+        </w:rPr>
+        <w:t xml:space="preserve">Além da taxa, analisamos o percentual de </w:t>
+      </w:r>
+      <w:r>
+        <w:rPr>
+          <w:rFonts w:ascii="Times New Roman" w:hAnsi="Times New Roman" w:cs="Times New Roman"/>
+          <w:sz w:val="24"/>
+          <w:szCs w:val="24"/>
+        </w:rPr>
+        <w:t xml:space="preserve">responsáveis </w:t>
+      </w:r>
+      <w:r>
+        <w:rPr>
+          <w:rFonts w:ascii="Times New Roman" w:hAnsi="Times New Roman" w:cs="Times New Roman"/>
+          <w:color w:val="FF0000"/>
+          <w:sz w:val="24"/>
+          <w:szCs w:val="24"/>
+        </w:rPr>
+        <w:t>familiares</w:t>
+      </w:r>
+      <w:r>
+        <w:rPr>
+          <w:rFonts w:ascii="Times New Roman" w:hAnsi="Times New Roman" w:cs="Times New Roman"/>
+          <w:color w:val="FF0000"/>
+          <w:sz w:val="24"/>
+          <w:szCs w:val="24"/>
+        </w:rPr>
+        <w:t xml:space="preserve"> </w:t>
+      </w:r>
+      <w:r>
+        <w:rPr>
+          <w:rFonts w:ascii="Times New Roman" w:hAnsi="Times New Roman" w:cs="Times New Roman"/>
+          <w:color w:val="FF0000"/>
+          <w:sz w:val="24"/>
+          <w:szCs w:val="24"/>
+        </w:rPr>
+        <w:t xml:space="preserve">e seus conjugues </w:t>
+      </w:r>
+      <w:r>
+        <w:rPr>
+          <w:rFonts w:ascii="Times New Roman" w:hAnsi="Times New Roman" w:cs="Times New Roman"/>
+          <w:sz w:val="24"/>
+          <w:szCs w:val="24"/>
+        </w:rPr>
+        <w:t xml:space="preserve">entre os desocupados, pois </w:t>
+      </w:r>
+      <w:r>
+        <w:rPr>
+          <w:rFonts w:ascii="Times New Roman" w:hAnsi="Times New Roman" w:cs="Times New Roman"/>
+          <w:sz w:val="24"/>
+          <w:szCs w:val="24"/>
+        </w:rPr>
+        <w:t xml:space="preserve">mostra a situação </w:t>
+      </w:r>
+      <w:r>
+        <w:rPr>
+          <w:rFonts w:ascii="Times New Roman" w:hAnsi="Times New Roman" w:cs="Times New Roman"/>
+          <w:sz w:val="24"/>
+          <w:szCs w:val="24"/>
+        </w:rPr>
+        <w:t>onde o desemprego vira um problema familiar ao afetar o orçamento doméstico.</w:t>
       </w:r>
     </w:p>
     <w:p>
       <w:pPr>
-        <w:pStyle w:val="PargrafodaLista"/>
-        <w:numPr>
-          <w:ilvl w:val="1"/>
-          <w:numId w:val="1"/>
-        </w:numPr>
         <w:jc w:val="both"/>
         <w:rPr>
           <w:rFonts w:ascii="Times New Roman" w:hAnsi="Times New Roman" w:cs="Times New Roman"/>
@@ -2896,24 +3416,198 @@
           <w:sz w:val="24"/>
           <w:szCs w:val="24"/>
         </w:rPr>
-        <w:t>Percentual de desalentados</w:t>
-      </w:r>
-      <w:r>
-        <w:rPr>
-          <w:rFonts w:ascii="Times New Roman" w:hAnsi="Times New Roman" w:cs="Times New Roman"/>
-          <w:sz w:val="24"/>
-          <w:szCs w:val="24"/>
-        </w:rPr>
-        <w:t>;</w:t>
+        <w:t>Para a dimensão dos</w:t>
+      </w:r>
+      <w:r>
+        <w:rPr>
+          <w:rFonts w:ascii="Times New Roman" w:hAnsi="Times New Roman" w:cs="Times New Roman"/>
+          <w:sz w:val="24"/>
+          <w:szCs w:val="24"/>
+        </w:rPr>
+        <w:t xml:space="preserve"> rendimentos, a variável chave é o rendimento médio habitualmente recebido em todos os trabalhos</w:t>
+      </w:r>
+      <w:r>
+        <w:rPr>
+          <w:rFonts w:ascii="Times New Roman" w:hAnsi="Times New Roman" w:cs="Times New Roman"/>
+          <w:sz w:val="24"/>
+          <w:szCs w:val="24"/>
+        </w:rPr>
+        <w:t>.</w:t>
+      </w:r>
+      <w:r>
+        <w:rPr>
+          <w:rFonts w:ascii="Times New Roman" w:hAnsi="Times New Roman" w:cs="Times New Roman"/>
+          <w:sz w:val="24"/>
+          <w:szCs w:val="24"/>
+        </w:rPr>
+        <w:t xml:space="preserve"> </w:t>
+      </w:r>
+      <w:r>
+        <w:rPr>
+          <w:rFonts w:ascii="Times New Roman" w:hAnsi="Times New Roman" w:cs="Times New Roman"/>
+          <w:sz w:val="24"/>
+          <w:szCs w:val="24"/>
+        </w:rPr>
+        <w:t>E</w:t>
+      </w:r>
+      <w:r>
+        <w:rPr>
+          <w:rFonts w:ascii="Times New Roman" w:hAnsi="Times New Roman" w:cs="Times New Roman"/>
+          <w:sz w:val="24"/>
+          <w:szCs w:val="24"/>
+        </w:rPr>
+        <w:t xml:space="preserve">scolhemos a habitualmente recebida pois </w:t>
+      </w:r>
+      <w:r>
+        <w:rPr>
+          <w:rFonts w:ascii="Times New Roman" w:hAnsi="Times New Roman" w:cs="Times New Roman"/>
+          <w:sz w:val="24"/>
+          <w:szCs w:val="24"/>
+        </w:rPr>
+        <w:t>é o ganho normal e contínuo e mostra a estabilidade do ganho</w:t>
+      </w:r>
+      <w:r>
+        <w:rPr>
+          <w:rStyle w:val="Refdenotaderodap"/>
+          <w:rFonts w:ascii="Times New Roman" w:hAnsi="Times New Roman" w:cs="Times New Roman"/>
+          <w:sz w:val="24"/>
+          <w:szCs w:val="24"/>
+        </w:rPr>
+        <w:footnoteReference w:id="2"/>
+      </w:r>
+      <w:r>
+        <w:rPr>
+          <w:rFonts w:ascii="Times New Roman" w:hAnsi="Times New Roman" w:cs="Times New Roman"/>
+          <w:sz w:val="24"/>
+          <w:szCs w:val="24"/>
+        </w:rPr>
+        <w:t xml:space="preserve">. </w:t>
+      </w:r>
+      <w:r>
+        <w:rPr>
+          <w:rFonts w:ascii="Times New Roman" w:hAnsi="Times New Roman" w:cs="Times New Roman"/>
+          <w:sz w:val="24"/>
+          <w:szCs w:val="24"/>
+        </w:rPr>
+        <w:t xml:space="preserve">As variáveis </w:t>
+      </w:r>
+      <w:r>
+        <w:rPr>
+          <w:rFonts w:ascii="Times New Roman" w:hAnsi="Times New Roman" w:cs="Times New Roman"/>
+          <w:sz w:val="24"/>
+          <w:szCs w:val="24"/>
+        </w:rPr>
+        <w:t>adicionais</w:t>
+      </w:r>
+      <w:r>
+        <w:rPr>
+          <w:rFonts w:ascii="Times New Roman" w:hAnsi="Times New Roman" w:cs="Times New Roman"/>
+          <w:sz w:val="24"/>
+          <w:szCs w:val="24"/>
+        </w:rPr>
+        <w:t xml:space="preserve"> são a </w:t>
+      </w:r>
+      <w:proofErr w:type="spellStart"/>
+      <w:r>
+        <w:rPr>
+          <w:rFonts w:ascii="Times New Roman" w:hAnsi="Times New Roman" w:cs="Times New Roman"/>
+          <w:sz w:val="24"/>
+          <w:szCs w:val="24"/>
+        </w:rPr>
+        <w:t>sub-remuneração</w:t>
+      </w:r>
+      <w:proofErr w:type="spellEnd"/>
+      <w:r>
+        <w:rPr>
+          <w:rFonts w:ascii="Times New Roman" w:hAnsi="Times New Roman" w:cs="Times New Roman"/>
+          <w:sz w:val="24"/>
+          <w:szCs w:val="24"/>
+        </w:rPr>
+        <w:t xml:space="preserve"> de hora trabalhada</w:t>
+      </w:r>
+      <w:r>
+        <w:rPr>
+          <w:rFonts w:ascii="Times New Roman" w:hAnsi="Times New Roman" w:cs="Times New Roman"/>
+          <w:sz w:val="24"/>
+          <w:szCs w:val="24"/>
+        </w:rPr>
+        <w:t>s</w:t>
+      </w:r>
+      <w:r>
+        <w:rPr>
+          <w:rFonts w:ascii="Times New Roman" w:hAnsi="Times New Roman" w:cs="Times New Roman"/>
+          <w:sz w:val="24"/>
+          <w:szCs w:val="24"/>
+        </w:rPr>
+        <w:t xml:space="preserve"> – </w:t>
+      </w:r>
+      <w:r>
+        <w:rPr>
+          <w:rFonts w:ascii="Times New Roman" w:hAnsi="Times New Roman" w:cs="Times New Roman"/>
+          <w:sz w:val="24"/>
+          <w:szCs w:val="24"/>
+        </w:rPr>
+        <w:t>ela captura trabalhadores em situação de precariedade, pois trabalham por menos do que o piso legal equivalente</w:t>
+      </w:r>
+      <w:r>
+        <w:rPr>
+          <w:rFonts w:ascii="Times New Roman" w:hAnsi="Times New Roman" w:cs="Times New Roman"/>
+          <w:sz w:val="24"/>
+          <w:szCs w:val="24"/>
+        </w:rPr>
+        <w:t>. Já para a desigualdade de rendimentos no mercado de trabalho, optou-se pela relação entre a remuneração d</w:t>
+      </w:r>
+      <w:r>
+        <w:rPr>
+          <w:rFonts w:ascii="Times New Roman" w:hAnsi="Times New Roman" w:cs="Times New Roman"/>
+          <w:sz w:val="24"/>
+          <w:szCs w:val="24"/>
+        </w:rPr>
+        <w:t>os ocupados</w:t>
+      </w:r>
+      <w:r>
+        <w:rPr>
+          <w:rFonts w:ascii="Times New Roman" w:hAnsi="Times New Roman" w:cs="Times New Roman"/>
+          <w:sz w:val="24"/>
+          <w:szCs w:val="24"/>
+        </w:rPr>
+        <w:t xml:space="preserve"> formais e </w:t>
+      </w:r>
+      <w:r>
+        <w:rPr>
+          <w:rFonts w:ascii="Times New Roman" w:hAnsi="Times New Roman" w:cs="Times New Roman"/>
+          <w:sz w:val="24"/>
+          <w:szCs w:val="24"/>
+        </w:rPr>
+        <w:t xml:space="preserve">dos </w:t>
+      </w:r>
+      <w:r>
+        <w:rPr>
+          <w:rFonts w:ascii="Times New Roman" w:hAnsi="Times New Roman" w:cs="Times New Roman"/>
+          <w:sz w:val="24"/>
+          <w:szCs w:val="24"/>
+        </w:rPr>
+        <w:t xml:space="preserve">informais para avaliar </w:t>
+      </w:r>
+      <w:r>
+        <w:rPr>
+          <w:rFonts w:ascii="Times New Roman" w:hAnsi="Times New Roman" w:cs="Times New Roman"/>
+          <w:sz w:val="24"/>
+          <w:szCs w:val="24"/>
+        </w:rPr>
+        <w:t>o efeito da formalidade nos rendimentos do mercado de trabalho</w:t>
+      </w:r>
+      <w:r>
+        <w:rPr>
+          <w:rFonts w:ascii="Times New Roman" w:hAnsi="Times New Roman" w:cs="Times New Roman"/>
+          <w:sz w:val="24"/>
+          <w:szCs w:val="24"/>
+        </w:rPr>
+        <w:t>.</w:t>
       </w:r>
     </w:p>
     <w:p>
       <w:pPr>
-        <w:pStyle w:val="PargrafodaLista"/>
-        <w:numPr>
-          <w:ilvl w:val="1"/>
-          <w:numId w:val="1"/>
-        </w:numPr>
         <w:jc w:val="both"/>
         <w:rPr>
           <w:rFonts w:ascii="Times New Roman" w:hAnsi="Times New Roman" w:cs="Times New Roman"/>
@@ -2927,16 +3621,267 @@
           <w:sz w:val="24"/>
           <w:szCs w:val="24"/>
         </w:rPr>
-        <w:t>Percentual de jovens nem-e-nem;</w:t>
+        <w:t>Para a dimensão da inserção no mercado de trabalho</w:t>
+      </w:r>
+      <w:r>
+        <w:rPr>
+          <w:rFonts w:ascii="Times New Roman" w:hAnsi="Times New Roman" w:cs="Times New Roman"/>
+          <w:sz w:val="24"/>
+          <w:szCs w:val="24"/>
+        </w:rPr>
+        <w:t>, examinando a qualidade do vínculo empregatício</w:t>
+      </w:r>
+      <w:r>
+        <w:rPr>
+          <w:rFonts w:ascii="Times New Roman" w:hAnsi="Times New Roman" w:cs="Times New Roman"/>
+          <w:sz w:val="24"/>
+          <w:szCs w:val="24"/>
+        </w:rPr>
+        <w:t>. O indicador chave é a taxa de informalidade</w:t>
+      </w:r>
+      <w:r>
+        <w:rPr>
+          <w:rStyle w:val="Refdenotaderodap"/>
+          <w:rFonts w:ascii="Times New Roman" w:hAnsi="Times New Roman" w:cs="Times New Roman"/>
+          <w:sz w:val="24"/>
+          <w:szCs w:val="24"/>
+        </w:rPr>
+        <w:footnoteReference w:id="3"/>
+      </w:r>
+      <w:r>
+        <w:rPr>
+          <w:rFonts w:ascii="Times New Roman" w:hAnsi="Times New Roman" w:cs="Times New Roman"/>
+          <w:sz w:val="24"/>
+          <w:szCs w:val="24"/>
+        </w:rPr>
+        <w:t>,</w:t>
+      </w:r>
+      <w:r>
+        <w:rPr>
+          <w:rFonts w:ascii="Times New Roman" w:hAnsi="Times New Roman" w:cs="Times New Roman"/>
+          <w:sz w:val="24"/>
+          <w:szCs w:val="24"/>
+        </w:rPr>
+        <w:t xml:space="preserve"> que mostra o percentual da população mais vulnerável e/ou em situações precárias de trabalho</w:t>
+      </w:r>
+      <w:r>
+        <w:rPr>
+          <w:rFonts w:ascii="Times New Roman" w:hAnsi="Times New Roman" w:cs="Times New Roman"/>
+          <w:sz w:val="24"/>
+          <w:szCs w:val="24"/>
+        </w:rPr>
+        <w:t xml:space="preserve"> e sem acesso a </w:t>
+      </w:r>
+      <w:r>
+        <w:rPr>
+          <w:rFonts w:ascii="Times New Roman" w:hAnsi="Times New Roman" w:cs="Times New Roman"/>
+          <w:sz w:val="24"/>
+          <w:szCs w:val="24"/>
+        </w:rPr>
+        <w:t xml:space="preserve">previdência, seguro-desemprego, licenças e </w:t>
+      </w:r>
+      <w:r>
+        <w:rPr>
+          <w:rFonts w:ascii="Times New Roman" w:hAnsi="Times New Roman" w:cs="Times New Roman"/>
+          <w:sz w:val="24"/>
+          <w:szCs w:val="24"/>
+        </w:rPr>
+        <w:t xml:space="preserve">menos </w:t>
+      </w:r>
+      <w:r>
+        <w:rPr>
+          <w:rFonts w:ascii="Times New Roman" w:hAnsi="Times New Roman" w:cs="Times New Roman"/>
+          <w:sz w:val="24"/>
+          <w:szCs w:val="24"/>
+        </w:rPr>
+        <w:t>estabilidade</w:t>
+      </w:r>
+      <w:r>
+        <w:rPr>
+          <w:rFonts w:ascii="Times New Roman" w:hAnsi="Times New Roman" w:cs="Times New Roman"/>
+          <w:sz w:val="24"/>
+          <w:szCs w:val="24"/>
+        </w:rPr>
+        <w:t>.</w:t>
+      </w:r>
+      <w:r>
+        <w:rPr>
+          <w:rFonts w:ascii="Times New Roman" w:hAnsi="Times New Roman" w:cs="Times New Roman"/>
+          <w:sz w:val="24"/>
+          <w:szCs w:val="24"/>
+        </w:rPr>
+        <w:t xml:space="preserve"> Os indicadores adicionais são a </w:t>
+      </w:r>
+      <w:proofErr w:type="spellStart"/>
+      <w:r>
+        <w:rPr>
+          <w:rFonts w:ascii="Times New Roman" w:hAnsi="Times New Roman" w:cs="Times New Roman"/>
+          <w:sz w:val="24"/>
+          <w:szCs w:val="24"/>
+        </w:rPr>
+        <w:t>sub-ocupação</w:t>
+      </w:r>
+      <w:proofErr w:type="spellEnd"/>
+      <w:r>
+        <w:rPr>
+          <w:rFonts w:ascii="Times New Roman" w:hAnsi="Times New Roman" w:cs="Times New Roman"/>
+          <w:sz w:val="24"/>
+          <w:szCs w:val="24"/>
+        </w:rPr>
+        <w:t xml:space="preserve"> </w:t>
+      </w:r>
+      <w:r>
+        <w:rPr>
+          <w:rFonts w:ascii="Times New Roman" w:hAnsi="Times New Roman" w:cs="Times New Roman"/>
+          <w:sz w:val="24"/>
+          <w:szCs w:val="24"/>
+        </w:rPr>
+        <w:t xml:space="preserve">por insuficiência de horas trabalhadas, que mostra o </w:t>
+      </w:r>
+      <w:r>
+        <w:rPr>
+          <w:rFonts w:ascii="Times New Roman" w:hAnsi="Times New Roman" w:cs="Times New Roman"/>
+          <w:sz w:val="24"/>
+          <w:szCs w:val="24"/>
+        </w:rPr>
+        <w:lastRenderedPageBreak/>
+        <w:t xml:space="preserve">percentual de </w:t>
+      </w:r>
+      <w:r>
+        <w:rPr>
+          <w:rFonts w:ascii="Times New Roman" w:hAnsi="Times New Roman" w:cs="Times New Roman"/>
+          <w:sz w:val="24"/>
+          <w:szCs w:val="24"/>
+        </w:rPr>
+        <w:t>ocupados que trabalharam menos</w:t>
+      </w:r>
+      <w:r>
+        <w:rPr>
+          <w:rFonts w:ascii="Times New Roman" w:hAnsi="Times New Roman" w:cs="Times New Roman"/>
+          <w:sz w:val="24"/>
+          <w:szCs w:val="24"/>
+        </w:rPr>
+        <w:t xml:space="preserve"> de 4</w:t>
+      </w:r>
+      <w:r>
+        <w:rPr>
+          <w:rFonts w:ascii="Times New Roman" w:hAnsi="Times New Roman" w:cs="Times New Roman"/>
+          <w:sz w:val="24"/>
+          <w:szCs w:val="24"/>
+        </w:rPr>
+        <w:t>0</w:t>
+      </w:r>
+      <w:r>
+        <w:rPr>
+          <w:rFonts w:ascii="Times New Roman" w:hAnsi="Times New Roman" w:cs="Times New Roman"/>
+          <w:sz w:val="24"/>
+          <w:szCs w:val="24"/>
+        </w:rPr>
+        <w:t xml:space="preserve"> horas semanais dispostos a trabalhar mais</w:t>
+      </w:r>
+      <w:r>
+        <w:rPr>
+          <w:rFonts w:ascii="Times New Roman" w:hAnsi="Times New Roman" w:cs="Times New Roman"/>
+          <w:sz w:val="24"/>
+          <w:szCs w:val="24"/>
+        </w:rPr>
+        <w:t xml:space="preserve">, indicado </w:t>
+      </w:r>
+      <w:proofErr w:type="spellStart"/>
+      <w:r>
+        <w:rPr>
+          <w:rFonts w:ascii="Times New Roman" w:hAnsi="Times New Roman" w:cs="Times New Roman"/>
+          <w:sz w:val="24"/>
+          <w:szCs w:val="24"/>
+        </w:rPr>
+        <w:t>sub-utilização</w:t>
+      </w:r>
+      <w:proofErr w:type="spellEnd"/>
+      <w:r>
+        <w:rPr>
+          <w:rFonts w:ascii="Times New Roman" w:hAnsi="Times New Roman" w:cs="Times New Roman"/>
+          <w:sz w:val="24"/>
+          <w:szCs w:val="24"/>
+        </w:rPr>
+        <w:t xml:space="preserve"> da </w:t>
+      </w:r>
+      <w:proofErr w:type="spellStart"/>
+      <w:r>
+        <w:rPr>
+          <w:rFonts w:ascii="Times New Roman" w:hAnsi="Times New Roman" w:cs="Times New Roman"/>
+          <w:sz w:val="24"/>
+          <w:szCs w:val="24"/>
+        </w:rPr>
+        <w:t>mão-de-bra</w:t>
+      </w:r>
+      <w:proofErr w:type="spellEnd"/>
+      <w:r>
+        <w:rPr>
+          <w:rFonts w:ascii="Times New Roman" w:hAnsi="Times New Roman" w:cs="Times New Roman"/>
+          <w:sz w:val="24"/>
+          <w:szCs w:val="24"/>
+        </w:rPr>
+        <w:t xml:space="preserve"> disponível</w:t>
+      </w:r>
+      <w:r>
+        <w:rPr>
+          <w:rFonts w:ascii="Times New Roman" w:hAnsi="Times New Roman" w:cs="Times New Roman"/>
+          <w:sz w:val="24"/>
+          <w:szCs w:val="24"/>
+        </w:rPr>
+        <w:t xml:space="preserve">. Por fim, considera-se o percentual de ocupados com </w:t>
+      </w:r>
+      <w:r>
+        <w:rPr>
+          <w:rFonts w:ascii="Times New Roman" w:hAnsi="Times New Roman" w:cs="Times New Roman"/>
+          <w:sz w:val="24"/>
+          <w:szCs w:val="24"/>
+        </w:rPr>
+        <w:t>pelo</w:t>
+      </w:r>
+      <w:r>
+        <w:rPr>
+          <w:rFonts w:ascii="Times New Roman" w:hAnsi="Times New Roman" w:cs="Times New Roman"/>
+          <w:sz w:val="24"/>
+          <w:szCs w:val="24"/>
+        </w:rPr>
+        <w:t xml:space="preserve"> menos ensino médio completo como medida de mão de obra com maior produtividade no mercado</w:t>
+      </w:r>
+      <w:r>
+        <w:rPr>
+          <w:rFonts w:ascii="Times New Roman" w:hAnsi="Times New Roman" w:cs="Times New Roman"/>
+          <w:sz w:val="24"/>
+          <w:szCs w:val="24"/>
+        </w:rPr>
+        <w:t xml:space="preserve"> e, indiretamente, </w:t>
+      </w:r>
+      <w:r>
+        <w:rPr>
+          <w:rFonts w:ascii="Times New Roman" w:hAnsi="Times New Roman" w:cs="Times New Roman"/>
+          <w:sz w:val="24"/>
+          <w:szCs w:val="24"/>
+        </w:rPr>
+        <w:t>do tipo</w:t>
+      </w:r>
+      <w:r>
+        <w:rPr>
+          <w:rFonts w:ascii="Times New Roman" w:hAnsi="Times New Roman" w:cs="Times New Roman"/>
+          <w:sz w:val="24"/>
+          <w:szCs w:val="24"/>
+        </w:rPr>
+        <w:t xml:space="preserve"> </w:t>
+      </w:r>
+      <w:r>
+        <w:rPr>
+          <w:rFonts w:ascii="Times New Roman" w:hAnsi="Times New Roman" w:cs="Times New Roman"/>
+          <w:sz w:val="24"/>
+          <w:szCs w:val="24"/>
+        </w:rPr>
+        <w:t>de posto de trabalho que cada território oferece.</w:t>
       </w:r>
     </w:p>
     <w:p>
       <w:pPr>
-        <w:pStyle w:val="PargrafodaLista"/>
-        <w:numPr>
-          <w:ilvl w:val="1"/>
-          <w:numId w:val="1"/>
-        </w:numPr>
         <w:jc w:val="both"/>
         <w:rPr>
           <w:rFonts w:ascii="Times New Roman" w:hAnsi="Times New Roman" w:cs="Times New Roman"/>
@@ -2944,14 +3889,6 @@
           <w:szCs w:val="24"/>
         </w:rPr>
       </w:pPr>
-      <w:r>
-        <w:rPr>
-          <w:rFonts w:ascii="Times New Roman" w:hAnsi="Times New Roman" w:cs="Times New Roman"/>
-          <w:sz w:val="24"/>
-          <w:szCs w:val="24"/>
-        </w:rPr>
-        <w:t>Motivos de não ter procurado emprego;</w:t>
-      </w:r>
     </w:p>
     <w:p>
       <w:pPr>
@@ -2960,72 +3897,15 @@
           <w:rFonts w:ascii="Times New Roman" w:hAnsi="Times New Roman" w:cs="Times New Roman"/>
           <w:sz w:val="24"/>
           <w:szCs w:val="24"/>
-          <w:u w:val="single"/>
-        </w:rPr>
-      </w:pPr>
-      <w:r>
-        <w:rPr>
-          <w:rFonts w:ascii="Times New Roman" w:hAnsi="Times New Roman" w:cs="Times New Roman"/>
-          <w:sz w:val="24"/>
-          <w:szCs w:val="24"/>
-        </w:rPr>
-        <w:t xml:space="preserve">Para </w:t>
-      </w:r>
-      <w:r>
-        <w:rPr>
-          <w:rFonts w:ascii="Times New Roman" w:hAnsi="Times New Roman" w:cs="Times New Roman"/>
-          <w:sz w:val="24"/>
-          <w:szCs w:val="24"/>
-        </w:rPr>
-        <w:t>a dimensão d</w:t>
-      </w:r>
-      <w:r>
-        <w:rPr>
-          <w:rFonts w:ascii="Times New Roman" w:hAnsi="Times New Roman" w:cs="Times New Roman"/>
-          <w:sz w:val="24"/>
-          <w:szCs w:val="24"/>
-        </w:rPr>
-        <w:t>a desocupação</w:t>
-      </w:r>
-      <w:r>
-        <w:rPr>
-          <w:rFonts w:ascii="Times New Roman" w:hAnsi="Times New Roman" w:cs="Times New Roman"/>
-          <w:sz w:val="24"/>
-          <w:szCs w:val="24"/>
-        </w:rPr>
-        <w:t>, o indicador chave é, evidentemente, a taxa de de</w:t>
-      </w:r>
-      <w:r>
-        <w:rPr>
-          <w:rFonts w:ascii="Times New Roman" w:hAnsi="Times New Roman" w:cs="Times New Roman"/>
-          <w:sz w:val="24"/>
-          <w:szCs w:val="24"/>
-        </w:rPr>
-        <w:t>socupação</w:t>
-      </w:r>
-      <w:r>
-        <w:rPr>
-          <w:rFonts w:ascii="Times New Roman" w:hAnsi="Times New Roman" w:cs="Times New Roman"/>
-          <w:sz w:val="24"/>
-          <w:szCs w:val="24"/>
-        </w:rPr>
-        <w:t>, um dos principais indicadores do mercado de trabalho</w:t>
-      </w:r>
-      <w:r>
-        <w:rPr>
-          <w:rFonts w:ascii="Times New Roman" w:hAnsi="Times New Roman" w:cs="Times New Roman"/>
-          <w:sz w:val="24"/>
-          <w:szCs w:val="24"/>
-        </w:rPr>
-        <w:t>, que mostra quantas pessoas estavam procurando emprego e não conseguiram econtrar</w:t>
-      </w:r>
-      <w:r>
-        <w:rPr>
-          <w:rFonts w:ascii="Times New Roman" w:hAnsi="Times New Roman" w:cs="Times New Roman"/>
-          <w:sz w:val="24"/>
-          <w:szCs w:val="24"/>
-        </w:rPr>
-        <w:t>.</w:t>
+        </w:rPr>
+      </w:pPr>
+      <w:r>
+        <w:rPr>
+          <w:rFonts w:ascii="Times New Roman" w:hAnsi="Times New Roman" w:cs="Times New Roman"/>
+          <w:sz w:val="24"/>
+          <w:szCs w:val="24"/>
+        </w:rPr>
+        <w:t>O desalento é a face do desemprego que as estatísticas convencionais não</w:t>
       </w:r>
       <w:r>
         <w:rPr>
@@ -3041,29 +3921,11 @@
           <w:sz w:val="24"/>
           <w:szCs w:val="24"/>
         </w:rPr>
-        <w:t xml:space="preserve">Além da taxa, analisamos o percentual de </w:t>
-      </w:r>
-      <w:r>
-        <w:rPr>
-          <w:rFonts w:ascii="Times New Roman" w:hAnsi="Times New Roman" w:cs="Times New Roman"/>
-          <w:sz w:val="24"/>
-          <w:szCs w:val="24"/>
-        </w:rPr>
-        <w:t xml:space="preserve">responsáveis </w:t>
-      </w:r>
-      <w:r>
-        <w:rPr>
-          <w:rFonts w:ascii="Times New Roman" w:hAnsi="Times New Roman" w:cs="Times New Roman"/>
-          <w:color w:val="FF0000"/>
-          <w:sz w:val="24"/>
-          <w:szCs w:val="24"/>
-        </w:rPr>
-        <w:t>familiares</w:t>
-      </w:r>
-      <w:r>
-        <w:rPr>
-          <w:rFonts w:ascii="Times New Roman" w:hAnsi="Times New Roman" w:cs="Times New Roman"/>
-          <w:color w:val="FF0000"/>
+        <w:t>capturam. Uma pessoa desalentada gostaria de trabalhar, está disponível para</w:t>
+      </w:r>
+      <w:r>
+        <w:rPr>
+          <w:rFonts w:ascii="Times New Roman" w:hAnsi="Times New Roman" w:cs="Times New Roman"/>
           <w:sz w:val="24"/>
           <w:szCs w:val="24"/>
         </w:rPr>
@@ -3072,35 +3934,150 @@
       <w:r>
         <w:rPr>
           <w:rFonts w:ascii="Times New Roman" w:hAnsi="Times New Roman" w:cs="Times New Roman"/>
-          <w:color w:val="FF0000"/>
-          <w:sz w:val="24"/>
-          <w:szCs w:val="24"/>
-        </w:rPr>
-        <w:t xml:space="preserve">e seus conjugues </w:t>
-      </w:r>
-      <w:r>
-        <w:rPr>
-          <w:rFonts w:ascii="Times New Roman" w:hAnsi="Times New Roman" w:cs="Times New Roman"/>
-          <w:sz w:val="24"/>
-          <w:szCs w:val="24"/>
-        </w:rPr>
-        <w:t xml:space="preserve">entre os desocupados, pois </w:t>
-      </w:r>
-      <w:r>
-        <w:rPr>
-          <w:rFonts w:ascii="Times New Roman" w:hAnsi="Times New Roman" w:cs="Times New Roman"/>
-          <w:sz w:val="24"/>
-          <w:szCs w:val="24"/>
-        </w:rPr>
-        <w:t xml:space="preserve">mostra a situação </w:t>
-      </w:r>
-      <w:r>
-        <w:rPr>
-          <w:rFonts w:ascii="Times New Roman" w:hAnsi="Times New Roman" w:cs="Times New Roman"/>
-          <w:sz w:val="24"/>
-          <w:szCs w:val="24"/>
-        </w:rPr>
-        <w:t>onde o desemprego vira um problema familiar ao afetar o orçamento doméstico.</w:t>
+          <w:sz w:val="24"/>
+          <w:szCs w:val="24"/>
+        </w:rPr>
+        <w:t>isso, mas deixou de procurar por acreditar que não encontraria vaga. Como não</w:t>
+      </w:r>
+      <w:r>
+        <w:rPr>
+          <w:rFonts w:ascii="Times New Roman" w:hAnsi="Times New Roman" w:cs="Times New Roman"/>
+          <w:sz w:val="24"/>
+          <w:szCs w:val="24"/>
+        </w:rPr>
+        <w:t xml:space="preserve"> </w:t>
+      </w:r>
+      <w:r>
+        <w:rPr>
+          <w:rFonts w:ascii="Times New Roman" w:hAnsi="Times New Roman" w:cs="Times New Roman"/>
+          <w:sz w:val="24"/>
+          <w:szCs w:val="24"/>
+        </w:rPr>
+        <w:t>procurou, não é contada como desocupada — sai da força de trabalho e some da</w:t>
+      </w:r>
+      <w:r>
+        <w:rPr>
+          <w:rFonts w:ascii="Times New Roman" w:hAnsi="Times New Roman" w:cs="Times New Roman"/>
+          <w:sz w:val="24"/>
+          <w:szCs w:val="24"/>
+        </w:rPr>
+        <w:t xml:space="preserve"> </w:t>
+      </w:r>
+      <w:r>
+        <w:rPr>
+          <w:rFonts w:ascii="Times New Roman" w:hAnsi="Times New Roman" w:cs="Times New Roman"/>
+          <w:sz w:val="24"/>
+          <w:szCs w:val="24"/>
+        </w:rPr>
+        <w:t>taxa de desocupação. É por isso que um território pode ter desemprego em queda</w:t>
+      </w:r>
+      <w:r>
+        <w:rPr>
+          <w:rFonts w:ascii="Times New Roman" w:hAnsi="Times New Roman" w:cs="Times New Roman"/>
+          <w:sz w:val="24"/>
+          <w:szCs w:val="24"/>
+        </w:rPr>
+        <w:t xml:space="preserve"> </w:t>
+      </w:r>
+      <w:r>
+        <w:rPr>
+          <w:rFonts w:ascii="Times New Roman" w:hAnsi="Times New Roman" w:cs="Times New Roman"/>
+          <w:sz w:val="24"/>
+          <w:szCs w:val="24"/>
+        </w:rPr>
+        <w:t>e mercado de trabalho piorando ao mesmo tempo.</w:t>
+      </w:r>
+      <w:r>
+        <w:rPr>
+          <w:rFonts w:ascii="Times New Roman" w:hAnsi="Times New Roman" w:cs="Times New Roman"/>
+          <w:sz w:val="24"/>
+          <w:szCs w:val="24"/>
+        </w:rPr>
+        <w:t xml:space="preserve"> Para </w:t>
+      </w:r>
+      <w:proofErr w:type="spellStart"/>
+      <w:r>
+        <w:rPr>
+          <w:rFonts w:ascii="Times New Roman" w:hAnsi="Times New Roman" w:cs="Times New Roman"/>
+          <w:sz w:val="24"/>
+          <w:szCs w:val="24"/>
+        </w:rPr>
+        <w:t>está</w:t>
+      </w:r>
+      <w:proofErr w:type="spellEnd"/>
+      <w:r>
+        <w:rPr>
+          <w:rFonts w:ascii="Times New Roman" w:hAnsi="Times New Roman" w:cs="Times New Roman"/>
+          <w:sz w:val="24"/>
+          <w:szCs w:val="24"/>
+        </w:rPr>
+        <w:t xml:space="preserve"> dimensão</w:t>
+      </w:r>
+      <w:r>
+        <w:rPr>
+          <w:rFonts w:ascii="Times New Roman" w:hAnsi="Times New Roman" w:cs="Times New Roman"/>
+          <w:sz w:val="24"/>
+          <w:szCs w:val="24"/>
+        </w:rPr>
+        <w:t xml:space="preserve">, o indicador chave é taxa de desalento, que mensura a porcentagem de pessoas em idade ativa e dispostas a trabalhar, mas que desistiram de procurar emprego de forma ativa por acharem que não vão encontrar vaga. Ele é um indicador de falta de oportunidades de trabalho na região. O primeiro indicador adicional </w:t>
+      </w:r>
+      <w:r>
+        <w:rPr>
+          <w:rFonts w:ascii="Times New Roman" w:hAnsi="Times New Roman" w:cs="Times New Roman"/>
+          <w:sz w:val="24"/>
+          <w:szCs w:val="24"/>
+        </w:rPr>
+        <w:t>é</w:t>
+      </w:r>
+      <w:r>
+        <w:rPr>
+          <w:rFonts w:ascii="Times New Roman" w:hAnsi="Times New Roman" w:cs="Times New Roman"/>
+          <w:sz w:val="24"/>
+          <w:szCs w:val="24"/>
+        </w:rPr>
+        <w:t xml:space="preserve"> o percentual de jovens nem-e-nem, que engloba pessoas de 1</w:t>
+      </w:r>
+      <w:r>
+        <w:rPr>
+          <w:rFonts w:ascii="Times New Roman" w:hAnsi="Times New Roman" w:cs="Times New Roman"/>
+          <w:sz w:val="24"/>
+          <w:szCs w:val="24"/>
+        </w:rPr>
+        <w:t>4</w:t>
+      </w:r>
+      <w:r>
+        <w:rPr>
+          <w:rFonts w:ascii="Times New Roman" w:hAnsi="Times New Roman" w:cs="Times New Roman"/>
+          <w:sz w:val="24"/>
+          <w:szCs w:val="24"/>
+        </w:rPr>
+        <w:t xml:space="preserve"> a 29 anos que nem trabalham e nem estudam.  Jovens nessa situação podem enfrentar dificuldade de inserção futura no mercado formal, precarização da renda e exclusão social. De maneira agregada, regiões com alto percentual de jovens nem-e-nem apresentam perda de potencial de crescimento econômico a longo prazo e aumento de desigualdades socias. As causas dessa condição variam desde fatores econômicos, como desemprego e falta de oportunidades, até motivos pessoais, como gravidez precoce, cuidado de familiares ou desinteresse em trabalhar ou continuar estudando. O segundo indicador extra é o motivo da pessoa não ter procurado emprego</w:t>
+      </w:r>
+      <w:proofErr w:type="gramStart"/>
+      <w:r>
+        <w:rPr>
+          <w:rFonts w:ascii="Times New Roman" w:hAnsi="Times New Roman" w:cs="Times New Roman"/>
+          <w:sz w:val="24"/>
+          <w:szCs w:val="24"/>
+        </w:rPr>
+        <w:t xml:space="preserve">. </w:t>
+      </w:r>
+      <w:r>
+        <w:rPr>
+          <w:rFonts w:ascii="Times New Roman" w:hAnsi="Times New Roman" w:cs="Times New Roman"/>
+          <w:sz w:val="24"/>
+          <w:szCs w:val="24"/>
+        </w:rPr>
+        <w:t>,</w:t>
+      </w:r>
+      <w:proofErr w:type="gramEnd"/>
+      <w:r>
+        <w:rPr>
+          <w:rFonts w:ascii="Times New Roman" w:hAnsi="Times New Roman" w:cs="Times New Roman"/>
+          <w:sz w:val="24"/>
+          <w:szCs w:val="24"/>
+        </w:rPr>
+        <w:t xml:space="preserve"> onde avaliamos se eles não buscam trabalham pois acham que não há trabalho na região, ou por falta de experiência, idade ou qualificação.</w:t>
       </w:r>
     </w:p>
     <w:p>
@@ -3118,176 +4095,23 @@
           <w:sz w:val="24"/>
           <w:szCs w:val="24"/>
         </w:rPr>
-        <w:t>Para a dimensão dos</w:t>
-      </w:r>
-      <w:r>
-        <w:rPr>
-          <w:rFonts w:ascii="Times New Roman" w:hAnsi="Times New Roman" w:cs="Times New Roman"/>
-          <w:sz w:val="24"/>
-          <w:szCs w:val="24"/>
-        </w:rPr>
-        <w:t xml:space="preserve"> rendimentos, a variável chave é o rendimento médio habitualmente recebido em todos os trabalhos</w:t>
-      </w:r>
-      <w:r>
-        <w:rPr>
-          <w:rFonts w:ascii="Times New Roman" w:hAnsi="Times New Roman" w:cs="Times New Roman"/>
-          <w:sz w:val="24"/>
-          <w:szCs w:val="24"/>
-        </w:rPr>
-        <w:t>.</w:t>
-      </w:r>
-      <w:r>
-        <w:rPr>
-          <w:rFonts w:ascii="Times New Roman" w:hAnsi="Times New Roman" w:cs="Times New Roman"/>
-          <w:sz w:val="24"/>
-          <w:szCs w:val="24"/>
-        </w:rPr>
-        <w:t xml:space="preserve"> </w:t>
-      </w:r>
-      <w:r>
-        <w:rPr>
-          <w:rFonts w:ascii="Times New Roman" w:hAnsi="Times New Roman" w:cs="Times New Roman"/>
-          <w:sz w:val="24"/>
-          <w:szCs w:val="24"/>
-        </w:rPr>
-        <w:t>E</w:t>
-      </w:r>
-      <w:r>
-        <w:rPr>
-          <w:rFonts w:ascii="Times New Roman" w:hAnsi="Times New Roman" w:cs="Times New Roman"/>
-          <w:sz w:val="24"/>
-          <w:szCs w:val="24"/>
-        </w:rPr>
-        <w:t xml:space="preserve">scolhemos a habitualmente recebida pois </w:t>
-      </w:r>
-      <w:r>
-        <w:rPr>
-          <w:rFonts w:ascii="Times New Roman" w:hAnsi="Times New Roman" w:cs="Times New Roman"/>
-          <w:sz w:val="24"/>
-          <w:szCs w:val="24"/>
-        </w:rPr>
-        <w:t>é o ganho normal e contínuo e mostra a estabilidade do ganho</w:t>
-      </w:r>
-      <w:r>
-        <w:rPr>
-          <w:rStyle w:val="Refdenotaderodap"/>
-          <w:rFonts w:ascii="Times New Roman" w:hAnsi="Times New Roman" w:cs="Times New Roman"/>
-          <w:sz w:val="24"/>
-          <w:szCs w:val="24"/>
-        </w:rPr>
-        <w:footnoteReference w:id="2"/>
-      </w:r>
-      <w:r>
-        <w:rPr>
-          <w:rFonts w:ascii="Times New Roman" w:hAnsi="Times New Roman" w:cs="Times New Roman"/>
-          <w:sz w:val="24"/>
-          <w:szCs w:val="24"/>
-        </w:rPr>
-        <w:t xml:space="preserve">. </w:t>
-      </w:r>
-      <w:r>
-        <w:rPr>
-          <w:rFonts w:ascii="Times New Roman" w:hAnsi="Times New Roman" w:cs="Times New Roman"/>
-          <w:sz w:val="24"/>
-          <w:szCs w:val="24"/>
-        </w:rPr>
-        <w:t xml:space="preserve">As variáveis </w:t>
-      </w:r>
-      <w:r>
-        <w:rPr>
-          <w:rFonts w:ascii="Times New Roman" w:hAnsi="Times New Roman" w:cs="Times New Roman"/>
-          <w:sz w:val="24"/>
-          <w:szCs w:val="24"/>
-        </w:rPr>
-        <w:t>adicionais</w:t>
-      </w:r>
-      <w:r>
-        <w:rPr>
-          <w:rFonts w:ascii="Times New Roman" w:hAnsi="Times New Roman" w:cs="Times New Roman"/>
-          <w:sz w:val="24"/>
-          <w:szCs w:val="24"/>
-        </w:rPr>
-        <w:t xml:space="preserve"> são a sub-remuneração de hora trabalhada</w:t>
-      </w:r>
-      <w:r>
-        <w:rPr>
-          <w:rFonts w:ascii="Times New Roman" w:hAnsi="Times New Roman" w:cs="Times New Roman"/>
-          <w:sz w:val="24"/>
-          <w:szCs w:val="24"/>
-        </w:rPr>
-        <w:t>s</w:t>
-      </w:r>
-      <w:r>
-        <w:rPr>
-          <w:rFonts w:ascii="Times New Roman" w:hAnsi="Times New Roman" w:cs="Times New Roman"/>
-          <w:sz w:val="24"/>
-          <w:szCs w:val="24"/>
-        </w:rPr>
-        <w:t xml:space="preserve"> – </w:t>
-      </w:r>
-      <w:r>
-        <w:rPr>
-          <w:rFonts w:ascii="Times New Roman" w:hAnsi="Times New Roman" w:cs="Times New Roman"/>
-          <w:sz w:val="24"/>
-          <w:szCs w:val="24"/>
-        </w:rPr>
-        <w:t>ela captura trabalhadores em situação de precariedade, pois trabalham por menos do que o piso legal equivalente</w:t>
-      </w:r>
-      <w:r>
-        <w:rPr>
-          <w:rFonts w:ascii="Times New Roman" w:hAnsi="Times New Roman" w:cs="Times New Roman"/>
-          <w:sz w:val="24"/>
-          <w:szCs w:val="24"/>
-        </w:rPr>
-        <w:t>. Já para a desigualdade de rendimentos no mercado de trabalho, optou-se pela relação entre a remuneração d</w:t>
-      </w:r>
-      <w:r>
-        <w:rPr>
-          <w:rFonts w:ascii="Times New Roman" w:hAnsi="Times New Roman" w:cs="Times New Roman"/>
-          <w:sz w:val="24"/>
-          <w:szCs w:val="24"/>
-        </w:rPr>
-        <w:t>os ocupados</w:t>
-      </w:r>
-      <w:r>
-        <w:rPr>
-          <w:rFonts w:ascii="Times New Roman" w:hAnsi="Times New Roman" w:cs="Times New Roman"/>
-          <w:sz w:val="24"/>
-          <w:szCs w:val="24"/>
-        </w:rPr>
-        <w:t xml:space="preserve"> formais e </w:t>
-      </w:r>
-      <w:r>
-        <w:rPr>
-          <w:rFonts w:ascii="Times New Roman" w:hAnsi="Times New Roman" w:cs="Times New Roman"/>
-          <w:sz w:val="24"/>
-          <w:szCs w:val="24"/>
-        </w:rPr>
-        <w:t xml:space="preserve">dos </w:t>
-      </w:r>
-      <w:r>
-        <w:rPr>
-          <w:rFonts w:ascii="Times New Roman" w:hAnsi="Times New Roman" w:cs="Times New Roman"/>
-          <w:sz w:val="24"/>
-          <w:szCs w:val="24"/>
-        </w:rPr>
-        <w:t xml:space="preserve">informais para avaliar </w:t>
-      </w:r>
-      <w:r>
-        <w:rPr>
-          <w:rFonts w:ascii="Times New Roman" w:hAnsi="Times New Roman" w:cs="Times New Roman"/>
-          <w:sz w:val="24"/>
-          <w:szCs w:val="24"/>
-        </w:rPr>
-        <w:t>o efeito da formalidade nos rendimentos do mercado de trabalho</w:t>
-      </w:r>
-      <w:r>
-        <w:rPr>
-          <w:rFonts w:ascii="Times New Roman" w:hAnsi="Times New Roman" w:cs="Times New Roman"/>
-          <w:sz w:val="24"/>
-          <w:szCs w:val="24"/>
-        </w:rPr>
-        <w:t>.</w:t>
+        <w:t>Definido as dimensões econômicas e as variáveis selecionadas vamos definir os recortes geográficos que irem</w:t>
+      </w:r>
+      <w:r>
+        <w:rPr>
+          <w:rFonts w:ascii="Times New Roman" w:hAnsi="Times New Roman" w:cs="Times New Roman"/>
+          <w:sz w:val="24"/>
+          <w:szCs w:val="24"/>
+        </w:rPr>
+        <w:t>os</w:t>
+      </w:r>
+      <w:r>
+        <w:rPr>
+          <w:rFonts w:ascii="Times New Roman" w:hAnsi="Times New Roman" w:cs="Times New Roman"/>
+          <w:sz w:val="24"/>
+          <w:szCs w:val="24"/>
+        </w:rPr>
+        <w:t xml:space="preserve"> comparar.</w:t>
       </w:r>
     </w:p>
     <w:p>
@@ -3295,219 +4119,41 @@
         <w:jc w:val="both"/>
         <w:rPr>
           <w:rFonts w:ascii="Times New Roman" w:hAnsi="Times New Roman" w:cs="Times New Roman"/>
-          <w:sz w:val="24"/>
-          <w:szCs w:val="24"/>
-        </w:rPr>
-      </w:pPr>
-      <w:r>
-        <w:rPr>
-          <w:rFonts w:ascii="Times New Roman" w:hAnsi="Times New Roman" w:cs="Times New Roman"/>
-          <w:sz w:val="24"/>
-          <w:szCs w:val="24"/>
-        </w:rPr>
-        <w:t>Para a dimensão da inserção no mercado de trabalho</w:t>
-      </w:r>
-      <w:r>
-        <w:rPr>
-          <w:rFonts w:ascii="Times New Roman" w:hAnsi="Times New Roman" w:cs="Times New Roman"/>
-          <w:sz w:val="24"/>
-          <w:szCs w:val="24"/>
-        </w:rPr>
-        <w:t>, examinando a qualidade do vínculo empregatício</w:t>
-      </w:r>
-      <w:r>
-        <w:rPr>
-          <w:rFonts w:ascii="Times New Roman" w:hAnsi="Times New Roman" w:cs="Times New Roman"/>
-          <w:sz w:val="24"/>
-          <w:szCs w:val="24"/>
-        </w:rPr>
-        <w:t>. O indicador chave é a taxa de informalidade</w:t>
-      </w:r>
-      <w:r>
-        <w:rPr>
-          <w:rStyle w:val="Refdenotaderodap"/>
-          <w:rFonts w:ascii="Times New Roman" w:hAnsi="Times New Roman" w:cs="Times New Roman"/>
-          <w:sz w:val="24"/>
-          <w:szCs w:val="24"/>
-        </w:rPr>
-        <w:footnoteReference w:id="3"/>
-      </w:r>
-      <w:r>
-        <w:rPr>
-          <w:rFonts w:ascii="Times New Roman" w:hAnsi="Times New Roman" w:cs="Times New Roman"/>
-          <w:sz w:val="24"/>
-          <w:szCs w:val="24"/>
-        </w:rPr>
-        <w:t>,</w:t>
-      </w:r>
-      <w:r>
-        <w:rPr>
-          <w:rFonts w:ascii="Times New Roman" w:hAnsi="Times New Roman" w:cs="Times New Roman"/>
-          <w:sz w:val="24"/>
-          <w:szCs w:val="24"/>
-        </w:rPr>
-        <w:t xml:space="preserve"> que mostra o percentual da população mais vulnerável e/ou em situações precárias de trabalho</w:t>
-      </w:r>
-      <w:r>
-        <w:rPr>
-          <w:rFonts w:ascii="Times New Roman" w:hAnsi="Times New Roman" w:cs="Times New Roman"/>
-          <w:sz w:val="24"/>
-          <w:szCs w:val="24"/>
-        </w:rPr>
-        <w:t xml:space="preserve"> e sem acesso a </w:t>
-      </w:r>
-      <w:r>
-        <w:rPr>
-          <w:rFonts w:ascii="Times New Roman" w:hAnsi="Times New Roman" w:cs="Times New Roman"/>
-          <w:sz w:val="24"/>
-          <w:szCs w:val="24"/>
-        </w:rPr>
-        <w:t xml:space="preserve">previdência, seguro-desemprego, licenças e </w:t>
-      </w:r>
-      <w:r>
-        <w:rPr>
-          <w:rFonts w:ascii="Times New Roman" w:hAnsi="Times New Roman" w:cs="Times New Roman"/>
-          <w:sz w:val="24"/>
-          <w:szCs w:val="24"/>
-        </w:rPr>
-        <w:t xml:space="preserve">menos </w:t>
-      </w:r>
-      <w:r>
-        <w:rPr>
-          <w:rFonts w:ascii="Times New Roman" w:hAnsi="Times New Roman" w:cs="Times New Roman"/>
-          <w:sz w:val="24"/>
-          <w:szCs w:val="24"/>
-        </w:rPr>
-        <w:t>estabilidade</w:t>
-      </w:r>
-      <w:r>
-        <w:rPr>
-          <w:rFonts w:ascii="Times New Roman" w:hAnsi="Times New Roman" w:cs="Times New Roman"/>
-          <w:sz w:val="24"/>
-          <w:szCs w:val="24"/>
-        </w:rPr>
-        <w:t>.</w:t>
-      </w:r>
-      <w:r>
-        <w:rPr>
-          <w:rFonts w:ascii="Times New Roman" w:hAnsi="Times New Roman" w:cs="Times New Roman"/>
-          <w:sz w:val="24"/>
-          <w:szCs w:val="24"/>
-        </w:rPr>
-        <w:t xml:space="preserve"> Os indicadores adicionais são a sub-ocupação </w:t>
-      </w:r>
-      <w:r>
-        <w:rPr>
-          <w:rFonts w:ascii="Times New Roman" w:hAnsi="Times New Roman" w:cs="Times New Roman"/>
-          <w:sz w:val="24"/>
-          <w:szCs w:val="24"/>
-        </w:rPr>
-        <w:t xml:space="preserve">por insuficiência de horas trabalhadas, que mostra o percentual de </w:t>
-      </w:r>
-      <w:r>
-        <w:rPr>
-          <w:rFonts w:ascii="Times New Roman" w:hAnsi="Times New Roman" w:cs="Times New Roman"/>
-          <w:sz w:val="24"/>
-          <w:szCs w:val="24"/>
-        </w:rPr>
-        <w:t>ocupados que trabalharam menos</w:t>
-      </w:r>
-      <w:r>
-        <w:rPr>
-          <w:rFonts w:ascii="Times New Roman" w:hAnsi="Times New Roman" w:cs="Times New Roman"/>
-          <w:sz w:val="24"/>
-          <w:szCs w:val="24"/>
-        </w:rPr>
-        <w:t xml:space="preserve"> de 4</w:t>
-      </w:r>
-      <w:r>
-        <w:rPr>
-          <w:rFonts w:ascii="Times New Roman" w:hAnsi="Times New Roman" w:cs="Times New Roman"/>
-          <w:sz w:val="24"/>
-          <w:szCs w:val="24"/>
-        </w:rPr>
-        <w:t>0</w:t>
-      </w:r>
-      <w:r>
-        <w:rPr>
-          <w:rFonts w:ascii="Times New Roman" w:hAnsi="Times New Roman" w:cs="Times New Roman"/>
-          <w:sz w:val="24"/>
-          <w:szCs w:val="24"/>
-        </w:rPr>
-        <w:t xml:space="preserve"> horas semanais dispostos a trabalhar mais</w:t>
-      </w:r>
-      <w:r>
-        <w:rPr>
-          <w:rFonts w:ascii="Times New Roman" w:hAnsi="Times New Roman" w:cs="Times New Roman"/>
-          <w:sz w:val="24"/>
-          <w:szCs w:val="24"/>
-        </w:rPr>
-        <w:t>, indicado sub-utilização da mão-de-bra disponível</w:t>
-      </w:r>
-      <w:r>
-        <w:rPr>
-          <w:rFonts w:ascii="Times New Roman" w:hAnsi="Times New Roman" w:cs="Times New Roman"/>
-          <w:sz w:val="24"/>
-          <w:szCs w:val="24"/>
-        </w:rPr>
-        <w:t xml:space="preserve">. Por fim, considera-se o percentual de ocupados com </w:t>
-      </w:r>
-      <w:r>
-        <w:rPr>
-          <w:rFonts w:ascii="Times New Roman" w:hAnsi="Times New Roman" w:cs="Times New Roman"/>
-          <w:sz w:val="24"/>
-          <w:szCs w:val="24"/>
-        </w:rPr>
-        <w:t>pelo</w:t>
-      </w:r>
-      <w:r>
-        <w:rPr>
-          <w:rFonts w:ascii="Times New Roman" w:hAnsi="Times New Roman" w:cs="Times New Roman"/>
-          <w:sz w:val="24"/>
-          <w:szCs w:val="24"/>
-        </w:rPr>
-        <w:t xml:space="preserve"> menos ensino médio completo como medida de mão </w:t>
-      </w:r>
-      <w:r>
-        <w:rPr>
-          <w:rFonts w:ascii="Times New Roman" w:hAnsi="Times New Roman" w:cs="Times New Roman"/>
-          <w:sz w:val="24"/>
-          <w:szCs w:val="24"/>
-        </w:rPr>
-        <w:lastRenderedPageBreak/>
-        <w:t>de obra com maior produtividade no mercado</w:t>
-      </w:r>
-      <w:r>
-        <w:rPr>
-          <w:rFonts w:ascii="Times New Roman" w:hAnsi="Times New Roman" w:cs="Times New Roman"/>
-          <w:sz w:val="24"/>
-          <w:szCs w:val="24"/>
-        </w:rPr>
-        <w:t xml:space="preserve"> e, indiretamente, </w:t>
-      </w:r>
-      <w:r>
-        <w:rPr>
-          <w:rFonts w:ascii="Times New Roman" w:hAnsi="Times New Roman" w:cs="Times New Roman"/>
-          <w:sz w:val="24"/>
-          <w:szCs w:val="24"/>
-        </w:rPr>
-        <w:t>do tipo</w:t>
-      </w:r>
-      <w:r>
-        <w:rPr>
-          <w:rFonts w:ascii="Times New Roman" w:hAnsi="Times New Roman" w:cs="Times New Roman"/>
-          <w:sz w:val="24"/>
-          <w:szCs w:val="24"/>
-        </w:rPr>
-        <w:t xml:space="preserve"> </w:t>
-      </w:r>
-      <w:r>
-        <w:rPr>
-          <w:rFonts w:ascii="Times New Roman" w:hAnsi="Times New Roman" w:cs="Times New Roman"/>
-          <w:sz w:val="24"/>
-          <w:szCs w:val="24"/>
-        </w:rPr>
-        <w:t>de posto de trabalho que cada território oferece.</w:t>
+          <w:b/>
+          <w:bCs/>
+          <w:sz w:val="24"/>
+          <w:szCs w:val="24"/>
+        </w:rPr>
+      </w:pPr>
+      <w:r>
+        <w:rPr>
+          <w:rFonts w:ascii="Times New Roman" w:hAnsi="Times New Roman" w:cs="Times New Roman"/>
+          <w:b/>
+          <w:bCs/>
+          <w:sz w:val="24"/>
+          <w:szCs w:val="24"/>
+        </w:rPr>
+        <w:t xml:space="preserve">2.2. </w:t>
+      </w:r>
+      <w:r>
+        <w:rPr>
+          <w:rFonts w:ascii="Times New Roman" w:hAnsi="Times New Roman" w:cs="Times New Roman"/>
+          <w:b/>
+          <w:bCs/>
+          <w:sz w:val="24"/>
+          <w:szCs w:val="24"/>
+        </w:rPr>
+        <w:t>Recortes</w:t>
+      </w:r>
+      <w:r>
+        <w:rPr>
+          <w:rFonts w:ascii="Times New Roman" w:hAnsi="Times New Roman" w:cs="Times New Roman"/>
+          <w:b/>
+          <w:bCs/>
+          <w:sz w:val="24"/>
+          <w:szCs w:val="24"/>
+        </w:rPr>
+        <w:t xml:space="preserve"> geográficos </w:t>
       </w:r>
     </w:p>
     <w:p>
@@ -3519,6 +4165,38 @@
           <w:szCs w:val="24"/>
         </w:rPr>
       </w:pPr>
+      <w:r>
+        <w:rPr>
+          <w:rFonts w:ascii="Times New Roman" w:hAnsi="Times New Roman" w:cs="Times New Roman"/>
+          <w:sz w:val="24"/>
+          <w:szCs w:val="24"/>
+        </w:rPr>
+        <w:t xml:space="preserve">Os recortes mais agregados que utilizaremos incluem o Brasil, o Nordeste e o Piauí. Esses três níveis já são utilizamos no relatório trimestral da PNADC e são aqui reutilizados pois põe em perspectiva o resultado de todos os recortes. Contra esses níveis vamos comparar </w:t>
+      </w:r>
+      <w:r>
+        <w:rPr>
+          <w:rFonts w:ascii="Times New Roman" w:hAnsi="Times New Roman" w:cs="Times New Roman"/>
+          <w:sz w:val="24"/>
+          <w:szCs w:val="24"/>
+        </w:rPr>
+        <w:t xml:space="preserve">principalmente </w:t>
+      </w:r>
+      <w:r>
+        <w:rPr>
+          <w:rFonts w:ascii="Times New Roman" w:hAnsi="Times New Roman" w:cs="Times New Roman"/>
+          <w:sz w:val="24"/>
+          <w:szCs w:val="24"/>
+        </w:rPr>
+        <w:t xml:space="preserve">o desempenho de Teresina, de forma análoga </w:t>
+      </w:r>
+      <w:r>
+        <w:rPr>
+          <w:rFonts w:ascii="Times New Roman" w:hAnsi="Times New Roman" w:cs="Times New Roman"/>
+          <w:sz w:val="24"/>
+          <w:szCs w:val="24"/>
+        </w:rPr>
+        <w:t xml:space="preserve">ao já realizada na introdução. </w:t>
+      </w:r>
     </w:p>
     <w:p>
       <w:pPr>
@@ -3535,7 +4213,23 @@
           <w:sz w:val="24"/>
           <w:szCs w:val="24"/>
         </w:rPr>
-        <w:t>O desalento é a face do desemprego que as estatísticas convencionais não</w:t>
+        <w:t>Dentro do Piauí, serão feitos</w:t>
+      </w:r>
+      <w:r>
+        <w:rPr>
+          <w:rFonts w:ascii="Times New Roman" w:hAnsi="Times New Roman" w:cs="Times New Roman"/>
+          <w:sz w:val="24"/>
+          <w:szCs w:val="24"/>
+        </w:rPr>
+        <w:t xml:space="preserve"> quatro</w:t>
+      </w:r>
+      <w:r>
+        <w:rPr>
+          <w:rFonts w:ascii="Times New Roman" w:hAnsi="Times New Roman" w:cs="Times New Roman"/>
+          <w:sz w:val="24"/>
+          <w:szCs w:val="24"/>
+        </w:rPr>
+        <w:t xml:space="preserve"> recortes geográficos.</w:t>
       </w:r>
       <w:r>
         <w:rPr>
@@ -3551,127 +4245,23 @@
           <w:sz w:val="24"/>
           <w:szCs w:val="24"/>
         </w:rPr>
-        <w:t>capturam. Uma pessoa desalentada gostaria de trabalhar, está disponível para</w:t>
-      </w:r>
-      <w:r>
-        <w:rPr>
-          <w:rFonts w:ascii="Times New Roman" w:hAnsi="Times New Roman" w:cs="Times New Roman"/>
-          <w:sz w:val="24"/>
-          <w:szCs w:val="24"/>
-        </w:rPr>
-        <w:t xml:space="preserve"> </w:t>
-      </w:r>
-      <w:r>
-        <w:rPr>
-          <w:rFonts w:ascii="Times New Roman" w:hAnsi="Times New Roman" w:cs="Times New Roman"/>
-          <w:sz w:val="24"/>
-          <w:szCs w:val="24"/>
-        </w:rPr>
-        <w:t>isso, mas deixou de procurar por acreditar que não encontraria vaga. Como não</w:t>
-      </w:r>
-      <w:r>
-        <w:rPr>
-          <w:rFonts w:ascii="Times New Roman" w:hAnsi="Times New Roman" w:cs="Times New Roman"/>
-          <w:sz w:val="24"/>
-          <w:szCs w:val="24"/>
-        </w:rPr>
-        <w:t xml:space="preserve"> </w:t>
-      </w:r>
-      <w:r>
-        <w:rPr>
-          <w:rFonts w:ascii="Times New Roman" w:hAnsi="Times New Roman" w:cs="Times New Roman"/>
-          <w:sz w:val="24"/>
-          <w:szCs w:val="24"/>
-        </w:rPr>
-        <w:t>procurou, não é contada como desocupada — sai da força de trabalho e some da</w:t>
-      </w:r>
-      <w:r>
-        <w:rPr>
-          <w:rFonts w:ascii="Times New Roman" w:hAnsi="Times New Roman" w:cs="Times New Roman"/>
-          <w:sz w:val="24"/>
-          <w:szCs w:val="24"/>
-        </w:rPr>
-        <w:t xml:space="preserve"> </w:t>
-      </w:r>
-      <w:r>
-        <w:rPr>
-          <w:rFonts w:ascii="Times New Roman" w:hAnsi="Times New Roman" w:cs="Times New Roman"/>
-          <w:sz w:val="24"/>
-          <w:szCs w:val="24"/>
-        </w:rPr>
-        <w:t>taxa de desocupação. É por isso que um território pode ter desemprego em queda</w:t>
-      </w:r>
-      <w:r>
-        <w:rPr>
-          <w:rFonts w:ascii="Times New Roman" w:hAnsi="Times New Roman" w:cs="Times New Roman"/>
-          <w:sz w:val="24"/>
-          <w:szCs w:val="24"/>
-        </w:rPr>
-        <w:t xml:space="preserve"> </w:t>
-      </w:r>
-      <w:r>
-        <w:rPr>
-          <w:rFonts w:ascii="Times New Roman" w:hAnsi="Times New Roman" w:cs="Times New Roman"/>
-          <w:sz w:val="24"/>
-          <w:szCs w:val="24"/>
-        </w:rPr>
-        <w:t>e mercado de trabalho piorando ao mesmo tempo.</w:t>
-      </w:r>
-      <w:r>
-        <w:rPr>
-          <w:rFonts w:ascii="Times New Roman" w:hAnsi="Times New Roman" w:cs="Times New Roman"/>
-          <w:sz w:val="24"/>
-          <w:szCs w:val="24"/>
-        </w:rPr>
-        <w:t xml:space="preserve"> Para está dimensão</w:t>
-      </w:r>
-      <w:r>
-        <w:rPr>
-          <w:rFonts w:ascii="Times New Roman" w:hAnsi="Times New Roman" w:cs="Times New Roman"/>
-          <w:sz w:val="24"/>
-          <w:szCs w:val="24"/>
-        </w:rPr>
-        <w:t xml:space="preserve">, o indicador chave é taxa de desalento, que mensura a porcentagem de pessoas em idade ativa e dispostas a trabalhar, mas que desistiram de procurar emprego de forma ativa por acharem que não vão encontrar vaga. Ele é um indicador de falta de oportunidades de trabalho na região. O primeiro indicador adicional </w:t>
-      </w:r>
-      <w:r>
-        <w:rPr>
-          <w:rFonts w:ascii="Times New Roman" w:hAnsi="Times New Roman" w:cs="Times New Roman"/>
-          <w:sz w:val="24"/>
-          <w:szCs w:val="24"/>
-        </w:rPr>
-        <w:t>é</w:t>
-      </w:r>
-      <w:r>
-        <w:rPr>
-          <w:rFonts w:ascii="Times New Roman" w:hAnsi="Times New Roman" w:cs="Times New Roman"/>
-          <w:sz w:val="24"/>
-          <w:szCs w:val="24"/>
-        </w:rPr>
-        <w:t xml:space="preserve"> o percentual de jovens nem-e-nem, que engloba pessoas de 1</w:t>
-      </w:r>
-      <w:r>
-        <w:rPr>
-          <w:rFonts w:ascii="Times New Roman" w:hAnsi="Times New Roman" w:cs="Times New Roman"/>
-          <w:sz w:val="24"/>
-          <w:szCs w:val="24"/>
-        </w:rPr>
-        <w:t>4</w:t>
-      </w:r>
-      <w:r>
-        <w:rPr>
-          <w:rFonts w:ascii="Times New Roman" w:hAnsi="Times New Roman" w:cs="Times New Roman"/>
-          <w:sz w:val="24"/>
-          <w:szCs w:val="24"/>
-        </w:rPr>
-        <w:t xml:space="preserve"> a 29 anos que nem trabalham e nem estudam.  Jovens nessa situação podem enfrentar dificuldade de inserção futura no mercado formal, precarização da renda e exclusão social. De maneira agregada, regiões com alto percentual de jovens nem-e-nem apresentam perda de potencial de crescimento econômico a longo prazo e aumento de desigualdades socias. As causas dessa condição variam desde fatores econômicos, como desemprego e falta de oportunidades, até motivos pessoais, como gravidez precoce, cuidado de familiares ou desinteresse em trabalhar ou continuar estudando. O segundo indicador extra é o motivo da pessoa não ter procurado emprego. </w:t>
-      </w:r>
-      <w:r>
-        <w:rPr>
-          <w:rFonts w:ascii="Times New Roman" w:hAnsi="Times New Roman" w:cs="Times New Roman"/>
-          <w:sz w:val="24"/>
-          <w:szCs w:val="24"/>
-        </w:rPr>
-        <w:t>, onde avaliamos se eles não buscam trabalham pois acham que não há trabalho na região, ou por falta de experiência, idade ou qualificação.</w:t>
+        <w:t>No</w:t>
+      </w:r>
+      <w:r>
+        <w:rPr>
+          <w:rFonts w:ascii="Times New Roman" w:hAnsi="Times New Roman" w:cs="Times New Roman"/>
+          <w:sz w:val="24"/>
+          <w:szCs w:val="24"/>
+        </w:rPr>
+        <w:t xml:space="preserve"> primeiro, compararemos zona urbana e zona rural. Esse recorte não é nenhuma novidade em comparação as outras, mas serve ao propósito de elucidar mais ainda as diferenças </w:t>
+      </w:r>
+      <w:r>
+        <w:rPr>
+          <w:rFonts w:ascii="Times New Roman" w:hAnsi="Times New Roman" w:cs="Times New Roman"/>
+          <w:sz w:val="24"/>
+          <w:szCs w:val="24"/>
+        </w:rPr>
+        <w:t>econômicas entre os tipos de áreas.</w:t>
       </w:r>
     </w:p>
     <w:p>
@@ -3689,23 +4279,235 @@
           <w:sz w:val="24"/>
           <w:szCs w:val="24"/>
         </w:rPr>
-        <w:t>Definido as dimensões econômicas e as variáveis selecionadas vamos definir os recortes geográficos que irem</w:t>
-      </w:r>
-      <w:r>
-        <w:rPr>
-          <w:rFonts w:ascii="Times New Roman" w:hAnsi="Times New Roman" w:cs="Times New Roman"/>
-          <w:sz w:val="24"/>
-          <w:szCs w:val="24"/>
-        </w:rPr>
-        <w:t>os</w:t>
-      </w:r>
-      <w:r>
-        <w:rPr>
-          <w:rFonts w:ascii="Times New Roman" w:hAnsi="Times New Roman" w:cs="Times New Roman"/>
-          <w:sz w:val="24"/>
-          <w:szCs w:val="24"/>
-        </w:rPr>
-        <w:t xml:space="preserve"> comparar.</w:t>
+        <w:t>O segundo recorte é feito conforme a área administrativa,</w:t>
+      </w:r>
+      <w:r>
+        <w:rPr>
+          <w:rFonts w:ascii="Times New Roman" w:hAnsi="Times New Roman" w:cs="Times New Roman"/>
+          <w:sz w:val="24"/>
+          <w:szCs w:val="24"/>
+        </w:rPr>
+        <w:t xml:space="preserve"> que </w:t>
+      </w:r>
+      <w:r>
+        <w:rPr>
+          <w:rFonts w:ascii="Times New Roman" w:hAnsi="Times New Roman" w:cs="Times New Roman"/>
+          <w:sz w:val="24"/>
+          <w:szCs w:val="24"/>
+        </w:rPr>
+        <w:t>quatro</w:t>
+      </w:r>
+      <w:r>
+        <w:rPr>
+          <w:rFonts w:ascii="Times New Roman" w:hAnsi="Times New Roman" w:cs="Times New Roman"/>
+          <w:sz w:val="24"/>
+          <w:szCs w:val="24"/>
+        </w:rPr>
+        <w:t xml:space="preserve"> estratos: </w:t>
+      </w:r>
+      <w:r>
+        <w:rPr>
+          <w:rFonts w:ascii="Times New Roman" w:hAnsi="Times New Roman" w:cs="Times New Roman"/>
+          <w:sz w:val="24"/>
+          <w:szCs w:val="24"/>
+        </w:rPr>
+        <w:t>a capital</w:t>
+      </w:r>
+      <w:r>
+        <w:rPr>
+          <w:rFonts w:ascii="Times New Roman" w:hAnsi="Times New Roman" w:cs="Times New Roman"/>
+          <w:sz w:val="24"/>
+          <w:szCs w:val="24"/>
+        </w:rPr>
+        <w:t xml:space="preserve">; </w:t>
+      </w:r>
+      <w:r>
+        <w:rPr>
+          <w:rFonts w:ascii="Times New Roman" w:hAnsi="Times New Roman" w:cs="Times New Roman"/>
+          <w:sz w:val="24"/>
+          <w:szCs w:val="24"/>
+        </w:rPr>
+        <w:t>o resto da</w:t>
+      </w:r>
+      <w:r>
+        <w:rPr>
+          <w:rFonts w:ascii="Times New Roman" w:hAnsi="Times New Roman" w:cs="Times New Roman"/>
+          <w:sz w:val="24"/>
+          <w:szCs w:val="24"/>
+        </w:rPr>
+        <w:t xml:space="preserve"> Região Metropolitana (RM)</w:t>
+      </w:r>
+      <w:r>
+        <w:rPr>
+          <w:rFonts w:ascii="Times New Roman" w:hAnsi="Times New Roman" w:cs="Times New Roman"/>
+          <w:sz w:val="24"/>
+          <w:szCs w:val="24"/>
+        </w:rPr>
+        <w:t>, excluindo a capital;</w:t>
+      </w:r>
+      <w:r>
+        <w:rPr>
+          <w:rFonts w:ascii="Times New Roman" w:hAnsi="Times New Roman" w:cs="Times New Roman"/>
+          <w:sz w:val="24"/>
+          <w:szCs w:val="24"/>
+        </w:rPr>
+        <w:t xml:space="preserve"> </w:t>
+      </w:r>
+      <w:r>
+        <w:rPr>
+          <w:rFonts w:ascii="Times New Roman" w:hAnsi="Times New Roman" w:cs="Times New Roman"/>
+          <w:sz w:val="24"/>
+          <w:szCs w:val="24"/>
+        </w:rPr>
+        <w:t xml:space="preserve">o resto da </w:t>
+      </w:r>
+      <w:r>
+        <w:rPr>
+          <w:rFonts w:ascii="Times New Roman" w:hAnsi="Times New Roman" w:cs="Times New Roman"/>
+          <w:sz w:val="24"/>
+          <w:szCs w:val="24"/>
+        </w:rPr>
+        <w:t>Região Integrada de Desenvolvimento Econômico (RIDE)</w:t>
+      </w:r>
+      <w:r>
+        <w:rPr>
+          <w:rFonts w:ascii="Times New Roman" w:hAnsi="Times New Roman" w:cs="Times New Roman"/>
+          <w:sz w:val="24"/>
+          <w:szCs w:val="24"/>
+        </w:rPr>
+        <w:t xml:space="preserve">, excluindo a </w:t>
+      </w:r>
+      <w:r>
+        <w:rPr>
+          <w:rFonts w:ascii="Times New Roman" w:hAnsi="Times New Roman" w:cs="Times New Roman"/>
+          <w:sz w:val="24"/>
+          <w:szCs w:val="24"/>
+        </w:rPr>
+        <w:t>Capital</w:t>
+      </w:r>
+      <w:r>
+        <w:rPr>
+          <w:rFonts w:ascii="Times New Roman" w:hAnsi="Times New Roman" w:cs="Times New Roman"/>
+          <w:sz w:val="24"/>
+          <w:szCs w:val="24"/>
+        </w:rPr>
+        <w:t>, e</w:t>
+      </w:r>
+      <w:r>
+        <w:rPr>
+          <w:rFonts w:ascii="Times New Roman" w:hAnsi="Times New Roman" w:cs="Times New Roman"/>
+          <w:sz w:val="24"/>
+          <w:szCs w:val="24"/>
+        </w:rPr>
+        <w:t>;</w:t>
+      </w:r>
+      <w:r>
+        <w:rPr>
+          <w:rFonts w:ascii="Times New Roman" w:hAnsi="Times New Roman" w:cs="Times New Roman"/>
+          <w:sz w:val="24"/>
+          <w:szCs w:val="24"/>
+        </w:rPr>
+        <w:t xml:space="preserve"> </w:t>
+      </w:r>
+      <w:r>
+        <w:rPr>
+          <w:rFonts w:ascii="Times New Roman" w:hAnsi="Times New Roman" w:cs="Times New Roman"/>
+          <w:sz w:val="24"/>
+          <w:szCs w:val="24"/>
+        </w:rPr>
+        <w:t xml:space="preserve">o resto da UF, excluindo a região metropolitana e a </w:t>
+      </w:r>
+      <w:r>
+        <w:rPr>
+          <w:rFonts w:ascii="Times New Roman" w:hAnsi="Times New Roman" w:cs="Times New Roman"/>
+          <w:sz w:val="24"/>
+          <w:szCs w:val="24"/>
+        </w:rPr>
+        <w:t>RIDE</w:t>
+      </w:r>
+      <w:r>
+        <w:rPr>
+          <w:rFonts w:ascii="Times New Roman" w:hAnsi="Times New Roman" w:cs="Times New Roman"/>
+          <w:sz w:val="24"/>
+          <w:szCs w:val="24"/>
+        </w:rPr>
+        <w:t>.</w:t>
+      </w:r>
+      <w:r>
+        <w:rPr>
+          <w:rFonts w:ascii="Times New Roman" w:hAnsi="Times New Roman" w:cs="Times New Roman"/>
+          <w:sz w:val="24"/>
+          <w:szCs w:val="24"/>
+        </w:rPr>
+        <w:t xml:space="preserve"> Esse estrato já vem definido dentro dos </w:t>
+      </w:r>
+      <w:proofErr w:type="spellStart"/>
+      <w:r>
+        <w:rPr>
+          <w:rFonts w:ascii="Times New Roman" w:hAnsi="Times New Roman" w:cs="Times New Roman"/>
+          <w:sz w:val="24"/>
+          <w:szCs w:val="24"/>
+        </w:rPr>
+        <w:t>micr</w:t>
+      </w:r>
+      <w:r>
+        <w:rPr>
+          <w:rFonts w:ascii="Times New Roman" w:hAnsi="Times New Roman" w:cs="Times New Roman"/>
+          <w:sz w:val="24"/>
+          <w:szCs w:val="24"/>
+        </w:rPr>
+        <w:t>o</w:t>
+      </w:r>
+      <w:r>
+        <w:rPr>
+          <w:rFonts w:ascii="Times New Roman" w:hAnsi="Times New Roman" w:cs="Times New Roman"/>
+          <w:sz w:val="24"/>
+          <w:szCs w:val="24"/>
+        </w:rPr>
+        <w:t>dados</w:t>
+      </w:r>
+      <w:proofErr w:type="spellEnd"/>
+      <w:r>
+        <w:rPr>
+          <w:rFonts w:ascii="Times New Roman" w:hAnsi="Times New Roman" w:cs="Times New Roman"/>
+          <w:sz w:val="24"/>
+          <w:szCs w:val="24"/>
+        </w:rPr>
+        <w:t xml:space="preserve">, e gradualmente exclui a capital em seu </w:t>
+      </w:r>
+      <w:r>
+        <w:rPr>
+          <w:rFonts w:ascii="Times New Roman" w:hAnsi="Times New Roman" w:cs="Times New Roman"/>
+          <w:sz w:val="24"/>
+          <w:szCs w:val="24"/>
+        </w:rPr>
+        <w:t xml:space="preserve">entrono </w:t>
+      </w:r>
+      <w:proofErr w:type="gramStart"/>
+      <w:r>
+        <w:rPr>
+          <w:rFonts w:ascii="Times New Roman" w:hAnsi="Times New Roman" w:cs="Times New Roman"/>
+          <w:sz w:val="24"/>
+          <w:szCs w:val="24"/>
+        </w:rPr>
+        <w:t>a</w:t>
+      </w:r>
+      <w:proofErr w:type="gramEnd"/>
+      <w:r>
+        <w:rPr>
+          <w:rFonts w:ascii="Times New Roman" w:hAnsi="Times New Roman" w:cs="Times New Roman"/>
+          <w:sz w:val="24"/>
+          <w:szCs w:val="24"/>
+        </w:rPr>
+        <w:t xml:space="preserve"> medida que avança no estrato</w:t>
+      </w:r>
+      <w:r>
+        <w:rPr>
+          <w:rFonts w:ascii="Times New Roman" w:hAnsi="Times New Roman" w:cs="Times New Roman"/>
+          <w:sz w:val="24"/>
+          <w:szCs w:val="24"/>
+        </w:rPr>
+        <w:t>, o que nos permite analisar como a proximidade a capital impacta nos indicadores.</w:t>
       </w:r>
     </w:p>
     <w:p>
@@ -3713,41 +4515,58 @@
         <w:jc w:val="both"/>
         <w:rPr>
           <w:rFonts w:ascii="Times New Roman" w:hAnsi="Times New Roman" w:cs="Times New Roman"/>
-          <w:b/>
-          <w:bCs/>
-          <w:sz w:val="24"/>
-          <w:szCs w:val="24"/>
-        </w:rPr>
-      </w:pPr>
-      <w:r>
-        <w:rPr>
-          <w:rFonts w:ascii="Times New Roman" w:hAnsi="Times New Roman" w:cs="Times New Roman"/>
-          <w:b/>
-          <w:bCs/>
-          <w:sz w:val="24"/>
-          <w:szCs w:val="24"/>
-        </w:rPr>
-        <w:t xml:space="preserve">2.2. </w:t>
-      </w:r>
-      <w:r>
-        <w:rPr>
-          <w:rFonts w:ascii="Times New Roman" w:hAnsi="Times New Roman" w:cs="Times New Roman"/>
-          <w:b/>
-          <w:bCs/>
-          <w:sz w:val="24"/>
-          <w:szCs w:val="24"/>
-        </w:rPr>
-        <w:t>Recortes</w:t>
-      </w:r>
-      <w:r>
-        <w:rPr>
-          <w:rFonts w:ascii="Times New Roman" w:hAnsi="Times New Roman" w:cs="Times New Roman"/>
-          <w:b/>
-          <w:bCs/>
-          <w:sz w:val="24"/>
-          <w:szCs w:val="24"/>
-        </w:rPr>
-        <w:t xml:space="preserve"> geográficos </w:t>
+          <w:sz w:val="24"/>
+          <w:szCs w:val="24"/>
+        </w:rPr>
+      </w:pPr>
+      <w:r>
+        <w:rPr>
+          <w:rFonts w:ascii="Times New Roman" w:hAnsi="Times New Roman" w:cs="Times New Roman"/>
+          <w:sz w:val="24"/>
+          <w:szCs w:val="24"/>
+        </w:rPr>
+        <w:lastRenderedPageBreak/>
+        <w:t>O terceiro divide o estado em cinco estratos geográficos: Teresina</w:t>
+      </w:r>
+      <w:r>
+        <w:rPr>
+          <w:rFonts w:ascii="Times New Roman" w:hAnsi="Times New Roman" w:cs="Times New Roman"/>
+          <w:sz w:val="24"/>
+          <w:szCs w:val="24"/>
+        </w:rPr>
+        <w:t>;</w:t>
+      </w:r>
+      <w:r>
+        <w:rPr>
+          <w:rFonts w:ascii="Times New Roman" w:hAnsi="Times New Roman" w:cs="Times New Roman"/>
+          <w:sz w:val="24"/>
+          <w:szCs w:val="24"/>
+        </w:rPr>
+        <w:t xml:space="preserve"> Entorno Metropolitano de Teresina</w:t>
+      </w:r>
+      <w:r>
+        <w:rPr>
+          <w:rFonts w:ascii="Times New Roman" w:hAnsi="Times New Roman" w:cs="Times New Roman"/>
+          <w:sz w:val="24"/>
+          <w:szCs w:val="24"/>
+        </w:rPr>
+        <w:t xml:space="preserve">; Centro-Leste do Piauí; Baixo Parnaíba do Piauí; e Alto Parnaíba e Chapadas Sul do Piauí. Essa divisão segue a já utilizada pelo IBGE em seu </w:t>
+      </w:r>
+      <w:r>
+        <w:rPr>
+          <w:rFonts w:ascii="Times New Roman" w:hAnsi="Times New Roman" w:cs="Times New Roman"/>
+          <w:sz w:val="24"/>
+          <w:szCs w:val="24"/>
+        </w:rPr>
+        <w:t>Painel da PNADC (2026)</w:t>
+      </w:r>
+      <w:r>
+        <w:rPr>
+          <w:rFonts w:ascii="Times New Roman" w:hAnsi="Times New Roman" w:cs="Times New Roman"/>
+          <w:sz w:val="24"/>
+          <w:szCs w:val="24"/>
+        </w:rPr>
+        <w:t>. Replicá-lo em nossa pesquisa nos garante robustez e permite conferir os nossos resultados com os oficiais. A principal contribuição desse recorte é permitir a comparar os indicadores entre o sul. Centro-leste e norte do Piauí.</w:t>
       </w:r>
     </w:p>
     <w:p>
@@ -3765,493 +4584,80 @@
           <w:sz w:val="24"/>
           <w:szCs w:val="24"/>
         </w:rPr>
-        <w:t xml:space="preserve">Os recortes mais agregados que utilizaremos incluem o Brasil, o Nordeste e o Piauí. Esses três níveis já são utilizamos no relatório trimestral da PNADC e são aqui reutilizados pois põe em perspectiva o resultado de todos os recortes. Contra esses níveis vamos comparar </w:t>
-      </w:r>
-      <w:r>
-        <w:rPr>
-          <w:rFonts w:ascii="Times New Roman" w:hAnsi="Times New Roman" w:cs="Times New Roman"/>
-          <w:sz w:val="24"/>
-          <w:szCs w:val="24"/>
-        </w:rPr>
-        <w:t xml:space="preserve">principalmente </w:t>
-      </w:r>
-      <w:r>
-        <w:rPr>
-          <w:rFonts w:ascii="Times New Roman" w:hAnsi="Times New Roman" w:cs="Times New Roman"/>
-          <w:sz w:val="24"/>
-          <w:szCs w:val="24"/>
-        </w:rPr>
-        <w:t xml:space="preserve">o desempenho de Teresina, de forma análoga </w:t>
-      </w:r>
-      <w:r>
-        <w:rPr>
-          <w:rFonts w:ascii="Times New Roman" w:hAnsi="Times New Roman" w:cs="Times New Roman"/>
-          <w:sz w:val="24"/>
-          <w:szCs w:val="24"/>
-        </w:rPr>
-        <w:t xml:space="preserve">ao já realizada na introdução. </w:t>
+        <w:t>O quarto e último recorte</w:t>
+      </w:r>
+      <w:r>
+        <w:rPr>
+          <w:rFonts w:ascii="Times New Roman" w:hAnsi="Times New Roman" w:cs="Times New Roman"/>
+          <w:sz w:val="24"/>
+          <w:szCs w:val="24"/>
+        </w:rPr>
+        <w:t xml:space="preserve"> utiliza os estratos mais finos disponíveis dentro dos </w:t>
+      </w:r>
+      <w:proofErr w:type="spellStart"/>
+      <w:r>
+        <w:rPr>
+          <w:rFonts w:ascii="Times New Roman" w:hAnsi="Times New Roman" w:cs="Times New Roman"/>
+          <w:sz w:val="24"/>
+          <w:szCs w:val="24"/>
+        </w:rPr>
+        <w:t>microdados</w:t>
+      </w:r>
+      <w:proofErr w:type="spellEnd"/>
+      <w:r>
+        <w:rPr>
+          <w:rFonts w:ascii="Times New Roman" w:hAnsi="Times New Roman" w:cs="Times New Roman"/>
+          <w:sz w:val="24"/>
+          <w:szCs w:val="24"/>
+        </w:rPr>
+        <w:t xml:space="preserve"> da PNADC. Esses são os estratos criados conforme IBGE (2022), sendo cada um constituídos por municípios </w:t>
+      </w:r>
+      <w:r>
+        <w:rPr>
+          <w:rFonts w:ascii="Times New Roman" w:hAnsi="Times New Roman" w:cs="Times New Roman"/>
+          <w:sz w:val="24"/>
+          <w:szCs w:val="24"/>
+        </w:rPr>
+        <w:t>com alguma similaridade ou com alguma relação entre eles e para que as áreas definidas pelos estratos tenham algum significado geográfico</w:t>
+      </w:r>
+      <w:r>
+        <w:rPr>
+          <w:rFonts w:ascii="Times New Roman" w:hAnsi="Times New Roman" w:cs="Times New Roman"/>
+          <w:sz w:val="24"/>
+          <w:szCs w:val="24"/>
+        </w:rPr>
+        <w:t xml:space="preserve">. </w:t>
+      </w:r>
+      <w:r>
+        <w:rPr>
+          <w:rFonts w:ascii="Times New Roman" w:hAnsi="Times New Roman" w:cs="Times New Roman"/>
+          <w:sz w:val="24"/>
+          <w:szCs w:val="24"/>
+        </w:rPr>
+        <w:t xml:space="preserve">A figura abaixo, comparar o mapa dos </w:t>
+      </w:r>
+      <w:r>
+        <w:rPr>
+          <w:rFonts w:ascii="Times New Roman" w:hAnsi="Times New Roman" w:cs="Times New Roman"/>
+          <w:sz w:val="24"/>
+          <w:szCs w:val="24"/>
+        </w:rPr>
+        <w:t>quatro tipos de recortes geográficos</w:t>
       </w:r>
     </w:p>
     <w:p>
       <w:pPr>
-        <w:jc w:val="both"/>
-        <w:rPr>
-          <w:rFonts w:ascii="Times New Roman" w:hAnsi="Times New Roman" w:cs="Times New Roman"/>
-          <w:sz w:val="24"/>
-          <w:szCs w:val="24"/>
-        </w:rPr>
-      </w:pPr>
-      <w:r>
-        <w:rPr>
-          <w:rFonts w:ascii="Times New Roman" w:hAnsi="Times New Roman" w:cs="Times New Roman"/>
-          <w:sz w:val="24"/>
-          <w:szCs w:val="24"/>
-        </w:rPr>
-        <w:t>Dentro do Piauí, serão feitos</w:t>
-      </w:r>
-      <w:r>
-        <w:rPr>
-          <w:rFonts w:ascii="Times New Roman" w:hAnsi="Times New Roman" w:cs="Times New Roman"/>
-          <w:sz w:val="24"/>
-          <w:szCs w:val="24"/>
-        </w:rPr>
-        <w:t xml:space="preserve"> quatro</w:t>
-      </w:r>
-      <w:r>
-        <w:rPr>
-          <w:rFonts w:ascii="Times New Roman" w:hAnsi="Times New Roman" w:cs="Times New Roman"/>
-          <w:sz w:val="24"/>
-          <w:szCs w:val="24"/>
-        </w:rPr>
-        <w:t xml:space="preserve"> recortes geográficos.</w:t>
-      </w:r>
-      <w:r>
-        <w:rPr>
-          <w:rFonts w:ascii="Times New Roman" w:hAnsi="Times New Roman" w:cs="Times New Roman"/>
-          <w:sz w:val="24"/>
-          <w:szCs w:val="24"/>
-        </w:rPr>
-        <w:t xml:space="preserve"> </w:t>
-      </w:r>
-      <w:r>
-        <w:rPr>
-          <w:rFonts w:ascii="Times New Roman" w:hAnsi="Times New Roman" w:cs="Times New Roman"/>
-          <w:sz w:val="24"/>
-          <w:szCs w:val="24"/>
-        </w:rPr>
-        <w:t>No</w:t>
-      </w:r>
-      <w:r>
-        <w:rPr>
-          <w:rFonts w:ascii="Times New Roman" w:hAnsi="Times New Roman" w:cs="Times New Roman"/>
-          <w:sz w:val="24"/>
-          <w:szCs w:val="24"/>
-        </w:rPr>
-        <w:t xml:space="preserve"> primeiro, compararemos zona urbana e zona rural. Esse recorte não é nenhuma novidade em comparação as outras, mas serve ao propósito de elucidar mais ainda as diferenças </w:t>
-      </w:r>
-      <w:r>
-        <w:rPr>
-          <w:rFonts w:ascii="Times New Roman" w:hAnsi="Times New Roman" w:cs="Times New Roman"/>
-          <w:sz w:val="24"/>
-          <w:szCs w:val="24"/>
-        </w:rPr>
-        <w:t>econômicas entre os tipos de áreas.</w:t>
-      </w:r>
-    </w:p>
-    <w:p>
-      <w:pPr>
-        <w:jc w:val="both"/>
-        <w:rPr>
-          <w:rFonts w:ascii="Times New Roman" w:hAnsi="Times New Roman" w:cs="Times New Roman"/>
-          <w:sz w:val="24"/>
-          <w:szCs w:val="24"/>
-        </w:rPr>
-      </w:pPr>
-      <w:r>
-        <w:rPr>
-          <w:rFonts w:ascii="Times New Roman" w:hAnsi="Times New Roman" w:cs="Times New Roman"/>
-          <w:sz w:val="24"/>
-          <w:szCs w:val="24"/>
-        </w:rPr>
-        <w:t>O segundo recorte é feito conforme a área administrativa,</w:t>
-      </w:r>
-      <w:r>
-        <w:rPr>
-          <w:rFonts w:ascii="Times New Roman" w:hAnsi="Times New Roman" w:cs="Times New Roman"/>
-          <w:sz w:val="24"/>
-          <w:szCs w:val="24"/>
-        </w:rPr>
-        <w:t xml:space="preserve"> que </w:t>
-      </w:r>
-      <w:r>
-        <w:rPr>
-          <w:rFonts w:ascii="Times New Roman" w:hAnsi="Times New Roman" w:cs="Times New Roman"/>
-          <w:sz w:val="24"/>
-          <w:szCs w:val="24"/>
-        </w:rPr>
-        <w:t>quatro</w:t>
-      </w:r>
-      <w:r>
-        <w:rPr>
-          <w:rFonts w:ascii="Times New Roman" w:hAnsi="Times New Roman" w:cs="Times New Roman"/>
-          <w:sz w:val="24"/>
-          <w:szCs w:val="24"/>
-        </w:rPr>
-        <w:t xml:space="preserve"> estratos: </w:t>
-      </w:r>
-      <w:r>
-        <w:rPr>
-          <w:rFonts w:ascii="Times New Roman" w:hAnsi="Times New Roman" w:cs="Times New Roman"/>
-          <w:sz w:val="24"/>
-          <w:szCs w:val="24"/>
-        </w:rPr>
-        <w:t>a capital</w:t>
-      </w:r>
-      <w:r>
-        <w:rPr>
-          <w:rFonts w:ascii="Times New Roman" w:hAnsi="Times New Roman" w:cs="Times New Roman"/>
-          <w:sz w:val="24"/>
-          <w:szCs w:val="24"/>
-        </w:rPr>
-        <w:t xml:space="preserve">; </w:t>
-      </w:r>
-      <w:r>
-        <w:rPr>
-          <w:rFonts w:ascii="Times New Roman" w:hAnsi="Times New Roman" w:cs="Times New Roman"/>
-          <w:sz w:val="24"/>
-          <w:szCs w:val="24"/>
-        </w:rPr>
-        <w:t>o resto da</w:t>
-      </w:r>
-      <w:r>
-        <w:rPr>
-          <w:rFonts w:ascii="Times New Roman" w:hAnsi="Times New Roman" w:cs="Times New Roman"/>
-          <w:sz w:val="24"/>
-          <w:szCs w:val="24"/>
-        </w:rPr>
-        <w:t xml:space="preserve"> Região Metropolitana (RM)</w:t>
-      </w:r>
-      <w:r>
-        <w:rPr>
-          <w:rFonts w:ascii="Times New Roman" w:hAnsi="Times New Roman" w:cs="Times New Roman"/>
-          <w:sz w:val="24"/>
-          <w:szCs w:val="24"/>
-        </w:rPr>
-        <w:t>, excluindo a capital;</w:t>
-      </w:r>
-      <w:r>
-        <w:rPr>
-          <w:rFonts w:ascii="Times New Roman" w:hAnsi="Times New Roman" w:cs="Times New Roman"/>
-          <w:sz w:val="24"/>
-          <w:szCs w:val="24"/>
-        </w:rPr>
-        <w:t xml:space="preserve"> </w:t>
-      </w:r>
-      <w:r>
-        <w:rPr>
-          <w:rFonts w:ascii="Times New Roman" w:hAnsi="Times New Roman" w:cs="Times New Roman"/>
-          <w:sz w:val="24"/>
-          <w:szCs w:val="24"/>
-        </w:rPr>
-        <w:t xml:space="preserve">o resto da </w:t>
-      </w:r>
-      <w:r>
-        <w:rPr>
-          <w:rFonts w:ascii="Times New Roman" w:hAnsi="Times New Roman" w:cs="Times New Roman"/>
-          <w:sz w:val="24"/>
-          <w:szCs w:val="24"/>
-        </w:rPr>
-        <w:t>Região Integrada de Desenvolvimento Econômico (RIDE)</w:t>
-      </w:r>
-      <w:r>
-        <w:rPr>
-          <w:rFonts w:ascii="Times New Roman" w:hAnsi="Times New Roman" w:cs="Times New Roman"/>
-          <w:sz w:val="24"/>
-          <w:szCs w:val="24"/>
-        </w:rPr>
-        <w:t xml:space="preserve">, excluindo a </w:t>
-      </w:r>
-      <w:r>
-        <w:rPr>
-          <w:rFonts w:ascii="Times New Roman" w:hAnsi="Times New Roman" w:cs="Times New Roman"/>
-          <w:sz w:val="24"/>
-          <w:szCs w:val="24"/>
-        </w:rPr>
-        <w:t>Capital</w:t>
-      </w:r>
-      <w:r>
-        <w:rPr>
-          <w:rFonts w:ascii="Times New Roman" w:hAnsi="Times New Roman" w:cs="Times New Roman"/>
-          <w:sz w:val="24"/>
-          <w:szCs w:val="24"/>
-        </w:rPr>
-        <w:t>, e</w:t>
-      </w:r>
-      <w:r>
-        <w:rPr>
-          <w:rFonts w:ascii="Times New Roman" w:hAnsi="Times New Roman" w:cs="Times New Roman"/>
-          <w:sz w:val="24"/>
-          <w:szCs w:val="24"/>
-        </w:rPr>
-        <w:t>;</w:t>
-      </w:r>
-      <w:r>
-        <w:rPr>
-          <w:rFonts w:ascii="Times New Roman" w:hAnsi="Times New Roman" w:cs="Times New Roman"/>
-          <w:sz w:val="24"/>
-          <w:szCs w:val="24"/>
-        </w:rPr>
-        <w:t xml:space="preserve"> </w:t>
-      </w:r>
-      <w:r>
-        <w:rPr>
-          <w:rFonts w:ascii="Times New Roman" w:hAnsi="Times New Roman" w:cs="Times New Roman"/>
-          <w:sz w:val="24"/>
-          <w:szCs w:val="24"/>
-        </w:rPr>
-        <w:t xml:space="preserve">o resto da UF, excluindo a região metropolitana e a </w:t>
-      </w:r>
-      <w:r>
-        <w:rPr>
-          <w:rFonts w:ascii="Times New Roman" w:hAnsi="Times New Roman" w:cs="Times New Roman"/>
-          <w:sz w:val="24"/>
-          <w:szCs w:val="24"/>
-        </w:rPr>
-        <w:t>RIDE</w:t>
-      </w:r>
-      <w:r>
-        <w:rPr>
-          <w:rFonts w:ascii="Times New Roman" w:hAnsi="Times New Roman" w:cs="Times New Roman"/>
-          <w:sz w:val="24"/>
-          <w:szCs w:val="24"/>
-        </w:rPr>
-        <w:t>.</w:t>
-      </w:r>
-      <w:r>
-        <w:rPr>
-          <w:rFonts w:ascii="Times New Roman" w:hAnsi="Times New Roman" w:cs="Times New Roman"/>
-          <w:sz w:val="24"/>
-          <w:szCs w:val="24"/>
-        </w:rPr>
-        <w:t xml:space="preserve"> Esse estrato já vem definido dentro dos micr</w:t>
-      </w:r>
-      <w:r>
-        <w:rPr>
-          <w:rFonts w:ascii="Times New Roman" w:hAnsi="Times New Roman" w:cs="Times New Roman"/>
-          <w:sz w:val="24"/>
-          <w:szCs w:val="24"/>
-        </w:rPr>
-        <w:t>o</w:t>
-      </w:r>
-      <w:r>
-        <w:rPr>
-          <w:rFonts w:ascii="Times New Roman" w:hAnsi="Times New Roman" w:cs="Times New Roman"/>
-          <w:sz w:val="24"/>
-          <w:szCs w:val="24"/>
-        </w:rPr>
-        <w:t xml:space="preserve">dados, e gradualmente exclui a capital em seu </w:t>
-      </w:r>
-      <w:r>
-        <w:rPr>
-          <w:rFonts w:ascii="Times New Roman" w:hAnsi="Times New Roman" w:cs="Times New Roman"/>
-          <w:sz w:val="24"/>
-          <w:szCs w:val="24"/>
-        </w:rPr>
-        <w:t>entrono a medida que avança no estrato</w:t>
-      </w:r>
-      <w:r>
-        <w:rPr>
-          <w:rFonts w:ascii="Times New Roman" w:hAnsi="Times New Roman" w:cs="Times New Roman"/>
-          <w:sz w:val="24"/>
-          <w:szCs w:val="24"/>
-        </w:rPr>
-        <w:t>, o que nos permite analisar como a proximidade a capital impacta nos indicadores.</w:t>
-      </w:r>
-    </w:p>
-    <w:p>
-      <w:pPr>
-        <w:jc w:val="both"/>
-        <w:rPr>
-          <w:rFonts w:ascii="Times New Roman" w:hAnsi="Times New Roman" w:cs="Times New Roman"/>
-          <w:sz w:val="24"/>
-          <w:szCs w:val="24"/>
-        </w:rPr>
-      </w:pPr>
-      <w:r>
-        <w:rPr>
-          <w:rFonts w:ascii="Times New Roman" w:hAnsi="Times New Roman" w:cs="Times New Roman"/>
-          <w:sz w:val="24"/>
-          <w:szCs w:val="24"/>
-        </w:rPr>
-        <w:t>O terceiro divide o estado em cinco estratos geográficos: Teresina</w:t>
-      </w:r>
-      <w:r>
-        <w:rPr>
-          <w:rFonts w:ascii="Times New Roman" w:hAnsi="Times New Roman" w:cs="Times New Roman"/>
-          <w:sz w:val="24"/>
-          <w:szCs w:val="24"/>
-        </w:rPr>
-        <w:t>;</w:t>
-      </w:r>
-      <w:r>
-        <w:rPr>
-          <w:rFonts w:ascii="Times New Roman" w:hAnsi="Times New Roman" w:cs="Times New Roman"/>
-          <w:sz w:val="24"/>
-          <w:szCs w:val="24"/>
-        </w:rPr>
-        <w:t xml:space="preserve"> Entorno Metropolitano de Teresina</w:t>
-      </w:r>
-      <w:r>
-        <w:rPr>
-          <w:rFonts w:ascii="Times New Roman" w:hAnsi="Times New Roman" w:cs="Times New Roman"/>
-          <w:sz w:val="24"/>
-          <w:szCs w:val="24"/>
-        </w:rPr>
-        <w:t xml:space="preserve">; Centro-Leste do Piauí; Baixo Parnaíba do Piauí; e Alto </w:t>
-      </w:r>
-      <w:r>
-        <w:rPr>
-          <w:rFonts w:ascii="Times New Roman" w:hAnsi="Times New Roman" w:cs="Times New Roman"/>
-          <w:sz w:val="24"/>
-          <w:szCs w:val="24"/>
-        </w:rPr>
-        <w:lastRenderedPageBreak/>
-        <w:t xml:space="preserve">Parnaíba e Chapadas Sul do Piauí. Essa divisão segue a já utilizada pelo IBGE em seu </w:t>
-      </w:r>
-      <w:r>
-        <w:rPr>
-          <w:rFonts w:ascii="Times New Roman" w:hAnsi="Times New Roman" w:cs="Times New Roman"/>
-          <w:sz w:val="24"/>
-          <w:szCs w:val="24"/>
-        </w:rPr>
-        <w:t>Painel da PNADC (2026)</w:t>
-      </w:r>
-      <w:r>
-        <w:rPr>
-          <w:rFonts w:ascii="Times New Roman" w:hAnsi="Times New Roman" w:cs="Times New Roman"/>
-          <w:sz w:val="24"/>
-          <w:szCs w:val="24"/>
-        </w:rPr>
-        <w:t>. Replicá-lo em nossa pesquisa nos garante robustez e permite conferir os nossos resultados com os oficiais. A principal contribuição desse recorte é permitir a comparar os indicadores entre o sul. Centro-leste e norte do Piauí.</w:t>
-      </w:r>
-    </w:p>
-    <w:p>
-      <w:pPr>
-        <w:jc w:val="both"/>
-        <w:rPr>
-          <w:rFonts w:ascii="Times New Roman" w:hAnsi="Times New Roman" w:cs="Times New Roman"/>
-          <w:sz w:val="24"/>
-          <w:szCs w:val="24"/>
-        </w:rPr>
-      </w:pPr>
-      <w:r>
-        <w:rPr>
-          <w:rFonts w:ascii="Times New Roman" w:hAnsi="Times New Roman" w:cs="Times New Roman"/>
-          <w:sz w:val="24"/>
-          <w:szCs w:val="24"/>
-        </w:rPr>
-        <w:t>O quarto e último recorte</w:t>
-      </w:r>
-      <w:r>
-        <w:rPr>
-          <w:rFonts w:ascii="Times New Roman" w:hAnsi="Times New Roman" w:cs="Times New Roman"/>
-          <w:sz w:val="24"/>
-          <w:szCs w:val="24"/>
-        </w:rPr>
-        <w:t xml:space="preserve"> utiliza os estratos mais finos disponíveis dentro dos microdados da PNADC. Esses são os estratos criados conforme IBGE (2022), sendo cada um constituídos por municípios </w:t>
-      </w:r>
-      <w:r>
-        <w:rPr>
-          <w:rFonts w:ascii="Times New Roman" w:hAnsi="Times New Roman" w:cs="Times New Roman"/>
-          <w:sz w:val="24"/>
-          <w:szCs w:val="24"/>
-        </w:rPr>
-        <w:t>com alguma similaridade ou com alguma relação entre eles e para que as áreas definidas pelos estratos tenham algum significado geográfico</w:t>
-      </w:r>
-      <w:r>
-        <w:rPr>
-          <w:rFonts w:ascii="Times New Roman" w:hAnsi="Times New Roman" w:cs="Times New Roman"/>
-          <w:sz w:val="24"/>
-          <w:szCs w:val="24"/>
-        </w:rPr>
-        <w:t xml:space="preserve">. </w:t>
-      </w:r>
-      <w:r>
-        <w:rPr>
-          <w:rFonts w:ascii="Times New Roman" w:hAnsi="Times New Roman" w:cs="Times New Roman"/>
-          <w:color w:val="FF0000"/>
-          <w:sz w:val="24"/>
-          <w:szCs w:val="24"/>
-        </w:rPr>
-        <w:t>(TALVEZ COMEÇAR DESSE – MAIS DESAGREGADO PRO MAIS DESAGREGADO</w:t>
-      </w:r>
-      <w:r>
-        <w:rPr>
-          <w:rFonts w:ascii="Times New Roman" w:hAnsi="Times New Roman" w:cs="Times New Roman"/>
-          <w:color w:val="FF0000"/>
-          <w:sz w:val="24"/>
-          <w:szCs w:val="24"/>
-        </w:rPr>
-        <w:t>?</w:t>
-      </w:r>
-      <w:r>
-        <w:rPr>
-          <w:rFonts w:ascii="Times New Roman" w:hAnsi="Times New Roman" w:cs="Times New Roman"/>
-          <w:color w:val="FF0000"/>
-          <w:sz w:val="24"/>
-          <w:szCs w:val="24"/>
-        </w:rPr>
-        <w:t>)</w:t>
-      </w:r>
-    </w:p>
-    <w:p>
-      <w:pPr>
-        <w:jc w:val="both"/>
-        <w:rPr>
-          <w:rFonts w:ascii="Times New Roman" w:hAnsi="Times New Roman" w:cs="Times New Roman"/>
-          <w:color w:val="FF0000"/>
-          <w:sz w:val="24"/>
-          <w:szCs w:val="24"/>
-        </w:rPr>
-      </w:pPr>
-      <w:r>
-        <w:rPr>
-          <w:rFonts w:ascii="Times New Roman" w:hAnsi="Times New Roman" w:cs="Times New Roman"/>
-          <w:color w:val="FF0000"/>
-          <w:sz w:val="24"/>
-          <w:szCs w:val="24"/>
-        </w:rPr>
-        <w:t xml:space="preserve">A figura abaixo, comparar o mapa dos </w:t>
-      </w:r>
-      <w:r>
-        <w:rPr>
-          <w:rFonts w:ascii="Times New Roman" w:hAnsi="Times New Roman" w:cs="Times New Roman"/>
-          <w:color w:val="FF0000"/>
-          <w:sz w:val="24"/>
-          <w:szCs w:val="24"/>
-        </w:rPr>
-        <w:t>quatro tipos de recortes geográficos</w:t>
-      </w:r>
-    </w:p>
-    <w:p>
-      <w:pPr>
-        <w:jc w:val="both"/>
-        <w:rPr>
-          <w:rFonts w:ascii="Times New Roman" w:hAnsi="Times New Roman" w:cs="Times New Roman"/>
-          <w:color w:val="FF0000"/>
-          <w:sz w:val="24"/>
-          <w:szCs w:val="24"/>
-        </w:rPr>
+        <w:pStyle w:val="NormalWeb"/>
       </w:pPr>
       <w:r>
         <w:rPr>
           <w:noProof/>
         </w:rPr>
         <w:drawing>
-          <wp:inline distT="0" distB="0" distL="0" distR="0" wp14:anchorId="772BAAB1" wp14:editId="6762FCBC">
-            <wp:extent cx="5400040" cy="4949825"/>
-            <wp:effectExtent l="0" t="0" r="0" b="3175"/>
-            <wp:docPr id="1" name="Imagem 1"/>
+          <wp:inline distT="0" distB="0" distL="0" distR="0" wp14:anchorId="0C976E2C" wp14:editId="2B92D444">
+            <wp:extent cx="5400040" cy="4050030"/>
+            <wp:effectExtent l="0" t="0" r="0" b="7620"/>
+            <wp:docPr id="2" name="Imagem 2"/>
             <wp:cNvGraphicFramePr>
               <a:graphicFrameLocks xmlns:a="http://schemas.openxmlformats.org/drawingml/2006/main" noChangeAspect="1"/>
             </wp:cNvGraphicFramePr>
@@ -4280,7 +4686,7 @@
                   <pic:spPr bwMode="auto">
                     <a:xfrm>
                       <a:off x="0" y="0"/>
-                      <a:ext cx="5400040" cy="4949825"/>
+                      <a:ext cx="5400040" cy="4050030"/>
                     </a:xfrm>
                     <a:prstGeom prst="rect">
                       <a:avLst/>
@@ -4302,6 +4708,17 @@
         <w:jc w:val="both"/>
         <w:rPr>
           <w:rFonts w:ascii="Times New Roman" w:hAnsi="Times New Roman" w:cs="Times New Roman"/>
+          <w:color w:val="FF0000"/>
+          <w:sz w:val="24"/>
+          <w:szCs w:val="24"/>
+        </w:rPr>
+      </w:pPr>
+    </w:p>
+    <w:p>
+      <w:pPr>
+        <w:jc w:val="both"/>
+        <w:rPr>
+          <w:rFonts w:ascii="Times New Roman" w:hAnsi="Times New Roman" w:cs="Times New Roman"/>
           <w:b/>
           <w:bCs/>
           <w:sz w:val="24"/>
@@ -4384,16 +4801,7 @@
           <w:sz w:val="24"/>
           <w:szCs w:val="24"/>
         </w:rPr>
-        <w:t xml:space="preserve">até fundamental completo, e acima de fundamental completo. O leitor deve observar que os dois últimos recortes são bem mais agregados do </w:t>
-      </w:r>
-      <w:r>
-        <w:rPr>
-          <w:rFonts w:ascii="Times New Roman" w:hAnsi="Times New Roman" w:cs="Times New Roman"/>
-          <w:sz w:val="24"/>
-          <w:szCs w:val="24"/>
-        </w:rPr>
-        <w:lastRenderedPageBreak/>
-        <w:t>que o normalmente se analise pela PNADC. A justificativa dessa agregação está na próxima subseção.</w:t>
+        <w:t>até fundamental completo, e acima de fundamental completo. O leitor deve observar que os dois últimos recortes são bem mais agregados do que o normalmente se analise pela PNADC. A justificativa dessa agregação está na próxima subseção.</w:t>
       </w:r>
     </w:p>
     <w:p>
@@ -4416,6 +4824,7 @@
           <w:sz w:val="24"/>
           <w:szCs w:val="24"/>
         </w:rPr>
+        <w:lastRenderedPageBreak/>
         <w:t>2.</w:t>
       </w:r>
       <w:r>
@@ -4607,24 +5016,6 @@
         <w:jc w:val="both"/>
         <w:rPr>
           <w:rFonts w:ascii="Times New Roman" w:hAnsi="Times New Roman" w:cs="Times New Roman"/>
-          <w:sz w:val="24"/>
-          <w:szCs w:val="24"/>
-        </w:rPr>
-      </w:pPr>
-      <w:r>
-        <w:rPr>
-          <w:rFonts w:ascii="Times New Roman" w:hAnsi="Times New Roman" w:cs="Times New Roman"/>
-          <w:sz w:val="24"/>
-          <w:szCs w:val="24"/>
-        </w:rPr>
-        <w:t>Para verificar a precisão das estimativas, computa-se seu coeficiente de variação (CV). O CV é uma media de dispersão que mede a homogeneidade dos dados em relação a média. Ele é definido como a razão percentual entre o desvio padrão s  e a média amostral x:</w:t>
-      </w:r>
-    </w:p>
-    <w:p>
-      <w:pPr>
-        <w:jc w:val="both"/>
-        <w:rPr>
-          <w:rFonts w:ascii="Times New Roman" w:hAnsi="Times New Roman" w:cs="Times New Roman"/>
           <w:color w:val="FF0000"/>
           <w:sz w:val="24"/>
           <w:szCs w:val="24"/>
@@ -4633,29 +5024,99 @@
       <w:r>
         <w:rPr>
           <w:rFonts w:ascii="Times New Roman" w:hAnsi="Times New Roman" w:cs="Times New Roman"/>
+          <w:sz w:val="24"/>
+          <w:szCs w:val="24"/>
+        </w:rPr>
+        <w:t>Para verificar a precisão das estimativas, computa-se seu coeficiente de variação (CV). O CV é uma medi</w:t>
+      </w:r>
+      <w:r>
+        <w:rPr>
+          <w:rFonts w:ascii="Times New Roman" w:hAnsi="Times New Roman" w:cs="Times New Roman"/>
+          <w:sz w:val="24"/>
+          <w:szCs w:val="24"/>
+        </w:rPr>
+        <w:t>d</w:t>
+      </w:r>
+      <w:r>
+        <w:rPr>
+          <w:rFonts w:ascii="Times New Roman" w:hAnsi="Times New Roman" w:cs="Times New Roman"/>
+          <w:sz w:val="24"/>
+          <w:szCs w:val="24"/>
+        </w:rPr>
+        <w:t xml:space="preserve">a de </w:t>
+      </w:r>
+      <w:r>
+        <w:rPr>
+          <w:rFonts w:ascii="Times New Roman" w:hAnsi="Times New Roman" w:cs="Times New Roman"/>
+          <w:sz w:val="24"/>
+          <w:szCs w:val="24"/>
+        </w:rPr>
+        <w:t>incerteza</w:t>
+      </w:r>
+      <w:r>
+        <w:rPr>
+          <w:rFonts w:ascii="Times New Roman" w:hAnsi="Times New Roman" w:cs="Times New Roman"/>
+          <w:sz w:val="24"/>
+          <w:szCs w:val="24"/>
+        </w:rPr>
+        <w:t xml:space="preserve"> que m</w:t>
+      </w:r>
+      <w:r>
+        <w:rPr>
+          <w:rFonts w:ascii="Times New Roman" w:hAnsi="Times New Roman" w:cs="Times New Roman"/>
+          <w:sz w:val="24"/>
+          <w:szCs w:val="24"/>
+        </w:rPr>
+        <w:t>ensura a sensibilidade do indicador em relação a amostra coletada</w:t>
+      </w:r>
+      <w:r>
+        <w:rPr>
+          <w:rFonts w:ascii="Times New Roman" w:hAnsi="Times New Roman" w:cs="Times New Roman"/>
+          <w:sz w:val="24"/>
+          <w:szCs w:val="24"/>
+        </w:rPr>
+        <w:t xml:space="preserve">. Ele é definido como a razão percentual entre </w:t>
+      </w:r>
+      <w:r>
+        <w:rPr>
+          <w:rFonts w:ascii="Times New Roman" w:hAnsi="Times New Roman" w:cs="Times New Roman"/>
+          <w:sz w:val="24"/>
+          <w:szCs w:val="24"/>
+        </w:rPr>
+        <w:t>seu erro padrão e o seu valor.</w:t>
+      </w:r>
+      <w:r>
+        <w:rPr>
+          <w:rFonts w:ascii="Times New Roman" w:hAnsi="Times New Roman" w:cs="Times New Roman"/>
           <w:color w:val="FF0000"/>
           <w:sz w:val="24"/>
           <w:szCs w:val="24"/>
         </w:rPr>
-        <w:t>CV = s/x * 100</w:t>
-      </w:r>
-    </w:p>
-    <w:p>
-      <w:pPr>
-        <w:jc w:val="both"/>
-        <w:rPr>
-          <w:rFonts w:ascii="Times New Roman" w:hAnsi="Times New Roman" w:cs="Times New Roman"/>
-          <w:sz w:val="24"/>
-          <w:szCs w:val="24"/>
-        </w:rPr>
-      </w:pPr>
-      <w:r>
-        <w:rPr>
-          <w:rFonts w:ascii="Times New Roman" w:hAnsi="Times New Roman" w:cs="Times New Roman"/>
-          <w:sz w:val="24"/>
-          <w:szCs w:val="24"/>
-        </w:rPr>
-        <w:t xml:space="preserve">Um CV elevado indica que o conjunto de dados é muito heterogêneo, o que indica que a amostra não tem tamanho o suficiente para fazer a estimação com um grau de precisão aceitável. </w:t>
+        <w:t xml:space="preserve"> </w:t>
+      </w:r>
+      <w:r>
+        <w:rPr>
+          <w:rFonts w:ascii="Times New Roman" w:hAnsi="Times New Roman" w:cs="Times New Roman"/>
+          <w:sz w:val="24"/>
+          <w:szCs w:val="24"/>
+        </w:rPr>
+        <w:t xml:space="preserve">Um CV </w:t>
+      </w:r>
+      <w:r>
+        <w:rPr>
+          <w:rFonts w:ascii="Times New Roman" w:hAnsi="Times New Roman" w:cs="Times New Roman"/>
+          <w:sz w:val="24"/>
+          <w:szCs w:val="24"/>
+        </w:rPr>
+        <w:t>elevado indica uma estimativa pouco confiável</w:t>
+      </w:r>
+      <w:r>
+        <w:rPr>
+          <w:rFonts w:ascii="Times New Roman" w:hAnsi="Times New Roman" w:cs="Times New Roman"/>
+          <w:sz w:val="24"/>
+          <w:szCs w:val="24"/>
+        </w:rPr>
+        <w:t xml:space="preserve">. </w:t>
       </w:r>
       <w:r>
         <w:rPr>
@@ -4702,7 +5163,25 @@
           <w:sz w:val="24"/>
           <w:szCs w:val="24"/>
         </w:rPr>
-        <w:t>Abaixo de 5% : Excelente;</w:t>
+        <w:t>Abaixo de 5</w:t>
+      </w:r>
+      <w:proofErr w:type="gramStart"/>
+      <w:r>
+        <w:rPr>
+          <w:rFonts w:ascii="Times New Roman" w:hAnsi="Times New Roman" w:cs="Times New Roman"/>
+          <w:sz w:val="24"/>
+          <w:szCs w:val="24"/>
+        </w:rPr>
+        <w:t>% :</w:t>
+      </w:r>
+      <w:proofErr w:type="gramEnd"/>
+      <w:r>
+        <w:rPr>
+          <w:rFonts w:ascii="Times New Roman" w:hAnsi="Times New Roman" w:cs="Times New Roman"/>
+          <w:sz w:val="24"/>
+          <w:szCs w:val="24"/>
+        </w:rPr>
+        <w:t xml:space="preserve"> Excelente;</w:t>
       </w:r>
     </w:p>
     <w:p>
@@ -4725,7 +5204,25 @@
           <w:sz w:val="24"/>
           <w:szCs w:val="24"/>
         </w:rPr>
-        <w:t>Maior ou igual a 5% e menor que 15% : Boa</w:t>
+        <w:t>Maior ou igual a 5% e menor que 15</w:t>
+      </w:r>
+      <w:proofErr w:type="gramStart"/>
+      <w:r>
+        <w:rPr>
+          <w:rFonts w:ascii="Times New Roman" w:hAnsi="Times New Roman" w:cs="Times New Roman"/>
+          <w:sz w:val="24"/>
+          <w:szCs w:val="24"/>
+        </w:rPr>
+        <w:t>% :</w:t>
+      </w:r>
+      <w:proofErr w:type="gramEnd"/>
+      <w:r>
+        <w:rPr>
+          <w:rFonts w:ascii="Times New Roman" w:hAnsi="Times New Roman" w:cs="Times New Roman"/>
+          <w:sz w:val="24"/>
+          <w:szCs w:val="24"/>
+        </w:rPr>
+        <w:t xml:space="preserve"> Boa</w:t>
       </w:r>
     </w:p>
     <w:p>
@@ -4797,7 +5294,25 @@
           <w:sz w:val="24"/>
           <w:szCs w:val="24"/>
         </w:rPr>
-        <w:t xml:space="preserve">Os resultados completos, para todos os níveis de recorte e seus respectivos CVs serão listados no anexo, ressalvando </w:t>
+        <w:t xml:space="preserve">Os resultados completos, para todos os níveis de recorte e seus respectivos </w:t>
+      </w:r>
+      <w:proofErr w:type="spellStart"/>
+      <w:r>
+        <w:rPr>
+          <w:rFonts w:ascii="Times New Roman" w:hAnsi="Times New Roman" w:cs="Times New Roman"/>
+          <w:sz w:val="24"/>
+          <w:szCs w:val="24"/>
+        </w:rPr>
+        <w:t>CVs</w:t>
+      </w:r>
+      <w:proofErr w:type="spellEnd"/>
+      <w:r>
+        <w:rPr>
+          <w:rFonts w:ascii="Times New Roman" w:hAnsi="Times New Roman" w:cs="Times New Roman"/>
+          <w:sz w:val="24"/>
+          <w:szCs w:val="24"/>
+        </w:rPr>
+        <w:t xml:space="preserve"> serão listados no anexo, ressalvando </w:t>
       </w:r>
       <w:r>
         <w:rPr>
@@ -4895,16 +5410,15 @@
           <w:sz w:val="24"/>
           <w:szCs w:val="24"/>
         </w:rPr>
-        <w:lastRenderedPageBreak/>
-        <w:t xml:space="preserve">Definido os indicadores robustos, comparamos seus resultados utilizando o </w:t>
-      </w:r>
-      <w:r>
-        <w:rPr>
-          <w:rFonts w:ascii="Times New Roman" w:hAnsi="Times New Roman" w:cs="Times New Roman"/>
-          <w:sz w:val="24"/>
-          <w:szCs w:val="24"/>
-        </w:rPr>
-        <w:t>para respostas</w:t>
+        <w:t>Definido os indicadores robustos, comparamos seus resultados utilizando</w:t>
+      </w:r>
+      <w:r>
+        <w:rPr>
+          <w:rFonts w:ascii="Times New Roman" w:hAnsi="Times New Roman" w:cs="Times New Roman"/>
+          <w:sz w:val="24"/>
+          <w:szCs w:val="24"/>
+        </w:rPr>
+        <w:t xml:space="preserve"> testes de hipóteses.</w:t>
       </w:r>
       <w:r>
         <w:rPr>
@@ -4920,7 +5434,15 @@
           <w:sz w:val="24"/>
           <w:szCs w:val="24"/>
         </w:rPr>
-        <w:t>categóricas, o qui-quadrado de Rao-Scott e, para respostas</w:t>
+        <w:t>P</w:t>
+      </w:r>
+      <w:r>
+        <w:rPr>
+          <w:rFonts w:ascii="Times New Roman" w:hAnsi="Times New Roman" w:cs="Times New Roman"/>
+          <w:sz w:val="24"/>
+          <w:szCs w:val="24"/>
+        </w:rPr>
+        <w:t>ara respostas</w:t>
       </w:r>
       <w:r>
         <w:rPr>
@@ -4936,11 +5458,59 @@
           <w:sz w:val="24"/>
           <w:szCs w:val="24"/>
         </w:rPr>
+        <w:t xml:space="preserve">categóricas, o </w:t>
+      </w:r>
+      <w:proofErr w:type="spellStart"/>
+      <w:r>
+        <w:rPr>
+          <w:rFonts w:ascii="Times New Roman" w:hAnsi="Times New Roman" w:cs="Times New Roman"/>
+          <w:sz w:val="24"/>
+          <w:szCs w:val="24"/>
+        </w:rPr>
+        <w:t>qui</w:t>
+      </w:r>
+      <w:proofErr w:type="spellEnd"/>
+      <w:r>
+        <w:rPr>
+          <w:rFonts w:ascii="Times New Roman" w:hAnsi="Times New Roman" w:cs="Times New Roman"/>
+          <w:sz w:val="24"/>
+          <w:szCs w:val="24"/>
+        </w:rPr>
+        <w:t>-quadrado de Rao-Scott e, para respostas</w:t>
+      </w:r>
+      <w:r>
+        <w:rPr>
+          <w:rFonts w:ascii="Times New Roman" w:hAnsi="Times New Roman" w:cs="Times New Roman"/>
+          <w:sz w:val="24"/>
+          <w:szCs w:val="24"/>
+        </w:rPr>
+        <w:t xml:space="preserve"> </w:t>
+      </w:r>
+      <w:r>
+        <w:rPr>
+          <w:rFonts w:ascii="Times New Roman" w:hAnsi="Times New Roman" w:cs="Times New Roman"/>
+          <w:sz w:val="24"/>
+          <w:szCs w:val="24"/>
+        </w:rPr>
         <w:t>numéricas e binárias, um teste de Wald sobre modelo linear generalizado</w:t>
+      </w:r>
+      <w:r>
+        <w:rPr>
+          <w:rFonts w:ascii="Times New Roman" w:hAnsi="Times New Roman" w:cs="Times New Roman"/>
+          <w:sz w:val="24"/>
+          <w:szCs w:val="24"/>
+        </w:rPr>
+        <w:t>. Os testes serão feitos em dois conjuntos:</w:t>
       </w:r>
     </w:p>
     <w:p>
       <w:pPr>
+        <w:pStyle w:val="PargrafodaLista"/>
+        <w:numPr>
+          <w:ilvl w:val="0"/>
+          <w:numId w:val="3"/>
+        </w:numPr>
+        <w:ind w:left="284" w:hanging="284"/>
         <w:jc w:val="both"/>
         <w:rPr>
           <w:rFonts w:ascii="Times New Roman" w:hAnsi="Times New Roman" w:cs="Times New Roman"/>
@@ -4948,6 +5518,265 @@
           <w:szCs w:val="24"/>
         </w:rPr>
       </w:pPr>
+      <w:r>
+        <w:rPr>
+          <w:rFonts w:ascii="Times New Roman" w:hAnsi="Times New Roman" w:cs="Times New Roman"/>
+          <w:sz w:val="24"/>
+          <w:szCs w:val="24"/>
+        </w:rPr>
+        <w:t>Testes demográficos. Dentro de cada recorte geográfico, verificam se o</w:t>
+      </w:r>
+      <w:r>
+        <w:rPr>
+          <w:rFonts w:ascii="Times New Roman" w:hAnsi="Times New Roman" w:cs="Times New Roman"/>
+          <w:sz w:val="24"/>
+          <w:szCs w:val="24"/>
+        </w:rPr>
+        <w:t xml:space="preserve"> </w:t>
+      </w:r>
+      <w:r>
+        <w:rPr>
+          <w:rFonts w:ascii="Times New Roman" w:hAnsi="Times New Roman" w:cs="Times New Roman"/>
+          <w:sz w:val="24"/>
+          <w:szCs w:val="24"/>
+        </w:rPr>
+        <w:t>indicador difere entre categorias de sexo, cor/raça, faixa etária e instrução.</w:t>
+      </w:r>
+      <w:r>
+        <w:rPr>
+          <w:rFonts w:ascii="Times New Roman" w:hAnsi="Times New Roman" w:cs="Times New Roman"/>
+          <w:sz w:val="24"/>
+          <w:szCs w:val="24"/>
+        </w:rPr>
+        <w:t xml:space="preserve"> </w:t>
+      </w:r>
+      <w:r>
+        <w:rPr>
+          <w:rFonts w:ascii="Times New Roman" w:hAnsi="Times New Roman" w:cs="Times New Roman"/>
+          <w:sz w:val="24"/>
+          <w:szCs w:val="24"/>
+        </w:rPr>
+        <w:t>Respondem à pergunta "há desigualdade social dentro deste território?".</w:t>
+      </w:r>
+    </w:p>
+    <w:p>
+      <w:pPr>
+        <w:pStyle w:val="PargrafodaLista"/>
+        <w:numPr>
+          <w:ilvl w:val="0"/>
+          <w:numId w:val="3"/>
+        </w:numPr>
+        <w:ind w:left="284" w:hanging="284"/>
+        <w:jc w:val="both"/>
+        <w:rPr>
+          <w:rFonts w:ascii="Times New Roman" w:hAnsi="Times New Roman" w:cs="Times New Roman"/>
+          <w:sz w:val="24"/>
+          <w:szCs w:val="24"/>
+        </w:rPr>
+      </w:pPr>
+      <w:r>
+        <w:rPr>
+          <w:rFonts w:ascii="Times New Roman" w:hAnsi="Times New Roman" w:cs="Times New Roman"/>
+          <w:sz w:val="24"/>
+          <w:szCs w:val="24"/>
+        </w:rPr>
+        <w:lastRenderedPageBreak/>
+        <w:t>Testes regionais. Verificam se o indicador difere entre as categorias de um</w:t>
+      </w:r>
+      <w:r>
+        <w:rPr>
+          <w:rFonts w:ascii="Times New Roman" w:hAnsi="Times New Roman" w:cs="Times New Roman"/>
+          <w:sz w:val="24"/>
+          <w:szCs w:val="24"/>
+        </w:rPr>
+        <w:t xml:space="preserve"> </w:t>
+      </w:r>
+      <w:r>
+        <w:rPr>
+          <w:rFonts w:ascii="Times New Roman" w:hAnsi="Times New Roman" w:cs="Times New Roman"/>
+          <w:sz w:val="24"/>
+          <w:szCs w:val="24"/>
+        </w:rPr>
+        <w:t>mesmo recorte territorial — urbano × rural, entre estratos administrativos,</w:t>
+      </w:r>
+      <w:r>
+        <w:rPr>
+          <w:rFonts w:ascii="Times New Roman" w:hAnsi="Times New Roman" w:cs="Times New Roman"/>
+          <w:sz w:val="24"/>
+          <w:szCs w:val="24"/>
+        </w:rPr>
+        <w:t xml:space="preserve"> </w:t>
+      </w:r>
+      <w:r>
+        <w:rPr>
+          <w:rFonts w:ascii="Times New Roman" w:hAnsi="Times New Roman" w:cs="Times New Roman"/>
+          <w:sz w:val="24"/>
+          <w:szCs w:val="24"/>
+        </w:rPr>
+        <w:t>entre estratos agregados, entre estratos finos. Respondem à pergunta "há</w:t>
+      </w:r>
+      <w:r>
+        <w:rPr>
+          <w:rFonts w:ascii="Times New Roman" w:hAnsi="Times New Roman" w:cs="Times New Roman"/>
+          <w:sz w:val="24"/>
+          <w:szCs w:val="24"/>
+        </w:rPr>
+        <w:t xml:space="preserve"> </w:t>
+      </w:r>
+      <w:r>
+        <w:rPr>
+          <w:rFonts w:ascii="Times New Roman" w:hAnsi="Times New Roman" w:cs="Times New Roman"/>
+          <w:sz w:val="24"/>
+          <w:szCs w:val="24"/>
+        </w:rPr>
+        <w:t>desigualdade territorial no estado?".</w:t>
+      </w:r>
+    </w:p>
+    <w:p>
+      <w:pPr>
+        <w:jc w:val="both"/>
+        <w:rPr>
+          <w:rFonts w:ascii="Times New Roman" w:hAnsi="Times New Roman" w:cs="Times New Roman"/>
+          <w:sz w:val="24"/>
+          <w:szCs w:val="24"/>
+        </w:rPr>
+      </w:pPr>
+      <w:r>
+        <w:rPr>
+          <w:rFonts w:ascii="Times New Roman" w:hAnsi="Times New Roman" w:cs="Times New Roman"/>
+          <w:sz w:val="24"/>
+          <w:szCs w:val="24"/>
+        </w:rPr>
+        <w:t>Como u</w:t>
+      </w:r>
+      <w:r>
+        <w:rPr>
+          <w:rFonts w:ascii="Times New Roman" w:hAnsi="Times New Roman" w:cs="Times New Roman"/>
+          <w:sz w:val="24"/>
+          <w:szCs w:val="24"/>
+        </w:rPr>
+        <w:t>m recorte com muitas</w:t>
+      </w:r>
+      <w:r>
+        <w:rPr>
+          <w:rFonts w:ascii="Times New Roman" w:hAnsi="Times New Roman" w:cs="Times New Roman"/>
+          <w:sz w:val="24"/>
+          <w:szCs w:val="24"/>
+        </w:rPr>
+        <w:t xml:space="preserve"> </w:t>
+      </w:r>
+      <w:r>
+        <w:rPr>
+          <w:rFonts w:ascii="Times New Roman" w:hAnsi="Times New Roman" w:cs="Times New Roman"/>
+          <w:sz w:val="24"/>
+          <w:szCs w:val="24"/>
+        </w:rPr>
+        <w:t>categorias — como o de 7 dígitos — tende a produzir p-valores baixos apenas</w:t>
+      </w:r>
+      <w:r>
+        <w:rPr>
+          <w:rFonts w:ascii="Times New Roman" w:hAnsi="Times New Roman" w:cs="Times New Roman"/>
+          <w:sz w:val="24"/>
+          <w:szCs w:val="24"/>
+        </w:rPr>
+        <w:t xml:space="preserve"> </w:t>
+      </w:r>
+      <w:r>
+        <w:rPr>
+          <w:rFonts w:ascii="Times New Roman" w:hAnsi="Times New Roman" w:cs="Times New Roman"/>
+          <w:sz w:val="24"/>
+          <w:szCs w:val="24"/>
+        </w:rPr>
+        <w:t>porque há mais oportunidades de encontrar alguma diferença</w:t>
+      </w:r>
+      <w:r>
+        <w:rPr>
+          <w:rFonts w:ascii="Times New Roman" w:hAnsi="Times New Roman" w:cs="Times New Roman"/>
+          <w:sz w:val="24"/>
+          <w:szCs w:val="24"/>
+        </w:rPr>
+        <w:t>, resultando em testes apontando diferenças significativas espúrias e sem validade prática</w:t>
+      </w:r>
+      <w:r>
+        <w:rPr>
+          <w:rFonts w:ascii="Times New Roman" w:hAnsi="Times New Roman" w:cs="Times New Roman"/>
+          <w:sz w:val="24"/>
+          <w:szCs w:val="24"/>
+        </w:rPr>
+        <w:t>. E o inverso também</w:t>
+      </w:r>
+      <w:r>
+        <w:rPr>
+          <w:rFonts w:ascii="Times New Roman" w:hAnsi="Times New Roman" w:cs="Times New Roman"/>
+          <w:sz w:val="24"/>
+          <w:szCs w:val="24"/>
+        </w:rPr>
+        <w:t xml:space="preserve"> </w:t>
+      </w:r>
+      <w:r>
+        <w:rPr>
+          <w:rFonts w:ascii="Times New Roman" w:hAnsi="Times New Roman" w:cs="Times New Roman"/>
+          <w:sz w:val="24"/>
+          <w:szCs w:val="24"/>
+        </w:rPr>
+        <w:t>vale: um recorte com poucas observações pode não atingir significância mesmo</w:t>
+      </w:r>
+      <w:r>
+        <w:rPr>
+          <w:rFonts w:ascii="Times New Roman" w:hAnsi="Times New Roman" w:cs="Times New Roman"/>
+          <w:sz w:val="24"/>
+          <w:szCs w:val="24"/>
+        </w:rPr>
+        <w:t xml:space="preserve"> </w:t>
+      </w:r>
+      <w:r>
+        <w:rPr>
+          <w:rFonts w:ascii="Times New Roman" w:hAnsi="Times New Roman" w:cs="Times New Roman"/>
+          <w:sz w:val="24"/>
+          <w:szCs w:val="24"/>
+        </w:rPr>
+        <w:t xml:space="preserve">diante de uma diferença real e grande, por falta de amostra. </w:t>
+      </w:r>
+      <w:r>
+        <w:rPr>
+          <w:rFonts w:ascii="Times New Roman" w:hAnsi="Times New Roman" w:cs="Times New Roman"/>
+          <w:sz w:val="24"/>
+          <w:szCs w:val="24"/>
+        </w:rPr>
+        <w:t>Por isso, o</w:t>
+      </w:r>
+      <w:r>
+        <w:rPr>
+          <w:rFonts w:ascii="Times New Roman" w:hAnsi="Times New Roman" w:cs="Times New Roman"/>
+          <w:sz w:val="24"/>
+          <w:szCs w:val="24"/>
+        </w:rPr>
+        <w:t xml:space="preserve">s testes são calibrados e </w:t>
+      </w:r>
+      <w:r>
+        <w:rPr>
+          <w:rFonts w:ascii="Times New Roman" w:hAnsi="Times New Roman" w:cs="Times New Roman"/>
+          <w:sz w:val="24"/>
+          <w:szCs w:val="24"/>
+        </w:rPr>
+        <w:t xml:space="preserve">depois seus </w:t>
+      </w:r>
+      <w:r>
+        <w:rPr>
+          <w:rFonts w:ascii="Times New Roman" w:hAnsi="Times New Roman" w:cs="Times New Roman"/>
+          <w:sz w:val="24"/>
+          <w:szCs w:val="24"/>
+        </w:rPr>
+        <w:t xml:space="preserve">p-valores corrigidos </w:t>
+      </w:r>
+      <w:r>
+        <w:rPr>
+          <w:rFonts w:ascii="Times New Roman" w:hAnsi="Times New Roman" w:cs="Times New Roman"/>
+          <w:sz w:val="24"/>
+          <w:szCs w:val="24"/>
+        </w:rPr>
+        <w:t>para diminuir o viés do p-valor de encontrar diferença.</w:t>
+      </w:r>
     </w:p>
     <w:p>
       <w:pPr>
@@ -5452,16 +6281,16 @@
     </w:lvl>
   </w:abstractNum>
   <w:abstractNum w:abstractNumId="1" w15:restartNumberingAfterBreak="0">
-    <w:nsid w:val="1D2F39F2"/>
+    <w:nsid w:val="099724BD"/>
     <w:multiLevelType w:val="hybridMultilevel"/>
-    <w:tmpl w:val="90FED8E8"/>
+    <w:tmpl w:val="42D4258E"/>
     <w:lvl w:ilvl="0" w:tplc="04160001">
       <w:start w:val="1"/>
       <w:numFmt w:val="bullet"/>
       <w:lvlText w:val=""/>
       <w:lvlJc w:val="left"/>
       <w:pPr>
-        <w:ind w:left="720" w:hanging="360"/>
+        <w:ind w:left="1495" w:hanging="360"/>
       </w:pPr>
       <w:rPr>
         <w:rFonts w:ascii="Symbol" w:hAnsi="Symbol" w:hint="default"/>
@@ -5473,7 +6302,7 @@
       <w:lvlText w:val="o"/>
       <w:lvlJc w:val="left"/>
       <w:pPr>
-        <w:ind w:left="1440" w:hanging="360"/>
+        <w:ind w:left="2215" w:hanging="360"/>
       </w:pPr>
       <w:rPr>
         <w:rFonts w:ascii="Courier New" w:hAnsi="Courier New" w:cs="Courier New" w:hint="default"/>
@@ -5485,7 +6314,7 @@
       <w:lvlText w:val=""/>
       <w:lvlJc w:val="left"/>
       <w:pPr>
-        <w:ind w:left="2160" w:hanging="360"/>
+        <w:ind w:left="2935" w:hanging="360"/>
       </w:pPr>
       <w:rPr>
         <w:rFonts w:ascii="Wingdings" w:hAnsi="Wingdings" w:hint="default"/>
@@ -5497,7 +6326,7 @@
       <w:lvlText w:val=""/>
       <w:lvlJc w:val="left"/>
       <w:pPr>
-        <w:ind w:left="2880" w:hanging="360"/>
+        <w:ind w:left="3655" w:hanging="360"/>
       </w:pPr>
       <w:rPr>
         <w:rFonts w:ascii="Symbol" w:hAnsi="Symbol" w:hint="default"/>
@@ -5509,7 +6338,7 @@
       <w:lvlText w:val="o"/>
       <w:lvlJc w:val="left"/>
       <w:pPr>
-        <w:ind w:left="3600" w:hanging="360"/>
+        <w:ind w:left="4375" w:hanging="360"/>
       </w:pPr>
       <w:rPr>
         <w:rFonts w:ascii="Courier New" w:hAnsi="Courier New" w:cs="Courier New" w:hint="default"/>
@@ -5521,7 +6350,7 @@
       <w:lvlText w:val=""/>
       <w:lvlJc w:val="left"/>
       <w:pPr>
-        <w:ind w:left="4320" w:hanging="360"/>
+        <w:ind w:left="5095" w:hanging="360"/>
       </w:pPr>
       <w:rPr>
         <w:rFonts w:ascii="Wingdings" w:hAnsi="Wingdings" w:hint="default"/>
@@ -5533,7 +6362,7 @@
       <w:lvlText w:val=""/>
       <w:lvlJc w:val="left"/>
       <w:pPr>
-        <w:ind w:left="5040" w:hanging="360"/>
+        <w:ind w:left="5815" w:hanging="360"/>
       </w:pPr>
       <w:rPr>
         <w:rFonts w:ascii="Symbol" w:hAnsi="Symbol" w:hint="default"/>
@@ -5545,7 +6374,7 @@
       <w:lvlText w:val="o"/>
       <w:lvlJc w:val="left"/>
       <w:pPr>
-        <w:ind w:left="5760" w:hanging="360"/>
+        <w:ind w:left="6535" w:hanging="360"/>
       </w:pPr>
       <w:rPr>
         <w:rFonts w:ascii="Courier New" w:hAnsi="Courier New" w:cs="Courier New" w:hint="default"/>
@@ -5557,17 +6386,338 @@
       <w:lvlText w:val=""/>
       <w:lvlJc w:val="left"/>
       <w:pPr>
-        <w:ind w:left="6480" w:hanging="360"/>
+        <w:ind w:left="7255" w:hanging="360"/>
       </w:pPr>
       <w:rPr>
         <w:rFonts w:ascii="Wingdings" w:hAnsi="Wingdings" w:hint="default"/>
       </w:rPr>
+    </w:lvl>
+  </w:abstractNum>
+  <w:abstractNum w:abstractNumId="2" w15:restartNumberingAfterBreak="0">
+    <w:nsid w:val="1D2F39F2"/>
+    <w:multiLevelType w:val="hybridMultilevel"/>
+    <w:tmpl w:val="90FED8E8"/>
+    <w:lvl w:ilvl="0" w:tplc="04160001">
+      <w:start w:val="1"/>
+      <w:numFmt w:val="bullet"/>
+      <w:lvlText w:val=""/>
+      <w:lvlJc w:val="left"/>
+      <w:pPr>
+        <w:ind w:left="720" w:hanging="360"/>
+      </w:pPr>
+      <w:rPr>
+        <w:rFonts w:ascii="Symbol" w:hAnsi="Symbol" w:hint="default"/>
+      </w:rPr>
+    </w:lvl>
+    <w:lvl w:ilvl="1" w:tplc="04160003" w:tentative="1">
+      <w:start w:val="1"/>
+      <w:numFmt w:val="bullet"/>
+      <w:lvlText w:val="o"/>
+      <w:lvlJc w:val="left"/>
+      <w:pPr>
+        <w:ind w:left="1440" w:hanging="360"/>
+      </w:pPr>
+      <w:rPr>
+        <w:rFonts w:ascii="Courier New" w:hAnsi="Courier New" w:cs="Courier New" w:hint="default"/>
+      </w:rPr>
+    </w:lvl>
+    <w:lvl w:ilvl="2" w:tplc="04160005" w:tentative="1">
+      <w:start w:val="1"/>
+      <w:numFmt w:val="bullet"/>
+      <w:lvlText w:val=""/>
+      <w:lvlJc w:val="left"/>
+      <w:pPr>
+        <w:ind w:left="2160" w:hanging="360"/>
+      </w:pPr>
+      <w:rPr>
+        <w:rFonts w:ascii="Wingdings" w:hAnsi="Wingdings" w:hint="default"/>
+      </w:rPr>
+    </w:lvl>
+    <w:lvl w:ilvl="3" w:tplc="04160001" w:tentative="1">
+      <w:start w:val="1"/>
+      <w:numFmt w:val="bullet"/>
+      <w:lvlText w:val=""/>
+      <w:lvlJc w:val="left"/>
+      <w:pPr>
+        <w:ind w:left="2880" w:hanging="360"/>
+      </w:pPr>
+      <w:rPr>
+        <w:rFonts w:ascii="Symbol" w:hAnsi="Symbol" w:hint="default"/>
+      </w:rPr>
+    </w:lvl>
+    <w:lvl w:ilvl="4" w:tplc="04160003" w:tentative="1">
+      <w:start w:val="1"/>
+      <w:numFmt w:val="bullet"/>
+      <w:lvlText w:val="o"/>
+      <w:lvlJc w:val="left"/>
+      <w:pPr>
+        <w:ind w:left="3600" w:hanging="360"/>
+      </w:pPr>
+      <w:rPr>
+        <w:rFonts w:ascii="Courier New" w:hAnsi="Courier New" w:cs="Courier New" w:hint="default"/>
+      </w:rPr>
+    </w:lvl>
+    <w:lvl w:ilvl="5" w:tplc="04160005" w:tentative="1">
+      <w:start w:val="1"/>
+      <w:numFmt w:val="bullet"/>
+      <w:lvlText w:val=""/>
+      <w:lvlJc w:val="left"/>
+      <w:pPr>
+        <w:ind w:left="4320" w:hanging="360"/>
+      </w:pPr>
+      <w:rPr>
+        <w:rFonts w:ascii="Wingdings" w:hAnsi="Wingdings" w:hint="default"/>
+      </w:rPr>
+    </w:lvl>
+    <w:lvl w:ilvl="6" w:tplc="04160001" w:tentative="1">
+      <w:start w:val="1"/>
+      <w:numFmt w:val="bullet"/>
+      <w:lvlText w:val=""/>
+      <w:lvlJc w:val="left"/>
+      <w:pPr>
+        <w:ind w:left="5040" w:hanging="360"/>
+      </w:pPr>
+      <w:rPr>
+        <w:rFonts w:ascii="Symbol" w:hAnsi="Symbol" w:hint="default"/>
+      </w:rPr>
+    </w:lvl>
+    <w:lvl w:ilvl="7" w:tplc="04160003" w:tentative="1">
+      <w:start w:val="1"/>
+      <w:numFmt w:val="bullet"/>
+      <w:lvlText w:val="o"/>
+      <w:lvlJc w:val="left"/>
+      <w:pPr>
+        <w:ind w:left="5760" w:hanging="360"/>
+      </w:pPr>
+      <w:rPr>
+        <w:rFonts w:ascii="Courier New" w:hAnsi="Courier New" w:cs="Courier New" w:hint="default"/>
+      </w:rPr>
+    </w:lvl>
+    <w:lvl w:ilvl="8" w:tplc="04160005" w:tentative="1">
+      <w:start w:val="1"/>
+      <w:numFmt w:val="bullet"/>
+      <w:lvlText w:val=""/>
+      <w:lvlJc w:val="left"/>
+      <w:pPr>
+        <w:ind w:left="6480" w:hanging="360"/>
+      </w:pPr>
+      <w:rPr>
+        <w:rFonts w:ascii="Wingdings" w:hAnsi="Wingdings" w:hint="default"/>
+      </w:rPr>
+    </w:lvl>
+  </w:abstractNum>
+  <w:abstractNum w:abstractNumId="3" w15:restartNumberingAfterBreak="0">
+    <w:nsid w:val="279D759D"/>
+    <w:multiLevelType w:val="hybridMultilevel"/>
+    <w:tmpl w:val="A112BB4C"/>
+    <w:lvl w:ilvl="0" w:tplc="04160001">
+      <w:start w:val="1"/>
+      <w:numFmt w:val="bullet"/>
+      <w:lvlText w:val=""/>
+      <w:lvlJc w:val="left"/>
+      <w:pPr>
+        <w:ind w:left="720" w:hanging="360"/>
+      </w:pPr>
+      <w:rPr>
+        <w:rFonts w:ascii="Symbol" w:hAnsi="Symbol" w:hint="default"/>
+      </w:rPr>
+    </w:lvl>
+    <w:lvl w:ilvl="1" w:tplc="04160003" w:tentative="1">
+      <w:start w:val="1"/>
+      <w:numFmt w:val="bullet"/>
+      <w:lvlText w:val="o"/>
+      <w:lvlJc w:val="left"/>
+      <w:pPr>
+        <w:ind w:left="1440" w:hanging="360"/>
+      </w:pPr>
+      <w:rPr>
+        <w:rFonts w:ascii="Courier New" w:hAnsi="Courier New" w:cs="Courier New" w:hint="default"/>
+      </w:rPr>
+    </w:lvl>
+    <w:lvl w:ilvl="2" w:tplc="04160005" w:tentative="1">
+      <w:start w:val="1"/>
+      <w:numFmt w:val="bullet"/>
+      <w:lvlText w:val=""/>
+      <w:lvlJc w:val="left"/>
+      <w:pPr>
+        <w:ind w:left="2160" w:hanging="360"/>
+      </w:pPr>
+      <w:rPr>
+        <w:rFonts w:ascii="Wingdings" w:hAnsi="Wingdings" w:hint="default"/>
+      </w:rPr>
+    </w:lvl>
+    <w:lvl w:ilvl="3" w:tplc="04160001" w:tentative="1">
+      <w:start w:val="1"/>
+      <w:numFmt w:val="bullet"/>
+      <w:lvlText w:val=""/>
+      <w:lvlJc w:val="left"/>
+      <w:pPr>
+        <w:ind w:left="2880" w:hanging="360"/>
+      </w:pPr>
+      <w:rPr>
+        <w:rFonts w:ascii="Symbol" w:hAnsi="Symbol" w:hint="default"/>
+      </w:rPr>
+    </w:lvl>
+    <w:lvl w:ilvl="4" w:tplc="04160003" w:tentative="1">
+      <w:start w:val="1"/>
+      <w:numFmt w:val="bullet"/>
+      <w:lvlText w:val="o"/>
+      <w:lvlJc w:val="left"/>
+      <w:pPr>
+        <w:ind w:left="3600" w:hanging="360"/>
+      </w:pPr>
+      <w:rPr>
+        <w:rFonts w:ascii="Courier New" w:hAnsi="Courier New" w:cs="Courier New" w:hint="default"/>
+      </w:rPr>
+    </w:lvl>
+    <w:lvl w:ilvl="5" w:tplc="04160005" w:tentative="1">
+      <w:start w:val="1"/>
+      <w:numFmt w:val="bullet"/>
+      <w:lvlText w:val=""/>
+      <w:lvlJc w:val="left"/>
+      <w:pPr>
+        <w:ind w:left="4320" w:hanging="360"/>
+      </w:pPr>
+      <w:rPr>
+        <w:rFonts w:ascii="Wingdings" w:hAnsi="Wingdings" w:hint="default"/>
+      </w:rPr>
+    </w:lvl>
+    <w:lvl w:ilvl="6" w:tplc="04160001" w:tentative="1">
+      <w:start w:val="1"/>
+      <w:numFmt w:val="bullet"/>
+      <w:lvlText w:val=""/>
+      <w:lvlJc w:val="left"/>
+      <w:pPr>
+        <w:ind w:left="5040" w:hanging="360"/>
+      </w:pPr>
+      <w:rPr>
+        <w:rFonts w:ascii="Symbol" w:hAnsi="Symbol" w:hint="default"/>
+      </w:rPr>
+    </w:lvl>
+    <w:lvl w:ilvl="7" w:tplc="04160003" w:tentative="1">
+      <w:start w:val="1"/>
+      <w:numFmt w:val="bullet"/>
+      <w:lvlText w:val="o"/>
+      <w:lvlJc w:val="left"/>
+      <w:pPr>
+        <w:ind w:left="5760" w:hanging="360"/>
+      </w:pPr>
+      <w:rPr>
+        <w:rFonts w:ascii="Courier New" w:hAnsi="Courier New" w:cs="Courier New" w:hint="default"/>
+      </w:rPr>
+    </w:lvl>
+    <w:lvl w:ilvl="8" w:tplc="04160005" w:tentative="1">
+      <w:start w:val="1"/>
+      <w:numFmt w:val="bullet"/>
+      <w:lvlText w:val=""/>
+      <w:lvlJc w:val="left"/>
+      <w:pPr>
+        <w:ind w:left="6480" w:hanging="360"/>
+      </w:pPr>
+      <w:rPr>
+        <w:rFonts w:ascii="Wingdings" w:hAnsi="Wingdings" w:hint="default"/>
+      </w:rPr>
+    </w:lvl>
+  </w:abstractNum>
+  <w:abstractNum w:abstractNumId="4" w15:restartNumberingAfterBreak="0">
+    <w:nsid w:val="403A4220"/>
+    <w:multiLevelType w:val="hybridMultilevel"/>
+    <w:tmpl w:val="0A162B1A"/>
+    <w:lvl w:ilvl="0" w:tplc="0416000F">
+      <w:start w:val="1"/>
+      <w:numFmt w:val="decimal"/>
+      <w:lvlText w:val="%1."/>
+      <w:lvlJc w:val="left"/>
+      <w:pPr>
+        <w:ind w:left="720" w:hanging="360"/>
+      </w:pPr>
+    </w:lvl>
+    <w:lvl w:ilvl="1" w:tplc="04160019" w:tentative="1">
+      <w:start w:val="1"/>
+      <w:numFmt w:val="lowerLetter"/>
+      <w:lvlText w:val="%2."/>
+      <w:lvlJc w:val="left"/>
+      <w:pPr>
+        <w:ind w:left="1440" w:hanging="360"/>
+      </w:pPr>
+    </w:lvl>
+    <w:lvl w:ilvl="2" w:tplc="0416001B" w:tentative="1">
+      <w:start w:val="1"/>
+      <w:numFmt w:val="lowerRoman"/>
+      <w:lvlText w:val="%3."/>
+      <w:lvlJc w:val="right"/>
+      <w:pPr>
+        <w:ind w:left="2160" w:hanging="180"/>
+      </w:pPr>
+    </w:lvl>
+    <w:lvl w:ilvl="3" w:tplc="0416000F" w:tentative="1">
+      <w:start w:val="1"/>
+      <w:numFmt w:val="decimal"/>
+      <w:lvlText w:val="%4."/>
+      <w:lvlJc w:val="left"/>
+      <w:pPr>
+        <w:ind w:left="2880" w:hanging="360"/>
+      </w:pPr>
+    </w:lvl>
+    <w:lvl w:ilvl="4" w:tplc="04160019" w:tentative="1">
+      <w:start w:val="1"/>
+      <w:numFmt w:val="lowerLetter"/>
+      <w:lvlText w:val="%5."/>
+      <w:lvlJc w:val="left"/>
+      <w:pPr>
+        <w:ind w:left="3600" w:hanging="360"/>
+      </w:pPr>
+    </w:lvl>
+    <w:lvl w:ilvl="5" w:tplc="0416001B" w:tentative="1">
+      <w:start w:val="1"/>
+      <w:numFmt w:val="lowerRoman"/>
+      <w:lvlText w:val="%6."/>
+      <w:lvlJc w:val="right"/>
+      <w:pPr>
+        <w:ind w:left="4320" w:hanging="180"/>
+      </w:pPr>
+    </w:lvl>
+    <w:lvl w:ilvl="6" w:tplc="0416000F" w:tentative="1">
+      <w:start w:val="1"/>
+      <w:numFmt w:val="decimal"/>
+      <w:lvlText w:val="%7."/>
+      <w:lvlJc w:val="left"/>
+      <w:pPr>
+        <w:ind w:left="5040" w:hanging="360"/>
+      </w:pPr>
+    </w:lvl>
+    <w:lvl w:ilvl="7" w:tplc="04160019" w:tentative="1">
+      <w:start w:val="1"/>
+      <w:numFmt w:val="lowerLetter"/>
+      <w:lvlText w:val="%8."/>
+      <w:lvlJc w:val="left"/>
+      <w:pPr>
+        <w:ind w:left="5760" w:hanging="360"/>
+      </w:pPr>
+    </w:lvl>
+    <w:lvl w:ilvl="8" w:tplc="0416001B" w:tentative="1">
+      <w:start w:val="1"/>
+      <w:numFmt w:val="lowerRoman"/>
+      <w:lvlText w:val="%9."/>
+      <w:lvlJc w:val="right"/>
+      <w:pPr>
+        <w:ind w:left="6480" w:hanging="180"/>
+      </w:pPr>
     </w:lvl>
   </w:abstractNum>
   <w:num w:numId="1">
     <w:abstractNumId w:val="0"/>
   </w:num>
   <w:num w:numId="2">
+    <w:abstractNumId w:val="2"/>
+  </w:num>
+  <w:num w:numId="3">
+    <w:abstractNumId w:val="3"/>
+  </w:num>
+  <w:num w:numId="4">
+    <w:abstractNumId w:val="4"/>
+  </w:num>
+  <w:num w:numId="5">
     <w:abstractNumId w:val="1"/>
   </w:num>
 </w:numbering>
@@ -6068,6 +7218,23 @@
       <w:vertAlign w:val="superscript"/>
     </w:rPr>
   </w:style>
+  <w:style w:type="paragraph" w:styleId="NormalWeb">
+    <w:name w:val="Normal (Web)"/>
+    <w:basedOn w:val="Normal"/>
+    <w:uiPriority w:val="99"/>
+    <w:semiHidden/>
+    <w:unhideWhenUsed/>
+    <w:rsid w:val="00836E54"/>
+    <w:pPr>
+      <w:spacing w:before="100" w:beforeAutospacing="1" w:after="100" w:afterAutospacing="1" w:line="240" w:lineRule="auto"/>
+    </w:pPr>
+    <w:rPr>
+      <w:rFonts w:ascii="Times New Roman" w:eastAsia="Times New Roman" w:hAnsi="Times New Roman" w:cs="Times New Roman"/>
+      <w:sz w:val="24"/>
+      <w:szCs w:val="24"/>
+      <w:lang w:eastAsia="pt-BR"/>
+    </w:rPr>
+  </w:style>
 </w:styles>
 </file>
 

</xml_diff>